<commit_message>
Implement bibliography and citation handling with YAML support
</commit_message>
<xml_diff>
--- a/sample/output.docx
+++ b/sample/output.docx
@@ -11,270 +11,16 @@
       </w:r>
     </w:p>
     <w:p>
-      <w:pPr>
-        <w:pStyle w:val="TOC1"/>
-        <w:tabs>
-          <w:tab w:val="left" w:pos="480"/>
-          <w:tab w:val="right" w:leader="dot" w:pos="9350"/>
-        </w:tabs>
-        <w:rPr>
-          <w:rFonts w:asciiTheme="minorHAnsi" w:hAnsiTheme="minorHAnsi" w:eastAsiaTheme="minorEastAsia"/>
-          <w:noProof/>
-        </w:rPr>
-      </w:pPr>
-      <w:r>
-        <w:fldChar w:fldCharType="begin"/>
-      </w:r>
-      <w:r>
-        <w:instrText xml:space="preserve"> TOC \o "2-3" \h \z \t "Heading 1,1" </w:instrText>
-      </w:r>
-      <w:r>
-        <w:fldChar w:fldCharType="separate"/>
-      </w:r>
-      <w:hyperlink w:history="1" w:anchor="_Toc194614861">
+      <w:fldSimple w:instr=" TOC \o &quot;2-3&quot; \h \z \t &quot;Heading 1,1&quot; " w:dirty="true">
         <w:r>
           <w:rPr>
-            <w:rStyle w:val="Hyperlink"/>
+            <w:b/>
+            <w:bCs/>
             <w:noProof/>
           </w:rPr>
-          <w:t>1.</w:t>
+          <w:t>No table of contents entries found.</w:t>
         </w:r>
-        <w:r>
-          <w:rPr>
-            <w:rFonts w:asciiTheme="minorHAnsi" w:hAnsiTheme="minorHAnsi" w:eastAsiaTheme="minorEastAsia"/>
-            <w:noProof/>
-          </w:rPr>
-          <w:tab/>
-        </w:r>
-        <w:r>
-          <w:rPr>
-            <w:rStyle w:val="Hyperlink"/>
-            <w:noProof/>
-          </w:rPr>
-          <w:t>Foo</w:t>
-        </w:r>
-        <w:r>
-          <w:rPr>
-            <w:noProof/>
-            <w:webHidden/>
-          </w:rPr>
-          <w:tab/>
-        </w:r>
-        <w:r>
-          <w:rPr>
-            <w:noProof/>
-            <w:webHidden/>
-          </w:rPr>
-          <w:fldChar w:fldCharType="begin"/>
-        </w:r>
-        <w:r>
-          <w:rPr>
-            <w:noProof/>
-            <w:webHidden/>
-          </w:rPr>
-          <w:instrText xml:space="preserve"> PAGEREF _Toc194614861 \h </w:instrText>
-        </w:r>
-        <w:r>
-          <w:rPr>
-            <w:noProof/>
-            <w:webHidden/>
-          </w:rPr>
-        </w:r>
-        <w:r>
-          <w:rPr>
-            <w:noProof/>
-            <w:webHidden/>
-          </w:rPr>
-          <w:fldChar w:fldCharType="separate"/>
-        </w:r>
-        <w:r>
-          <w:rPr>
-            <w:noProof/>
-            <w:webHidden/>
-          </w:rPr>
-          <w:t>1</w:t>
-        </w:r>
-        <w:r>
-          <w:rPr>
-            <w:noProof/>
-            <w:webHidden/>
-          </w:rPr>
-          <w:fldChar w:fldCharType="end"/>
-        </w:r>
-      </w:hyperlink>
-    </w:p>
-    <w:p>
-      <w:pPr>
-        <w:pStyle w:val="TOC2"/>
-        <w:tabs>
-          <w:tab w:val="left" w:pos="960"/>
-          <w:tab w:val="right" w:leader="dot" w:pos="9350"/>
-        </w:tabs>
-        <w:rPr>
-          <w:rFonts w:asciiTheme="minorHAnsi" w:hAnsiTheme="minorHAnsi" w:eastAsiaTheme="minorEastAsia"/>
-          <w:noProof/>
-        </w:rPr>
-      </w:pPr>
-      <w:hyperlink w:history="1" w:anchor="_Toc194614862">
-        <w:r>
-          <w:rPr>
-            <w:rStyle w:val="Hyperlink"/>
-            <w:noProof/>
-          </w:rPr>
-          <w:t>1.1.</w:t>
-        </w:r>
-        <w:r>
-          <w:rPr>
-            <w:rFonts w:asciiTheme="minorHAnsi" w:hAnsiTheme="minorHAnsi" w:eastAsiaTheme="minorEastAsia"/>
-            <w:noProof/>
-          </w:rPr>
-          <w:tab/>
-        </w:r>
-        <w:r>
-          <w:rPr>
-            <w:rStyle w:val="Hyperlink"/>
-            <w:noProof/>
-          </w:rPr>
-          <w:t>Bar</w:t>
-        </w:r>
-        <w:r>
-          <w:rPr>
-            <w:noProof/>
-            <w:webHidden/>
-          </w:rPr>
-          <w:tab/>
-        </w:r>
-        <w:r>
-          <w:rPr>
-            <w:noProof/>
-            <w:webHidden/>
-          </w:rPr>
-          <w:fldChar w:fldCharType="begin"/>
-        </w:r>
-        <w:r>
-          <w:rPr>
-            <w:noProof/>
-            <w:webHidden/>
-          </w:rPr>
-          <w:instrText xml:space="preserve"> PAGEREF _Toc194614862 \h </w:instrText>
-        </w:r>
-        <w:r>
-          <w:rPr>
-            <w:noProof/>
-            <w:webHidden/>
-          </w:rPr>
-        </w:r>
-        <w:r>
-          <w:rPr>
-            <w:noProof/>
-            <w:webHidden/>
-          </w:rPr>
-          <w:fldChar w:fldCharType="separate"/>
-        </w:r>
-        <w:r>
-          <w:rPr>
-            <w:noProof/>
-            <w:webHidden/>
-          </w:rPr>
-          <w:t>1</w:t>
-        </w:r>
-        <w:r>
-          <w:rPr>
-            <w:noProof/>
-            <w:webHidden/>
-          </w:rPr>
-          <w:fldChar w:fldCharType="end"/>
-        </w:r>
-      </w:hyperlink>
-    </w:p>
-    <w:p>
-      <w:pPr>
-        <w:pStyle w:val="TOC3"/>
-        <w:tabs>
-          <w:tab w:val="left" w:pos="1440"/>
-          <w:tab w:val="right" w:leader="dot" w:pos="9350"/>
-        </w:tabs>
-        <w:rPr>
-          <w:rFonts w:asciiTheme="minorHAnsi" w:hAnsiTheme="minorHAnsi" w:eastAsiaTheme="minorEastAsia"/>
-          <w:noProof/>
-        </w:rPr>
-      </w:pPr>
-      <w:hyperlink w:history="1" w:anchor="_Toc194614863">
-        <w:r>
-          <w:rPr>
-            <w:rStyle w:val="Hyperlink"/>
-            <w:noProof/>
-          </w:rPr>
-          <w:t>1.1.1.</w:t>
-        </w:r>
-        <w:r>
-          <w:rPr>
-            <w:rFonts w:asciiTheme="minorHAnsi" w:hAnsiTheme="minorHAnsi" w:eastAsiaTheme="minorEastAsia"/>
-            <w:noProof/>
-          </w:rPr>
-          <w:tab/>
-        </w:r>
-        <w:r>
-          <w:rPr>
-            <w:rStyle w:val="Hyperlink"/>
-            <w:noProof/>
-          </w:rPr>
-          <w:t>Buzz</w:t>
-        </w:r>
-        <w:r>
-          <w:rPr>
-            <w:noProof/>
-            <w:webHidden/>
-          </w:rPr>
-          <w:tab/>
-        </w:r>
-        <w:r>
-          <w:rPr>
-            <w:noProof/>
-            <w:webHidden/>
-          </w:rPr>
-          <w:fldChar w:fldCharType="begin"/>
-        </w:r>
-        <w:r>
-          <w:rPr>
-            <w:noProof/>
-            <w:webHidden/>
-          </w:rPr>
-          <w:instrText xml:space="preserve"> PAGEREF _Toc194614863 \h </w:instrText>
-        </w:r>
-        <w:r>
-          <w:rPr>
-            <w:noProof/>
-            <w:webHidden/>
-          </w:rPr>
-        </w:r>
-        <w:r>
-          <w:rPr>
-            <w:noProof/>
-            <w:webHidden/>
-          </w:rPr>
-          <w:fldChar w:fldCharType="separate"/>
-        </w:r>
-        <w:r>
-          <w:rPr>
-            <w:noProof/>
-            <w:webHidden/>
-          </w:rPr>
-          <w:t>2</w:t>
-        </w:r>
-        <w:r>
-          <w:rPr>
-            <w:noProof/>
-            <w:webHidden/>
-          </w:rPr>
-          <w:fldChar w:fldCharType="end"/>
-        </w:r>
-      </w:hyperlink>
-    </w:p>
-    <w:p>
-      <w:r>
-        <w:fldChar w:fldCharType="end"/>
-      </w:r>
+      </w:fldSimple>
       <w:r>
         <w:br w:type="page"/>
       </w:r>
@@ -289,7 +35,7 @@
       </w:r>
     </w:p>
     <w:p>
-      <w:fldSimple w:instr=" TOC \h \z \c &quot;Figure&quot; ">
+      <w:fldSimple w:instr=" TOC \h \z \c &quot;Figure&quot; " w:dirty="true">
         <w:r>
           <w:rPr>
             <w:b/>
@@ -327,7 +73,7 @@
           <w:docGrid w:linePitch="360"/>
         </w:sectPr>
       </w:pPr>
-      <w:fldSimple w:instr=" TOC \h \z \c &quot;Table&quot; ">
+      <w:fldSimple w:instr=" TOC \h \z \c &quot;Table&quot; " w:dirty="true">
         <w:r>
           <w:rPr>
             <w:b/>
@@ -1115,7 +861,7 @@
           <wp:inline distT="0" distB="0" distL="0" distR="0">
             <wp:extent cx="2857500" cy="2857500"/>
             <wp:effectExtent l="0" t="0" r="0" b="0"/>
-            <wp:docPr id="672012483" name="Picture 672012483"/>
+            <wp:docPr id="1941850628" name="Picture 1941850628"/>
             <wp:cNvGraphicFramePr>
               <a:graphicFrameLocks xmlns:a="http://schemas.openxmlformats.org/drawingml/2006/main" noChangeAspect="1"/>
             </wp:cNvGraphicFramePr>
@@ -1123,11 +869,11 @@
               <a:graphicData uri="http://schemas.openxmlformats.org/drawingml/2006/picture">
                 <pic:pic xmlns:pic="http://schemas.openxmlformats.org/drawingml/2006/picture">
                   <pic:nvPicPr>
-                    <pic:cNvPr id="672012543" name="placeholder-500.png"/>
+                    <pic:cNvPr id="1941850654" name="placeholder-500.png"/>
                     <pic:cNvPicPr/>
                   </pic:nvPicPr>
                   <pic:blipFill>
-                    <a:blip r:embed="R545d0c13b7d34ee0"/>
+                    <a:blip r:embed="R34da34e8c8954f70"/>
                     <a:stretch>
                       <a:fillRect/>
                     </a:stretch>
@@ -1192,7 +938,7 @@
           <wp:inline distT="0" distB="0" distL="0" distR="0">
             <wp:extent cx="3810000" cy="2857500"/>
             <wp:effectExtent l="0" t="0" r="0" b="0"/>
-            <wp:docPr id="672555437" name="Picture 672555437"/>
+            <wp:docPr id="1942383342" name="Picture 1942383342"/>
             <wp:cNvGraphicFramePr>
               <a:graphicFrameLocks xmlns:a="http://schemas.openxmlformats.org/drawingml/2006/main" noChangeAspect="1"/>
             </wp:cNvGraphicFramePr>
@@ -1200,11 +946,11 @@
               <a:graphicData uri="http://schemas.openxmlformats.org/drawingml/2006/picture">
                 <pic:pic xmlns:pic="http://schemas.openxmlformats.org/drawingml/2006/picture">
                   <pic:nvPicPr>
-                    <pic:cNvPr id="672555443" name="placeholder-400-300.png"/>
+                    <pic:cNvPr id="1942383345" name="placeholder-400-300.png"/>
                     <pic:cNvPicPr/>
                   </pic:nvPicPr>
                   <pic:blipFill>
-                    <a:blip r:embed="R47670138dba7455a"/>
+                    <a:blip r:embed="R86e63d85e6e748f8"/>
                     <a:stretch>
                       <a:fillRect/>
                     </a:stretch>
@@ -1631,7 +1377,7 @@
           <wp:inline distT="0" distB="0" distL="0" distR="0">
             <wp:extent cx="3810000" cy="3810000"/>
             <wp:effectExtent l="0" t="0" r="0" b="0"/>
-            <wp:docPr id="672568629" name="Picture 672568629"/>
+            <wp:docPr id="1942397508" name="Picture 1942397508"/>
             <wp:cNvGraphicFramePr>
               <a:graphicFrameLocks xmlns:a="http://schemas.openxmlformats.org/drawingml/2006/main" noChangeAspect="1"/>
             </wp:cNvGraphicFramePr>
@@ -1639,11 +1385,11 @@
               <a:graphicData uri="http://schemas.openxmlformats.org/drawingml/2006/picture">
                 <pic:pic xmlns:pic="http://schemas.openxmlformats.org/drawingml/2006/picture">
                   <pic:nvPicPr>
-                    <pic:cNvPr id="672568633" name="placeholder-500.png"/>
+                    <pic:cNvPr id="1942397512" name="placeholder-500.png"/>
                     <pic:cNvPicPr/>
                   </pic:nvPicPr>
                   <pic:blipFill>
-                    <a:blip r:embed="Rcf58887ffa2d4f44"/>
+                    <a:blip r:embed="R7f75ffd7c9d74e5a"/>
                     <a:stretch>
                       <a:fillRect/>
                     </a:stretch>
@@ -2010,219 +1756,219 @@
       <w:pPr>
         <w:pStyle w:val="Heading1"/>
       </w:pPr>
-      <w:bookmarkStart w:name="_Toc194614861" w:id="0"/>
-      <w:r>
-        <w:lastRenderedPageBreak/>
-        <w:t>Foo</w:t>
-      </w:r>
-      <w:bookmarkEnd w:id="0"/>
-    </w:p>
-    <w:p>
-      <w:pPr>
-        <w:pStyle w:val="Body1"/>
-      </w:pPr>
-      <w:r>
-        <w:t>Lorem ipsum dolor sit amet, consectetur adipiscing elit. Nunc urna odio, lacinia sed tellus quis, mattis porttitor ligula. Sed at tristique ipsum, sit amet condimentum odio. Nunc faucibus fermentum libero quis maximus. Nunc ultrices odio risus, eu dignissim quam mollis sit amet. Aenean vitae volutpat neque. Praesent rhoncus condimentum nisi, in hendrerit arcu efficitur in. Etiam mollis erat sit amet orci volutpat, vitae elementum ligula rhoncus. Maecenas ut odio ut sem finibus mollis a quis est.</w:t>
-      </w:r>
-    </w:p>
-    <w:p>
-      <w:pPr>
-        <w:pStyle w:val="LP1"/>
-        <w:numPr>
-          <w:ilvl w:val="0"/>
-          <w:numId w:val="4"/>
-        </w:numPr>
-      </w:pPr>
-      <w:r>
-        <w:t>Foo</w:t>
-      </w:r>
-    </w:p>
-    <w:p>
-      <w:pPr>
-        <w:pStyle w:val="LP1"/>
-        <w:numPr>
-          <w:ilvl w:val="0"/>
-          <w:numId w:val="4"/>
-        </w:numPr>
-      </w:pPr>
-      <w:r>
-        <w:t>Bar</w:t>
-      </w:r>
-    </w:p>
-    <w:p>
-      <w:pPr>
-        <w:pStyle w:val="LP1"/>
-        <w:numPr>
-          <w:ilvl w:val="1"/>
-          <w:numId w:val="4"/>
-        </w:numPr>
-      </w:pPr>
-      <w:r>
-        <w:t>Boo</w:t>
-      </w:r>
-    </w:p>
-    <w:p>
-      <w:pPr>
-        <w:pStyle w:val="LP1"/>
-        <w:numPr>
-          <w:ilvl w:val="2"/>
-          <w:numId w:val="4"/>
-        </w:numPr>
-      </w:pPr>
-      <w:r>
-        <w:t>Foo</w:t>
-      </w:r>
-    </w:p>
-    <w:p>
-      <w:pPr>
-        <w:pStyle w:val="LP1"/>
-        <w:numPr>
-          <w:ilvl w:val="2"/>
-          <w:numId w:val="4"/>
-        </w:numPr>
-      </w:pPr>
-      <w:r>
-        <w:t>Bar</w:t>
-      </w:r>
-    </w:p>
-    <w:p>
-      <w:pPr>
-        <w:pStyle w:val="LP1"/>
-        <w:numPr>
-          <w:ilvl w:val="1"/>
-          <w:numId w:val="4"/>
-        </w:numPr>
-      </w:pPr>
-      <w:r>
-        <w:t>Soo</w:t>
-      </w:r>
-    </w:p>
-    <w:p>
-      <w:pPr>
-        <w:pStyle w:val="LP1"/>
-        <w:numPr>
-          <w:ilvl w:val="1"/>
-          <w:numId w:val="4"/>
-        </w:numPr>
-      </w:pPr>
-      <w:r>
-        <w:t>Buzz</w:t>
-      </w:r>
-    </w:p>
-    <w:p>
-      <w:pPr>
-        <w:pStyle w:val="LP1"/>
-        <w:numPr>
-          <w:ilvl w:val="0"/>
-          <w:numId w:val="4"/>
-        </w:numPr>
-      </w:pPr>
-      <w:r>
-        <w:t>Buzz</w:t>
-      </w:r>
-    </w:p>
-    <w:p>
-      <w:pPr>
-        <w:pStyle w:val="Body1"/>
-      </w:pPr>
-      <w:r>
-        <w:t>Lorem ipsum dolor sit amet, consectetur adipiscing elit. Nunc urna odio, lacinia sed tellus quis, mattis porttitor ligula. Sed at tristique ipsum, sit amet condimentum odio. Nunc faucibus fermentum libero quis maximus. Nunc ultrices odio risus, eu dignissim quam mollis sit amet. Aenean vitae volutpat neque. Praesent rhoncus condimentum nisi, in hendrerit arcu efficitur in. Etiam mollis erat sit amet orci volutpat, vitae elementum ligula rhoncus. Maecenas ut odio ut sem finibus mollis a quis est.</w:t>
+      <w:r>
+        <w:t xml:space="preserve">References</w:t>
       </w:r>
     </w:p>
     <w:p>
       <w:pPr>
         <w:pStyle w:val="Heading2"/>
       </w:pPr>
-      <w:bookmarkStart w:name="_Toc194614862" w:id="1"/>
-      <w:r>
-        <w:t>Bar</w:t>
-      </w:r>
-      <w:bookmarkEnd w:id="1"/>
+      <w:r>
+        <w:t xml:space="preserve">Inline Citations</w:t>
+      </w:r>
     </w:p>
     <w:p>
       <w:pPr>
         <w:pStyle w:val="Body2"/>
       </w:pPr>
       <w:r>
-        <w:t xml:space="preserve">Lorem ipsum dolor sit amet, consectetur adipiscing elit. Nunc urna odio, lacinia sed tellus quis, mattis porttitor ligula. Sed at tristique ipsum, sit amet condimentum odio. Nunc faucibus fermentum libero quis maximus. Nunc ultrices odio risus, eu dignissim quam mollis sit amet. Aenean vitae volutpat neque. Praesent rhoncus condimentum nisi, in hendrerit arcu </w:t>
-      </w:r>
-      <w:r>
-        <w:lastRenderedPageBreak/>
-        <w:t>efficitur in. Etiam mollis erat sit amet orci volutpat, vitae elementum ligula rhoncus. Maecenas ut odio ut sem finibus mollis a quis est.</w:t>
-      </w:r>
-    </w:p>
-    <w:p>
-      <w:pPr>
-        <w:pStyle w:val="Heading3"/>
-      </w:pPr>
-      <w:bookmarkStart w:name="_Toc194614863" w:id="2"/>
-      <w:r>
-        <w:t>Buzz</w:t>
-      </w:r>
-      <w:bookmarkEnd w:id="2"/>
-    </w:p>
-    <w:p>
-      <w:pPr>
-        <w:pStyle w:val="Body3"/>
-      </w:pPr>
-      <w:r>
-        <w:t>Lorem ipsum dolor sit amet, consectetur adipiscing elit. Nunc urna odio, lacinia sed tellus quis, mattis porttitor ligula. Sed at tristique ipsum, sit amet condimentum odio. Nunc faucibus fermentum libero quis maximus. Nunc ultrices odio risus, eu dignissim quam mollis sit amet. Aenean vitae volutpat neque. Praesent rhoncus condimentum nisi, in hendrerit arcu efficitur in. Etiam mollis erat sit amet orci volutpat, vitae elementum ligula rhoncus. Maecenas ut odio ut sem finibus mollis a quis est.</w:t>
-      </w:r>
-    </w:p>
-    <w:p>
-      <w:pPr>
-        <w:pStyle w:val="Code3"/>
-      </w:pPr>
+        <w:t xml:space="preserve">This section demonstrates inline citation syntax. The REST API design principles used here follow established guidelines</w:t>
+      </w:r>
+      <w:r>
+        <w:fldChar w:fldCharType="begin"/>
+      </w:r>
+      <w:r>
+        <w:instrText xml:space="preserve"> CITATION fielding2000 \l 1033 </w:instrText>
+      </w:r>
+      <w:r>
+        <w:fldChar w:fldCharType="separate"/>
+      </w:r>
       <w:r>
         <w:rPr>
-          <w:rStyle w:val="Code1Char"/>
+          <w:noProof/>
         </w:rPr>
-        <w:t xml:space="preserve">STEP 1: </w:t>
+        <w:t xml:space="preserve">[fielding2000]</w:t>
+      </w:r>
+      <w:r>
+        <w:fldChar w:fldCharType="end"/>
+      </w:r>
+      <w:r>
+        <w:t xml:space="preserve">. Configuration management best practices are documented in several sources</w:t>
+      </w:r>
+      <w:r>
+        <w:fldChar w:fldCharType="begin"/>
+      </w:r>
+      <w:r>
+        <w:instrText xml:space="preserve"> CITATION humble2010 \l 1033 </w:instrText>
+      </w:r>
+      <w:r>
+        <w:fldChar w:fldCharType="separate"/>
       </w:r>
       <w:r>
         <w:rPr>
-          <w:rStyle w:val="Code1Char"/>
+          <w:noProof/>
         </w:rPr>
-        <w:t>START</w:t>
+        <w:t xml:space="preserve">[humble2010]</w:t>
+      </w:r>
+      <w:r>
+        <w:fldChar w:fldCharType="end"/>
+      </w:r>
+      <w:r>
+        <w:fldChar w:fldCharType="begin"/>
+      </w:r>
+      <w:r>
+        <w:instrText xml:space="preserve"> CITATION fowler2018 \l 1033  \m humble2010</w:instrText>
+      </w:r>
+      <w:r>
+        <w:fldChar w:fldCharType="separate"/>
       </w:r>
       <w:r>
         <w:rPr>
-          <w:rStyle w:val="Code1Char"/>
+          <w:noProof/>
         </w:rPr>
-        <w:br/>
-        <w:t>STEP 2: INPUT a, b</w:t>
+        <w:t xml:space="preserve">[fowler2018]</w:t>
+      </w:r>
+      <w:r>
+        <w:fldChar w:fldCharType="end"/>
+      </w:r>
+      <w:r>
+        <w:t xml:space="preserve">.</w:t>
+      </w:r>
+    </w:p>
+    <w:p>
+      <w:pPr>
+        <w:pStyle w:val="Body2"/>
+      </w:pPr>
+      <w:r>
+        <w:t xml:space="preserve">The markdown processing pipeline is built on the Markdig library</w:t>
+      </w:r>
+      <w:r>
+        <w:fldChar w:fldCharType="begin"/>
+      </w:r>
+      <w:r>
+        <w:instrText xml:space="preserve"> CITATION markdig2024 \l 1033 </w:instrText>
+      </w:r>
+      <w:r>
+        <w:fldChar w:fldCharType="separate"/>
       </w:r>
       <w:r>
         <w:rPr>
-          <w:rStyle w:val="Code1Char"/>
+          <w:noProof/>
         </w:rPr>
-        <w:br/>
-        <w:t>STEP 3: END</w:t>
-      </w:r>
-    </w:p>
-    <w:p>
-      <w:pPr>
-        <w:pStyle w:val="Heading4"/>
-      </w:pPr>
-      <w:r>
-        <w:t>Boo</w:t>
-      </w:r>
-    </w:p>
-    <w:p>
-      <w:pPr>
-        <w:pStyle w:val="Body4"/>
-      </w:pPr>
-      <w:r>
-        <w:t>Lorem ipsum dolor sit amet, consectetur adipiscing elit. Nunc urna odio, lacinia sed tellus quis, mattis porttitor ligula. Sed at tristique ipsum, sit amet condimentum odio. Nunc faucibus fermentum libero quis maximus. Nunc ultrices odio risus, eu dignissim quam mollis sit amet. Aenean vitae volutpat neque. Praesent rhoncus condimentum nisi, in hendrerit arcu efficitur in. Etiam mollis erat sit amet orci volutpat, vitae elementum ligula rhoncus. Maecenas ut odio ut sem finibus mollis a quis est.</w:t>
+        <w:t xml:space="preserve">[markdig2024]</w:t>
+      </w:r>
+      <w:r>
+        <w:fldChar w:fldCharType="end"/>
+      </w:r>
+      <w:r>
+        <w:t xml:space="preserve">, which supports CommonMark and a range of extensions. Image handling relies on the ImageSharp library for cross-platform dimension retrieval</w:t>
+      </w:r>
+      <w:r>
+        <w:fldChar w:fldCharType="begin"/>
+      </w:r>
+      <w:r>
+        <w:instrText xml:space="preserve"> CITATION sixlabors2023 \l 1033 </w:instrText>
+      </w:r>
+      <w:r>
+        <w:fldChar w:fldCharType="separate"/>
+      </w:r>
+      <w:r>
+        <w:rPr>
+          <w:noProof/>
+        </w:rPr>
+        <w:t xml:space="preserve">[sixlabors2023]</w:t>
+      </w:r>
+      <w:r>
+        <w:fldChar w:fldCharType="end"/>
+      </w:r>
+      <w:r>
+        <w:t xml:space="preserve">.</w:t>
+      </w:r>
+    </w:p>
+    <w:p>
+      <w:pPr>
+        <w:pStyle w:val="Body2"/>
+      </w:pPr>
+      <w:r>
+        <w:t xml:space="preserve">For further background on document generation workflows, see the official OpenXML specification</w:t>
+      </w:r>
+      <w:r>
+        <w:fldChar w:fldCharType="begin"/>
+      </w:r>
+      <w:r>
+        <w:instrText xml:space="preserve"> CITATION microsoftOpenXml \l 1033 </w:instrText>
+      </w:r>
+      <w:r>
+        <w:fldChar w:fldCharType="separate"/>
+      </w:r>
+      <w:r>
+        <w:rPr>
+          <w:noProof/>
+        </w:rPr>
+        <w:t xml:space="preserve">[microsoftOpenXml]</w:t>
+      </w:r>
+      <w:r>
+        <w:fldChar w:fldCharType="end"/>
+      </w:r>
+      <w:r>
+        <w:t xml:space="preserve"> and the related web resource</w:t>
+      </w:r>
+      <w:r>
+        <w:fldChar w:fldCharType="begin"/>
+      </w:r>
+      <w:r>
+        <w:instrText xml:space="preserve"> CITATION openxmlWebSite2024 \l 1033 </w:instrText>
+      </w:r>
+      <w:r>
+        <w:fldChar w:fldCharType="separate"/>
+      </w:r>
+      <w:r>
+        <w:rPr>
+          <w:noProof/>
+        </w:rPr>
+        <w:t xml:space="preserve">[openxmlWebSite2024]</w:t>
+      </w:r>
+      <w:r>
+        <w:fldChar w:fldCharType="end"/>
+      </w:r>
+      <w:r>
+        <w:t xml:space="preserve">.</w:t>
+      </w:r>
+    </w:p>
+    <w:p>
+      <w:pPr>
+        <w:pStyle w:val="Body2"/>
+      </w:pPr>
+      <w:r>
+        <w:t xml:space="preserve">A case study on tooling for technical writing is also referenced here</w:t>
+      </w:r>
+      <w:r>
+        <w:fldChar w:fldCharType="begin"/>
+      </w:r>
+      <w:r>
+        <w:instrText xml:space="preserve"> CITATION techWritingCase2019 \l 1033 </w:instrText>
+      </w:r>
+      <w:r>
+        <w:fldChar w:fldCharType="separate"/>
+      </w:r>
+      <w:r>
+        <w:rPr>
+          <w:noProof/>
+        </w:rPr>
+        <w:t xml:space="preserve">[techWritingCase2019]</w:t>
+      </w:r>
+      <w:r>
+        <w:fldChar w:fldCharType="end"/>
+      </w:r>
+      <w:r>
+        <w:t xml:space="preserve">.</w:t>
       </w:r>
     </w:p>
     <w:sdt>
       <w:sdtPr>
         <w:rPr>
-          <w:rFonts w:ascii="Arial" w:hAnsi="Arial" w:eastAsiaTheme="minorHAnsi" w:cstheme="minorBidi"/>
-          <w:b w:val="0"/>
-          <w:sz w:val="24"/>
-          <w:szCs w:val="24"/>
+          <w:rFonts w:eastAsiaTheme="minorHAnsi"/>
         </w:rPr>
         <w:id w:val="-7300804"/>
         <w:docPartObj>
@@ -2230,7 +1976,14 @@
           <w:docPartUnique/>
         </w:docPartObj>
       </w:sdtPr>
-      <w:sdtEndPr/>
+      <w:sdtEndPr>
+        <w:rPr>
+          <w:rFonts w:ascii="Arial" w:hAnsi="Arial" w:cstheme="minorBidi"/>
+          <w:b w:val="0"/>
+          <w:sz w:val="24"/>
+          <w:szCs w:val="24"/>
+        </w:rPr>
+      </w:sdtEndPr>
       <w:sdtContent>
         <w:p>
           <w:pPr>
@@ -2850,7 +2603,7 @@
   <w:abstractNum w:abstractNumId="5">
     <w:multiLevelType w:val="hybridMultilevel"/>
     <w:lvl w:ilvl="0">
-      <w:tmpl w:val="B0D94BC5"/>
+      <w:tmpl w:val="415DAAB0"/>
       <w:numFmt w:val="bullet"/>
       <w:lvlText w:val=""/>
       <w:rPr>
@@ -2862,7 +2615,7 @@
       </w:pPr>
     </w:lvl>
     <w:lvl w:ilvl="1">
-      <w:tmpl w:val="FD76B3A5"/>
+      <w:tmpl w:val="898454EA"/>
       <w:numFmt w:val="bullet"/>
       <w:lvlText w:val="o"/>
       <w:rPr>
@@ -2874,7 +2627,7 @@
       </w:pPr>
     </w:lvl>
     <w:lvl w:ilvl="2">
-      <w:tmpl w:val="CF811DA5"/>
+      <w:tmpl w:val="BF6DA22C"/>
       <w:numFmt w:val="bullet"/>
       <w:lvlText w:val=""/>
       <w:rPr>
@@ -2886,7 +2639,7 @@
       </w:pPr>
     </w:lvl>
     <w:lvl w:ilvl="3">
-      <w:tmpl w:val="8735FF14"/>
+      <w:tmpl w:val="22D699C8"/>
       <w:numFmt w:val="bullet"/>
       <w:lvlText w:val=""/>
       <w:rPr>
@@ -2898,7 +2651,7 @@
       </w:pPr>
     </w:lvl>
     <w:lvl w:ilvl="4">
-      <w:tmpl w:val="15E71233"/>
+      <w:tmpl w:val="4FBF5011"/>
       <w:numFmt w:val="bullet"/>
       <w:lvlText w:val="o"/>
       <w:rPr>
@@ -2910,7 +2663,7 @@
       </w:pPr>
     </w:lvl>
     <w:lvl w:ilvl="5">
-      <w:tmpl w:val="0B3DD477"/>
+      <w:tmpl w:val="339EA900"/>
       <w:numFmt w:val="bullet"/>
       <w:lvlText w:val=""/>
       <w:rPr>
@@ -2922,7 +2675,7 @@
       </w:pPr>
     </w:lvl>
     <w:lvl w:ilvl="6">
-      <w:tmpl w:val="9E02EF47"/>
+      <w:tmpl w:val="F7B9538E"/>
       <w:numFmt w:val="bullet"/>
       <w:lvlText w:val=""/>
       <w:rPr>
@@ -2934,7 +2687,7 @@
       </w:pPr>
     </w:lvl>
     <w:lvl w:ilvl="7">
-      <w:tmpl w:val="B109A1C5"/>
+      <w:tmpl w:val="F65AB274"/>
       <w:numFmt w:val="bullet"/>
       <w:lvlText w:val="o"/>
       <w:rPr>
@@ -2946,7 +2699,7 @@
       </w:pPr>
     </w:lvl>
     <w:lvl w:ilvl="8">
-      <w:tmpl w:val="627B410C"/>
+      <w:tmpl w:val="B709CCA6"/>
       <w:numFmt w:val="bullet"/>
       <w:lvlText w:val=""/>
       <w:rPr>
@@ -2961,7 +2714,7 @@
   <w:abstractNum w:abstractNumId="6">
     <w:multiLevelType w:val="hybridMultilevel"/>
     <w:lvl w:ilvl="0">
-      <w:tmpl w:val="D2FF0582"/>
+      <w:tmpl w:val="64012012"/>
       <w:start w:val="1"/>
       <w:numFmt w:val="decimal"/>
       <w:lvlText w:val="%1."/>
@@ -2971,7 +2724,7 @@
       </w:pPr>
     </w:lvl>
     <w:lvl w:ilvl="1">
-      <w:tmpl w:val="D9179316"/>
+      <w:tmpl w:val="805C15F0"/>
       <w:start w:val="1"/>
       <w:numFmt w:val="lowerLetter"/>
       <w:lvlText w:val="%2."/>
@@ -2981,7 +2734,7 @@
       </w:pPr>
     </w:lvl>
     <w:lvl w:ilvl="2">
-      <w:tmpl w:val="022318C8"/>
+      <w:tmpl w:val="9F8A6F37"/>
       <w:start w:val="1"/>
       <w:numFmt w:val="lowerRoman"/>
       <w:lvlText w:val="%3."/>
@@ -2991,7 +2744,7 @@
       </w:pPr>
     </w:lvl>
     <w:lvl w:ilvl="3">
-      <w:tmpl w:val="92A68B4C"/>
+      <w:tmpl w:val="44E4A159"/>
       <w:start w:val="1"/>
       <w:numFmt w:val="decimal"/>
       <w:lvlText w:val="%4."/>
@@ -3001,7 +2754,7 @@
       </w:pPr>
     </w:lvl>
     <w:lvl w:ilvl="4">
-      <w:tmpl w:val="AA10B2E1"/>
+      <w:tmpl w:val="6D4ACA9A"/>
       <w:start w:val="1"/>
       <w:numFmt w:val="lowerLetter"/>
       <w:lvlText w:val="%5."/>
@@ -3011,7 +2764,7 @@
       </w:pPr>
     </w:lvl>
     <w:lvl w:ilvl="5">
-      <w:tmpl w:val="09AFE3BE"/>
+      <w:tmpl w:val="74C59E97"/>
       <w:start w:val="1"/>
       <w:numFmt w:val="lowerRoman"/>
       <w:lvlText w:val="%6."/>
@@ -3021,7 +2774,7 @@
       </w:pPr>
     </w:lvl>
     <w:lvl w:ilvl="6">
-      <w:tmpl w:val="8A18069A"/>
+      <w:tmpl w:val="D29B210D"/>
       <w:start w:val="1"/>
       <w:numFmt w:val="decimal"/>
       <w:lvlText w:val="%7."/>
@@ -3031,7 +2784,7 @@
       </w:pPr>
     </w:lvl>
     <w:lvl w:ilvl="7">
-      <w:tmpl w:val="79D0D1B0"/>
+      <w:tmpl w:val="C089D73C"/>
       <w:start w:val="1"/>
       <w:numFmt w:val="lowerLetter"/>
       <w:lvlText w:val="%8."/>
@@ -3041,7 +2794,7 @@
       </w:pPr>
     </w:lvl>
     <w:lvl w:ilvl="8">
-      <w:tmpl w:val="23110502"/>
+      <w:tmpl w:val="14627979"/>
       <w:start w:val="1"/>
       <w:numFmt w:val="lowerRoman"/>
       <w:lvlText w:val="%9."/>
@@ -3054,7 +2807,7 @@
   <w:abstractNum w:abstractNumId="7">
     <w:multiLevelType w:val="hybridMultilevel"/>
     <w:lvl w:ilvl="0">
-      <w:tmpl w:val="E2E6A1D5"/>
+      <w:tmpl w:val="0BC4FEAD"/>
       <w:numFmt w:val="bullet"/>
       <w:lvlText w:val=""/>
       <w:rPr>
@@ -3066,7 +2819,7 @@
       </w:pPr>
     </w:lvl>
     <w:lvl w:ilvl="1">
-      <w:tmpl w:val="B3A8C758"/>
+      <w:tmpl w:val="12054741"/>
       <w:numFmt w:val="bullet"/>
       <w:lvlText w:val="o"/>
       <w:rPr>
@@ -3078,7 +2831,7 @@
       </w:pPr>
     </w:lvl>
     <w:lvl w:ilvl="2">
-      <w:tmpl w:val="27FBD435"/>
+      <w:tmpl w:val="A7471226"/>
       <w:numFmt w:val="bullet"/>
       <w:lvlText w:val=""/>
       <w:rPr>
@@ -3090,7 +2843,7 @@
       </w:pPr>
     </w:lvl>
     <w:lvl w:ilvl="3">
-      <w:tmpl w:val="4DE76FF4"/>
+      <w:tmpl w:val="DBFFCB85"/>
       <w:numFmt w:val="bullet"/>
       <w:lvlText w:val=""/>
       <w:rPr>
@@ -3102,7 +2855,7 @@
       </w:pPr>
     </w:lvl>
     <w:lvl w:ilvl="4">
-      <w:tmpl w:val="DCC4F97E"/>
+      <w:tmpl w:val="569192F9"/>
       <w:numFmt w:val="bullet"/>
       <w:lvlText w:val="o"/>
       <w:rPr>
@@ -3114,7 +2867,7 @@
       </w:pPr>
     </w:lvl>
     <w:lvl w:ilvl="5">
-      <w:tmpl w:val="3FC4AECC"/>
+      <w:tmpl w:val="4BBED378"/>
       <w:numFmt w:val="bullet"/>
       <w:lvlText w:val=""/>
       <w:rPr>
@@ -3126,7 +2879,7 @@
       </w:pPr>
     </w:lvl>
     <w:lvl w:ilvl="6">
-      <w:tmpl w:val="562CC32B"/>
+      <w:tmpl w:val="149C0E87"/>
       <w:numFmt w:val="bullet"/>
       <w:lvlText w:val=""/>
       <w:rPr>
@@ -3138,7 +2891,7 @@
       </w:pPr>
     </w:lvl>
     <w:lvl w:ilvl="7">
-      <w:tmpl w:val="EE1A0E69"/>
+      <w:tmpl w:val="4C556FA4"/>
       <w:numFmt w:val="bullet"/>
       <w:lvlText w:val="o"/>
       <w:rPr>
@@ -3150,7 +2903,7 @@
       </w:pPr>
     </w:lvl>
     <w:lvl w:ilvl="8">
-      <w:tmpl w:val="A9583D37"/>
+      <w:tmpl w:val="82DB02D0"/>
       <w:numFmt w:val="bullet"/>
       <w:lvlText w:val=""/>
       <w:rPr>
@@ -3165,7 +2918,7 @@
   <w:abstractNum w:abstractNumId="8">
     <w:multiLevelType w:val="hybridMultilevel"/>
     <w:lvl w:ilvl="0">
-      <w:tmpl w:val="3251FFFA"/>
+      <w:tmpl w:val="B58B6B39"/>
       <w:start w:val="1"/>
       <w:numFmt w:val="decimal"/>
       <w:lvlText w:val="%1."/>
@@ -3175,7 +2928,7 @@
       </w:pPr>
     </w:lvl>
     <w:lvl w:ilvl="1">
-      <w:tmpl w:val="EB5855E7"/>
+      <w:tmpl w:val="4E408C21"/>
       <w:start w:val="1"/>
       <w:numFmt w:val="lowerLetter"/>
       <w:lvlText w:val="%2."/>
@@ -3185,7 +2938,7 @@
       </w:pPr>
     </w:lvl>
     <w:lvl w:ilvl="2">
-      <w:tmpl w:val="014F621A"/>
+      <w:tmpl w:val="B1D4F396"/>
       <w:start w:val="1"/>
       <w:numFmt w:val="lowerRoman"/>
       <w:lvlText w:val="%3."/>
@@ -3195,7 +2948,7 @@
       </w:pPr>
     </w:lvl>
     <w:lvl w:ilvl="3">
-      <w:tmpl w:val="E59A10D5"/>
+      <w:tmpl w:val="3705B45B"/>
       <w:start w:val="1"/>
       <w:numFmt w:val="decimal"/>
       <w:lvlText w:val="%4."/>
@@ -3205,7 +2958,7 @@
       </w:pPr>
     </w:lvl>
     <w:lvl w:ilvl="4">
-      <w:tmpl w:val="0AA7822E"/>
+      <w:tmpl w:val="1204AD27"/>
       <w:start w:val="1"/>
       <w:numFmt w:val="lowerLetter"/>
       <w:lvlText w:val="%5."/>
@@ -3215,7 +2968,7 @@
       </w:pPr>
     </w:lvl>
     <w:lvl w:ilvl="5">
-      <w:tmpl w:val="48017E56"/>
+      <w:tmpl w:val="612819B2"/>
       <w:start w:val="1"/>
       <w:numFmt w:val="lowerRoman"/>
       <w:lvlText w:val="%6."/>
@@ -3225,7 +2978,7 @@
       </w:pPr>
     </w:lvl>
     <w:lvl w:ilvl="6">
-      <w:tmpl w:val="2FBA34AF"/>
+      <w:tmpl w:val="7A8DE3F5"/>
       <w:start w:val="1"/>
       <w:numFmt w:val="decimal"/>
       <w:lvlText w:val="%7."/>
@@ -3235,7 +2988,7 @@
       </w:pPr>
     </w:lvl>
     <w:lvl w:ilvl="7">
-      <w:tmpl w:val="2E979A08"/>
+      <w:tmpl w:val="2D2B3346"/>
       <w:start w:val="1"/>
       <w:numFmt w:val="lowerLetter"/>
       <w:lvlText w:val="%8."/>
@@ -3245,7 +2998,7 @@
       </w:pPr>
     </w:lvl>
     <w:lvl w:ilvl="8">
-      <w:tmpl w:val="DB3987D3"/>
+      <w:tmpl w:val="975746F5"/>
       <w:start w:val="1"/>
       <w:numFmt w:val="lowerRoman"/>
       <w:lvlText w:val="%9."/>
@@ -3258,7 +3011,7 @@
   <w:abstractNum w:abstractNumId="9">
     <w:multiLevelType w:val="hybridMultilevel"/>
     <w:lvl w:ilvl="0">
-      <w:tmpl w:val="122997E9"/>
+      <w:tmpl w:val="8816EB75"/>
       <w:numFmt w:val="bullet"/>
       <w:lvlText w:val=""/>
       <w:rPr>
@@ -3270,7 +3023,7 @@
       </w:pPr>
     </w:lvl>
     <w:lvl w:ilvl="1">
-      <w:tmpl w:val="D170AE38"/>
+      <w:tmpl w:val="B4D53873"/>
       <w:numFmt w:val="bullet"/>
       <w:lvlText w:val="o"/>
       <w:rPr>
@@ -3282,7 +3035,7 @@
       </w:pPr>
     </w:lvl>
     <w:lvl w:ilvl="2">
-      <w:tmpl w:val="4C558541"/>
+      <w:tmpl w:val="0BDD08BD"/>
       <w:numFmt w:val="bullet"/>
       <w:lvlText w:val=""/>
       <w:rPr>
@@ -3294,7 +3047,7 @@
       </w:pPr>
     </w:lvl>
     <w:lvl w:ilvl="3">
-      <w:tmpl w:val="5E3D1B74"/>
+      <w:tmpl w:val="CD55BDC6"/>
       <w:numFmt w:val="bullet"/>
       <w:lvlText w:val=""/>
       <w:rPr>
@@ -3306,7 +3059,7 @@
       </w:pPr>
     </w:lvl>
     <w:lvl w:ilvl="4">
-      <w:tmpl w:val="C69E8276"/>
+      <w:tmpl w:val="E3BB2A7C"/>
       <w:numFmt w:val="bullet"/>
       <w:lvlText w:val="o"/>
       <w:rPr>
@@ -3318,7 +3071,7 @@
       </w:pPr>
     </w:lvl>
     <w:lvl w:ilvl="5">
-      <w:tmpl w:val="F0639472"/>
+      <w:tmpl w:val="3219D582"/>
       <w:numFmt w:val="bullet"/>
       <w:lvlText w:val=""/>
       <w:rPr>
@@ -3330,7 +3083,7 @@
       </w:pPr>
     </w:lvl>
     <w:lvl w:ilvl="6">
-      <w:tmpl w:val="E05054D0"/>
+      <w:tmpl w:val="ED163CEE"/>
       <w:numFmt w:val="bullet"/>
       <w:lvlText w:val=""/>
       <w:rPr>
@@ -3342,7 +3095,7 @@
       </w:pPr>
     </w:lvl>
     <w:lvl w:ilvl="7">
-      <w:tmpl w:val="5CC3BD25"/>
+      <w:tmpl w:val="E7B999CA"/>
       <w:numFmt w:val="bullet"/>
       <w:lvlText w:val="o"/>
       <w:rPr>
@@ -3354,7 +3107,7 @@
       </w:pPr>
     </w:lvl>
     <w:lvl w:ilvl="8">
-      <w:tmpl w:val="6D947DE4"/>
+      <w:tmpl w:val="EEA97F8E"/>
       <w:numFmt w:val="bullet"/>
       <w:lvlText w:val=""/>
       <w:rPr>
@@ -3369,7 +3122,7 @@
   <w:abstractNum w:abstractNumId="10">
     <w:multiLevelType w:val="hybridMultilevel"/>
     <w:lvl w:ilvl="0">
-      <w:tmpl w:val="FBDDC1F6"/>
+      <w:tmpl w:val="89BC1367"/>
       <w:start w:val="1"/>
       <w:numFmt w:val="decimal"/>
       <w:lvlText w:val="%1."/>
@@ -3379,7 +3132,7 @@
       </w:pPr>
     </w:lvl>
     <w:lvl w:ilvl="1">
-      <w:tmpl w:val="D3FDDB9D"/>
+      <w:tmpl w:val="4C690154"/>
       <w:start w:val="1"/>
       <w:numFmt w:val="lowerLetter"/>
       <w:lvlText w:val="%2."/>
@@ -3389,7 +3142,7 @@
       </w:pPr>
     </w:lvl>
     <w:lvl w:ilvl="2">
-      <w:tmpl w:val="1F9D6767"/>
+      <w:tmpl w:val="560FC19E"/>
       <w:start w:val="1"/>
       <w:numFmt w:val="lowerRoman"/>
       <w:lvlText w:val="%3."/>
@@ -3399,7 +3152,7 @@
       </w:pPr>
     </w:lvl>
     <w:lvl w:ilvl="3">
-      <w:tmpl w:val="D5708011"/>
+      <w:tmpl w:val="84D0D860"/>
       <w:start w:val="1"/>
       <w:numFmt w:val="decimal"/>
       <w:lvlText w:val="%4."/>
@@ -3409,7 +3162,7 @@
       </w:pPr>
     </w:lvl>
     <w:lvl w:ilvl="4">
-      <w:tmpl w:val="CBC6833E"/>
+      <w:tmpl w:val="85D0D96E"/>
       <w:start w:val="1"/>
       <w:numFmt w:val="lowerLetter"/>
       <w:lvlText w:val="%5."/>
@@ -3419,7 +3172,7 @@
       </w:pPr>
     </w:lvl>
     <w:lvl w:ilvl="5">
-      <w:tmpl w:val="021AD357"/>
+      <w:tmpl w:val="BF3EDD08"/>
       <w:start w:val="1"/>
       <w:numFmt w:val="lowerRoman"/>
       <w:lvlText w:val="%6."/>
@@ -3429,7 +3182,7 @@
       </w:pPr>
     </w:lvl>
     <w:lvl w:ilvl="6">
-      <w:tmpl w:val="2805554D"/>
+      <w:tmpl w:val="2913081B"/>
       <w:start w:val="1"/>
       <w:numFmt w:val="decimal"/>
       <w:lvlText w:val="%7."/>
@@ -3439,7 +3192,7 @@
       </w:pPr>
     </w:lvl>
     <w:lvl w:ilvl="7">
-      <w:tmpl w:val="817C6769"/>
+      <w:tmpl w:val="51343EF4"/>
       <w:start w:val="1"/>
       <w:numFmt w:val="lowerLetter"/>
       <w:lvlText w:val="%8."/>
@@ -3449,7 +3202,7 @@
       </w:pPr>
     </w:lvl>
     <w:lvl w:ilvl="8">
-      <w:tmpl w:val="982886B7"/>
+      <w:tmpl w:val="18E21B1A"/>
       <w:start w:val="1"/>
       <w:numFmt w:val="lowerRoman"/>
       <w:lvlText w:val="%9."/>
@@ -3462,7 +3215,7 @@
   <w:abstractNum w:abstractNumId="11">
     <w:multiLevelType w:val="hybridMultilevel"/>
     <w:lvl w:ilvl="0">
-      <w:tmpl w:val="076C2C19"/>
+      <w:tmpl w:val="3BBFFF02"/>
       <w:numFmt w:val="bullet"/>
       <w:lvlText w:val=""/>
       <w:rPr>
@@ -3474,7 +3227,7 @@
       </w:pPr>
     </w:lvl>
     <w:lvl w:ilvl="1">
-      <w:tmpl w:val="A88EB218"/>
+      <w:tmpl w:val="6ECF714D"/>
       <w:numFmt w:val="bullet"/>
       <w:lvlText w:val="o"/>
       <w:rPr>
@@ -3486,7 +3239,7 @@
       </w:pPr>
     </w:lvl>
     <w:lvl w:ilvl="2">
-      <w:tmpl w:val="FE5475D1"/>
+      <w:tmpl w:val="83F2D7C2"/>
       <w:numFmt w:val="bullet"/>
       <w:lvlText w:val=""/>
       <w:rPr>
@@ -3498,7 +3251,7 @@
       </w:pPr>
     </w:lvl>
     <w:lvl w:ilvl="3">
-      <w:tmpl w:val="2AC22EE9"/>
+      <w:tmpl w:val="A34027BC"/>
       <w:numFmt w:val="bullet"/>
       <w:lvlText w:val=""/>
       <w:rPr>
@@ -3510,7 +3263,7 @@
       </w:pPr>
     </w:lvl>
     <w:lvl w:ilvl="4">
-      <w:tmpl w:val="8FF62C09"/>
+      <w:tmpl w:val="EF4304C0"/>
       <w:numFmt w:val="bullet"/>
       <w:lvlText w:val="o"/>
       <w:rPr>
@@ -3522,7 +3275,7 @@
       </w:pPr>
     </w:lvl>
     <w:lvl w:ilvl="5">
-      <w:tmpl w:val="4A42B0FB"/>
+      <w:tmpl w:val="8515DAEA"/>
       <w:numFmt w:val="bullet"/>
       <w:lvlText w:val=""/>
       <w:rPr>
@@ -3534,7 +3287,7 @@
       </w:pPr>
     </w:lvl>
     <w:lvl w:ilvl="6">
-      <w:tmpl w:val="E86E8F26"/>
+      <w:tmpl w:val="A554715F"/>
       <w:numFmt w:val="bullet"/>
       <w:lvlText w:val=""/>
       <w:rPr>
@@ -3546,7 +3299,7 @@
       </w:pPr>
     </w:lvl>
     <w:lvl w:ilvl="7">
-      <w:tmpl w:val="F12304BC"/>
+      <w:tmpl w:val="8AFF5D3F"/>
       <w:numFmt w:val="bullet"/>
       <w:lvlText w:val="o"/>
       <w:rPr>
@@ -3558,7 +3311,7 @@
       </w:pPr>
     </w:lvl>
     <w:lvl w:ilvl="8">
-      <w:tmpl w:val="1B644363"/>
+      <w:tmpl w:val="F3FD98A6"/>
       <w:numFmt w:val="bullet"/>
       <w:lvlText w:val=""/>
       <w:rPr>
@@ -3573,7 +3326,7 @@
   <w:abstractNum w:abstractNumId="12">
     <w:multiLevelType w:val="hybridMultilevel"/>
     <w:lvl w:ilvl="0">
-      <w:tmpl w:val="382AD16E"/>
+      <w:tmpl w:val="78D20BC9"/>
       <w:start w:val="1"/>
       <w:numFmt w:val="decimal"/>
       <w:lvlText w:val="%1."/>
@@ -3583,7 +3336,7 @@
       </w:pPr>
     </w:lvl>
     <w:lvl w:ilvl="1">
-      <w:tmpl w:val="A033A8E1"/>
+      <w:tmpl w:val="EA7540EB"/>
       <w:start w:val="1"/>
       <w:numFmt w:val="lowerLetter"/>
       <w:lvlText w:val="%2."/>
@@ -3593,7 +3346,7 @@
       </w:pPr>
     </w:lvl>
     <w:lvl w:ilvl="2">
-      <w:tmpl w:val="CB0EA58E"/>
+      <w:tmpl w:val="F7257D24"/>
       <w:start w:val="1"/>
       <w:numFmt w:val="lowerRoman"/>
       <w:lvlText w:val="%3."/>
@@ -3603,7 +3356,7 @@
       </w:pPr>
     </w:lvl>
     <w:lvl w:ilvl="3">
-      <w:tmpl w:val="418C338E"/>
+      <w:tmpl w:val="8EFC8A9C"/>
       <w:start w:val="1"/>
       <w:numFmt w:val="decimal"/>
       <w:lvlText w:val="%4."/>
@@ -3613,7 +3366,7 @@
       </w:pPr>
     </w:lvl>
     <w:lvl w:ilvl="4">
-      <w:tmpl w:val="4A287838"/>
+      <w:tmpl w:val="E98A9FF8"/>
       <w:start w:val="1"/>
       <w:numFmt w:val="lowerLetter"/>
       <w:lvlText w:val="%5."/>
@@ -3623,7 +3376,7 @@
       </w:pPr>
     </w:lvl>
     <w:lvl w:ilvl="5">
-      <w:tmpl w:val="F901D5A2"/>
+      <w:tmpl w:val="1625A25E"/>
       <w:start w:val="1"/>
       <w:numFmt w:val="lowerRoman"/>
       <w:lvlText w:val="%6."/>
@@ -3633,7 +3386,7 @@
       </w:pPr>
     </w:lvl>
     <w:lvl w:ilvl="6">
-      <w:tmpl w:val="FB2A63AF"/>
+      <w:tmpl w:val="1FE71BAB"/>
       <w:start w:val="1"/>
       <w:numFmt w:val="decimal"/>
       <w:lvlText w:val="%7."/>
@@ -3643,7 +3396,7 @@
       </w:pPr>
     </w:lvl>
     <w:lvl w:ilvl="7">
-      <w:tmpl w:val="AD97A770"/>
+      <w:tmpl w:val="B5C08981"/>
       <w:start w:val="1"/>
       <w:numFmt w:val="lowerLetter"/>
       <w:lvlText w:val="%8."/>
@@ -3653,7 +3406,7 @@
       </w:pPr>
     </w:lvl>
     <w:lvl w:ilvl="8">
-      <w:tmpl w:val="BD95C090"/>
+      <w:tmpl w:val="7684168F"/>
       <w:start w:val="1"/>
       <w:numFmt w:val="lowerRoman"/>
       <w:lvlText w:val="%9."/>
@@ -3666,7 +3419,7 @@
   <w:abstractNum w:abstractNumId="13">
     <w:multiLevelType w:val="hybridMultilevel"/>
     <w:lvl w:ilvl="0">
-      <w:tmpl w:val="ACC7FF7C"/>
+      <w:tmpl w:val="0C7D11CB"/>
       <w:numFmt w:val="bullet"/>
       <w:lvlText w:val=""/>
       <w:rPr>
@@ -3678,7 +3431,7 @@
       </w:pPr>
     </w:lvl>
     <w:lvl w:ilvl="1">
-      <w:tmpl w:val="97EB096C"/>
+      <w:tmpl w:val="D93F485B"/>
       <w:numFmt w:val="bullet"/>
       <w:lvlText w:val="o"/>
       <w:rPr>
@@ -3690,7 +3443,7 @@
       </w:pPr>
     </w:lvl>
     <w:lvl w:ilvl="2">
-      <w:tmpl w:val="E0BE804F"/>
+      <w:tmpl w:val="15755A29"/>
       <w:numFmt w:val="bullet"/>
       <w:lvlText w:val=""/>
       <w:rPr>
@@ -3702,7 +3455,7 @@
       </w:pPr>
     </w:lvl>
     <w:lvl w:ilvl="3">
-      <w:tmpl w:val="146BF3FD"/>
+      <w:tmpl w:val="476C9417"/>
       <w:numFmt w:val="bullet"/>
       <w:lvlText w:val=""/>
       <w:rPr>
@@ -3714,7 +3467,7 @@
       </w:pPr>
     </w:lvl>
     <w:lvl w:ilvl="4">
-      <w:tmpl w:val="971CB2D9"/>
+      <w:tmpl w:val="3A30FDA4"/>
       <w:numFmt w:val="bullet"/>
       <w:lvlText w:val="o"/>
       <w:rPr>
@@ -3726,7 +3479,7 @@
       </w:pPr>
     </w:lvl>
     <w:lvl w:ilvl="5">
-      <w:tmpl w:val="5B1D95B3"/>
+      <w:tmpl w:val="34D71DE9"/>
       <w:numFmt w:val="bullet"/>
       <w:lvlText w:val=""/>
       <w:rPr>
@@ -3738,7 +3491,7 @@
       </w:pPr>
     </w:lvl>
     <w:lvl w:ilvl="6">
-      <w:tmpl w:val="1EC7C620"/>
+      <w:tmpl w:val="1723AE3C"/>
       <w:numFmt w:val="bullet"/>
       <w:lvlText w:val=""/>
       <w:rPr>
@@ -3750,7 +3503,7 @@
       </w:pPr>
     </w:lvl>
     <w:lvl w:ilvl="7">
-      <w:tmpl w:val="226DFA1E"/>
+      <w:tmpl w:val="A6F37995"/>
       <w:numFmt w:val="bullet"/>
       <w:lvlText w:val="o"/>
       <w:rPr>
@@ -3762,7 +3515,7 @@
       </w:pPr>
     </w:lvl>
     <w:lvl w:ilvl="8">
-      <w:tmpl w:val="97F87C0C"/>
+      <w:tmpl w:val="C5D32387"/>
       <w:numFmt w:val="bullet"/>
       <w:lvlText w:val=""/>
       <w:rPr>
@@ -3777,7 +3530,7 @@
   <w:abstractNum w:abstractNumId="14">
     <w:multiLevelType w:val="hybridMultilevel"/>
     <w:lvl w:ilvl="0">
-      <w:tmpl w:val="537D7C5E"/>
+      <w:tmpl w:val="9EF31D1B"/>
       <w:numFmt w:val="bullet"/>
       <w:lvlText w:val=""/>
       <w:rPr>
@@ -3789,7 +3542,7 @@
       </w:pPr>
     </w:lvl>
     <w:lvl w:ilvl="1">
-      <w:tmpl w:val="AAFCEC17"/>
+      <w:tmpl w:val="4B2E1FD4"/>
       <w:numFmt w:val="bullet"/>
       <w:lvlText w:val="o"/>
       <w:rPr>
@@ -3801,7 +3554,7 @@
       </w:pPr>
     </w:lvl>
     <w:lvl w:ilvl="2">
-      <w:tmpl w:val="4BE08D9F"/>
+      <w:tmpl w:val="0A2136F0"/>
       <w:numFmt w:val="bullet"/>
       <w:lvlText w:val=""/>
       <w:rPr>
@@ -3813,7 +3566,7 @@
       </w:pPr>
     </w:lvl>
     <w:lvl w:ilvl="3">
-      <w:tmpl w:val="B1C939FE"/>
+      <w:tmpl w:val="A976D4F2"/>
       <w:numFmt w:val="bullet"/>
       <w:lvlText w:val=""/>
       <w:rPr>
@@ -3825,7 +3578,7 @@
       </w:pPr>
     </w:lvl>
     <w:lvl w:ilvl="4">
-      <w:tmpl w:val="DBBCEF4E"/>
+      <w:tmpl w:val="4789E06C"/>
       <w:numFmt w:val="bullet"/>
       <w:lvlText w:val="o"/>
       <w:rPr>
@@ -3837,7 +3590,7 @@
       </w:pPr>
     </w:lvl>
     <w:lvl w:ilvl="5">
-      <w:tmpl w:val="5A952AE2"/>
+      <w:tmpl w:val="EBEF9B0C"/>
       <w:numFmt w:val="bullet"/>
       <w:lvlText w:val=""/>
       <w:rPr>
@@ -3849,7 +3602,7 @@
       </w:pPr>
     </w:lvl>
     <w:lvl w:ilvl="6">
-      <w:tmpl w:val="17B6B17C"/>
+      <w:tmpl w:val="F843F38E"/>
       <w:numFmt w:val="bullet"/>
       <w:lvlText w:val=""/>
       <w:rPr>
@@ -3861,7 +3614,7 @@
       </w:pPr>
     </w:lvl>
     <w:lvl w:ilvl="7">
-      <w:tmpl w:val="7E7AD82B"/>
+      <w:tmpl w:val="D02A7446"/>
       <w:numFmt w:val="bullet"/>
       <w:lvlText w:val="o"/>
       <w:rPr>
@@ -3873,7 +3626,7 @@
       </w:pPr>
     </w:lvl>
     <w:lvl w:ilvl="8">
-      <w:tmpl w:val="A64A4413"/>
+      <w:tmpl w:val="DF244816"/>
       <w:numFmt w:val="bullet"/>
       <w:lvlText w:val=""/>
       <w:rPr>
@@ -3888,7 +3641,7 @@
   <w:abstractNum w:abstractNumId="15">
     <w:multiLevelType w:val="hybridMultilevel"/>
     <w:lvl w:ilvl="0">
-      <w:tmpl w:val="FC800929"/>
+      <w:tmpl w:val="BEED45EF"/>
       <w:start w:val="1"/>
       <w:numFmt w:val="decimal"/>
       <w:lvlText w:val="%1."/>
@@ -3898,7 +3651,7 @@
       </w:pPr>
     </w:lvl>
     <w:lvl w:ilvl="1">
-      <w:tmpl w:val="60AEF48B"/>
+      <w:tmpl w:val="D1E45756"/>
       <w:start w:val="1"/>
       <w:numFmt w:val="lowerLetter"/>
       <w:lvlText w:val="%2."/>
@@ -3908,7 +3661,7 @@
       </w:pPr>
     </w:lvl>
     <w:lvl w:ilvl="2">
-      <w:tmpl w:val="0FDBE9B5"/>
+      <w:tmpl w:val="B1F5834F"/>
       <w:start w:val="1"/>
       <w:numFmt w:val="lowerRoman"/>
       <w:lvlText w:val="%3."/>
@@ -3918,7 +3671,7 @@
       </w:pPr>
     </w:lvl>
     <w:lvl w:ilvl="3">
-      <w:tmpl w:val="61F7F5AF"/>
+      <w:tmpl w:val="5F090746"/>
       <w:start w:val="1"/>
       <w:numFmt w:val="decimal"/>
       <w:lvlText w:val="%4."/>
@@ -3928,7 +3681,7 @@
       </w:pPr>
     </w:lvl>
     <w:lvl w:ilvl="4">
-      <w:tmpl w:val="798FBC0B"/>
+      <w:tmpl w:val="289088CF"/>
       <w:start w:val="1"/>
       <w:numFmt w:val="lowerLetter"/>
       <w:lvlText w:val="%5."/>
@@ -3938,7 +3691,7 @@
       </w:pPr>
     </w:lvl>
     <w:lvl w:ilvl="5">
-      <w:tmpl w:val="71C383A1"/>
+      <w:tmpl w:val="689002C8"/>
       <w:start w:val="1"/>
       <w:numFmt w:val="lowerRoman"/>
       <w:lvlText w:val="%6."/>
@@ -3948,7 +3701,7 @@
       </w:pPr>
     </w:lvl>
     <w:lvl w:ilvl="6">
-      <w:tmpl w:val="2E827796"/>
+      <w:tmpl w:val="6F4236B8"/>
       <w:start w:val="1"/>
       <w:numFmt w:val="decimal"/>
       <w:lvlText w:val="%7."/>
@@ -3958,7 +3711,7 @@
       </w:pPr>
     </w:lvl>
     <w:lvl w:ilvl="7">
-      <w:tmpl w:val="DA826270"/>
+      <w:tmpl w:val="74F50767"/>
       <w:start w:val="1"/>
       <w:numFmt w:val="lowerLetter"/>
       <w:lvlText w:val="%8."/>
@@ -3968,7 +3721,7 @@
       </w:pPr>
     </w:lvl>
     <w:lvl w:ilvl="8">
-      <w:tmpl w:val="F800EB1A"/>
+      <w:tmpl w:val="E668F4B2"/>
       <w:start w:val="1"/>
       <w:numFmt w:val="lowerRoman"/>
       <w:lvlText w:val="%9."/>
@@ -3981,7 +3734,7 @@
   <w:abstractNum w:abstractNumId="16">
     <w:multiLevelType w:val="hybridMultilevel"/>
     <w:lvl w:ilvl="0">
-      <w:tmpl w:val="10D5D205"/>
+      <w:tmpl w:val="DC4FDD70"/>
       <w:numFmt w:val="bullet"/>
       <w:lvlText w:val=""/>
       <w:rPr>
@@ -3993,7 +3746,7 @@
       </w:pPr>
     </w:lvl>
     <w:lvl w:ilvl="1">
-      <w:tmpl w:val="6E0FA2D8"/>
+      <w:tmpl w:val="EB2F1A6B"/>
       <w:numFmt w:val="bullet"/>
       <w:lvlText w:val="o"/>
       <w:rPr>
@@ -4005,7 +3758,7 @@
       </w:pPr>
     </w:lvl>
     <w:lvl w:ilvl="2">
-      <w:tmpl w:val="49F9C05D"/>
+      <w:tmpl w:val="F585FB58"/>
       <w:numFmt w:val="bullet"/>
       <w:lvlText w:val=""/>
       <w:rPr>
@@ -4017,7 +3770,7 @@
       </w:pPr>
     </w:lvl>
     <w:lvl w:ilvl="3">
-      <w:tmpl w:val="5A0A181C"/>
+      <w:tmpl w:val="379D031D"/>
       <w:numFmt w:val="bullet"/>
       <w:lvlText w:val=""/>
       <w:rPr>
@@ -4029,7 +3782,7 @@
       </w:pPr>
     </w:lvl>
     <w:lvl w:ilvl="4">
-      <w:tmpl w:val="BAE16B86"/>
+      <w:tmpl w:val="EB5FC4CC"/>
       <w:numFmt w:val="bullet"/>
       <w:lvlText w:val="o"/>
       <w:rPr>
@@ -4041,7 +3794,7 @@
       </w:pPr>
     </w:lvl>
     <w:lvl w:ilvl="5">
-      <w:tmpl w:val="55E42603"/>
+      <w:tmpl w:val="6C529835"/>
       <w:numFmt w:val="bullet"/>
       <w:lvlText w:val=""/>
       <w:rPr>
@@ -4053,7 +3806,7 @@
       </w:pPr>
     </w:lvl>
     <w:lvl w:ilvl="6">
-      <w:tmpl w:val="27D52A4E"/>
+      <w:tmpl w:val="0A8CCEFA"/>
       <w:numFmt w:val="bullet"/>
       <w:lvlText w:val=""/>
       <w:rPr>
@@ -4065,7 +3818,7 @@
       </w:pPr>
     </w:lvl>
     <w:lvl w:ilvl="7">
-      <w:tmpl w:val="F1080C7D"/>
+      <w:tmpl w:val="4096C947"/>
       <w:numFmt w:val="bullet"/>
       <w:lvlText w:val="o"/>
       <w:rPr>
@@ -4077,7 +3830,7 @@
       </w:pPr>
     </w:lvl>
     <w:lvl w:ilvl="8">
-      <w:tmpl w:val="D3D97674"/>
+      <w:tmpl w:val="E2E8D40E"/>
       <w:numFmt w:val="bullet"/>
       <w:lvlText w:val=""/>
       <w:rPr>
@@ -4092,7 +3845,7 @@
   <w:abstractNum w:abstractNumId="17">
     <w:multiLevelType w:val="hybridMultilevel"/>
     <w:lvl w:ilvl="0">
-      <w:tmpl w:val="3F13D22C"/>
+      <w:tmpl w:val="2F47D9A4"/>
       <w:start w:val="1"/>
       <w:numFmt w:val="decimal"/>
       <w:lvlText w:val="%1."/>
@@ -4102,7 +3855,7 @@
       </w:pPr>
     </w:lvl>
     <w:lvl w:ilvl="1">
-      <w:tmpl w:val="D658227C"/>
+      <w:tmpl w:val="96FF576F"/>
       <w:start w:val="1"/>
       <w:numFmt w:val="lowerLetter"/>
       <w:lvlText w:val="%2."/>
@@ -4112,7 +3865,7 @@
       </w:pPr>
     </w:lvl>
     <w:lvl w:ilvl="2">
-      <w:tmpl w:val="F8001D95"/>
+      <w:tmpl w:val="30023430"/>
       <w:start w:val="1"/>
       <w:numFmt w:val="lowerRoman"/>
       <w:lvlText w:val="%3."/>
@@ -4122,7 +3875,7 @@
       </w:pPr>
     </w:lvl>
     <w:lvl w:ilvl="3">
-      <w:tmpl w:val="A8FC686F"/>
+      <w:tmpl w:val="ED792C95"/>
       <w:start w:val="1"/>
       <w:numFmt w:val="decimal"/>
       <w:lvlText w:val="%4."/>
@@ -4132,7 +3885,7 @@
       </w:pPr>
     </w:lvl>
     <w:lvl w:ilvl="4">
-      <w:tmpl w:val="69D5C8FF"/>
+      <w:tmpl w:val="BF945D6F"/>
       <w:start w:val="1"/>
       <w:numFmt w:val="lowerLetter"/>
       <w:lvlText w:val="%5."/>
@@ -4142,7 +3895,7 @@
       </w:pPr>
     </w:lvl>
     <w:lvl w:ilvl="5">
-      <w:tmpl w:val="A208DF25"/>
+      <w:tmpl w:val="95CE591E"/>
       <w:start w:val="1"/>
       <w:numFmt w:val="lowerRoman"/>
       <w:lvlText w:val="%6."/>
@@ -4152,7 +3905,7 @@
       </w:pPr>
     </w:lvl>
     <w:lvl w:ilvl="6">
-      <w:tmpl w:val="F1531718"/>
+      <w:tmpl w:val="25CAE245"/>
       <w:start w:val="1"/>
       <w:numFmt w:val="decimal"/>
       <w:lvlText w:val="%7."/>
@@ -4162,7 +3915,7 @@
       </w:pPr>
     </w:lvl>
     <w:lvl w:ilvl="7">
-      <w:tmpl w:val="B5BAA6FE"/>
+      <w:tmpl w:val="0B7FD510"/>
       <w:start w:val="1"/>
       <w:numFmt w:val="lowerLetter"/>
       <w:lvlText w:val="%8."/>
@@ -4172,7 +3925,7 @@
       </w:pPr>
     </w:lvl>
     <w:lvl w:ilvl="8">
-      <w:tmpl w:val="3C1C3B04"/>
+      <w:tmpl w:val="CF05B728"/>
       <w:start w:val="1"/>
       <w:numFmt w:val="lowerRoman"/>
       <w:lvlText w:val="%9."/>
@@ -4185,7 +3938,7 @@
   <w:abstractNum w:abstractNumId="18">
     <w:multiLevelType w:val="hybridMultilevel"/>
     <w:lvl w:ilvl="0">
-      <w:tmpl w:val="8679DC8D"/>
+      <w:tmpl w:val="77255A96"/>
       <w:numFmt w:val="bullet"/>
       <w:lvlText w:val=""/>
       <w:rPr>
@@ -4197,7 +3950,7 @@
       </w:pPr>
     </w:lvl>
     <w:lvl w:ilvl="1">
-      <w:tmpl w:val="7B08D35B"/>
+      <w:tmpl w:val="9EE066B8"/>
       <w:numFmt w:val="bullet"/>
       <w:lvlText w:val="o"/>
       <w:rPr>
@@ -4209,7 +3962,7 @@
       </w:pPr>
     </w:lvl>
     <w:lvl w:ilvl="2">
-      <w:tmpl w:val="989C42DA"/>
+      <w:tmpl w:val="072FFE02"/>
       <w:numFmt w:val="bullet"/>
       <w:lvlText w:val=""/>
       <w:rPr>
@@ -4221,7 +3974,7 @@
       </w:pPr>
     </w:lvl>
     <w:lvl w:ilvl="3">
-      <w:tmpl w:val="39A6974C"/>
+      <w:tmpl w:val="2F30ECBD"/>
       <w:numFmt w:val="bullet"/>
       <w:lvlText w:val=""/>
       <w:rPr>
@@ -4233,7 +3986,7 @@
       </w:pPr>
     </w:lvl>
     <w:lvl w:ilvl="4">
-      <w:tmpl w:val="A00A89F8"/>
+      <w:tmpl w:val="44BC27C4"/>
       <w:numFmt w:val="bullet"/>
       <w:lvlText w:val="o"/>
       <w:rPr>
@@ -4245,7 +3998,7 @@
       </w:pPr>
     </w:lvl>
     <w:lvl w:ilvl="5">
-      <w:tmpl w:val="33CE0FA7"/>
+      <w:tmpl w:val="63873A1B"/>
       <w:numFmt w:val="bullet"/>
       <w:lvlText w:val=""/>
       <w:rPr>
@@ -4257,7 +4010,7 @@
       </w:pPr>
     </w:lvl>
     <w:lvl w:ilvl="6">
-      <w:tmpl w:val="986F44B7"/>
+      <w:tmpl w:val="83E0D9CC"/>
       <w:numFmt w:val="bullet"/>
       <w:lvlText w:val=""/>
       <w:rPr>
@@ -4269,7 +4022,7 @@
       </w:pPr>
     </w:lvl>
     <w:lvl w:ilvl="7">
-      <w:tmpl w:val="C8C4A3C0"/>
+      <w:tmpl w:val="750804BE"/>
       <w:numFmt w:val="bullet"/>
       <w:lvlText w:val="o"/>
       <w:rPr>
@@ -4281,7 +4034,7 @@
       </w:pPr>
     </w:lvl>
     <w:lvl w:ilvl="8">
-      <w:tmpl w:val="C3C93395"/>
+      <w:tmpl w:val="05114169"/>
       <w:numFmt w:val="bullet"/>
       <w:lvlText w:val=""/>
       <w:rPr>
@@ -5933,12 +5686,175 @@
 </file>
 
 <file path=customXml/item1.xml><?xml version="1.0" encoding="utf-8"?>
-<?mso-contentType ?>
-<FormTemplates xmlns="http://schemas.microsoft.com/sharepoint/v3/contenttype/forms">
-  <Display>DocumentLibraryForm</Display>
-  <Edit>DocumentLibraryForm</Edit>
-  <New>DocumentLibraryForm</New>
-</FormTemplates>
+<Sources xmlns:b="http://schemas.openxmlformats.org/officeDocument/2006/bibliography" xmlns="http://schemas.openxmlformats.org/officeDocument/2006/bibliography" SelectedStyle="\HarvardAnglia2008OfficeOnline.xsl" StyleName="Harvard - Anglia" Version="2008">
+  <Source>
+    <Tag>fielding2000</Tag>
+    <SourceType>Book</SourceType>
+    <Guid>{17cfdc38-b417-4826-ac28-be9ea3cada98}</Guid>
+    <LCID>0</LCID>
+    <Title>Architectural Styles and the Design of Network-based Software Architectures</Title>
+    <Year>2000</Year>
+    <City>Irvine</City>
+    <Publisher>University of California</Publisher>
+    <Author>
+      <Author>
+        <NameList>
+          <Person>
+            <Last>Fielding</Last>
+            <First>Roy Thomas</First>
+          </Person>
+        </NameList>
+      </Author>
+    </Author>
+  </Source>
+  <Source>
+    <Tag>humble2010</Tag>
+    <SourceType>Book</SourceType>
+    <Guid>{f588004b-e20c-4c46-9175-cf721d78e976}</Guid>
+    <LCID>0</LCID>
+    <Title>Continuous Delivery</Title>
+    <Year>2010</Year>
+    <City>Boston</City>
+    <Publisher>Addison-Wesley Professional</Publisher>
+    <Edition>1st</Edition>
+    <Author>
+      <Author>
+        <NameList>
+          <Person>
+            <Last>Humble</Last>
+            <First>Jez</First>
+          </Person>
+          <Person>
+            <Last>Farley</Last>
+            <First>David</First>
+          </Person>
+        </NameList>
+      </Author>
+    </Author>
+  </Source>
+  <Source>
+    <Tag>fowler2018</Tag>
+    <SourceType>BookSection</SourceType>
+    <Guid>{fc3ebf26-e33e-4631-930e-db5934e3051f}</Guid>
+    <LCID>0</LCID>
+    <Title>Configuration Patterns</Title>
+    <BookTitle>Refactoring -- Improving the Design of Existing Code</BookTitle>
+    <Year>2018</Year>
+    <Pages>231-256</Pages>
+    <City>Boston</City>
+    <Publisher>Addison-Wesley Professional</Publisher>
+    <Author>
+      <Author>
+        <NameList>
+          <Person>
+            <Last>Fowler</Last>
+            <First>Martin</First>
+          </Person>
+        </NameList>
+      </Author>
+      <Editor>
+        <NameList>
+          <Person>
+            <Last>Fowler</Last>
+            <First>Martin</First>
+          </Person>
+        </NameList>
+      </Editor>
+    </Author>
+  </Source>
+  <Source>
+    <Tag>markdig2024</Tag>
+    <SourceType>InternetSite</SourceType>
+    <Guid>{9c582a3d-d952-4253-8a48-7abf16788ac2}</Guid>
+    <LCID>0</LCID>
+    <InternetSiteTitle>Markdig -- A Fast, Powerful, CommonMark Compliant Markdown Processor</InternetSiteTitle>
+    <YearAccessed>2026</YearAccessed>
+    <MonthAccessed>March</MonthAccessed>
+    <DayAccessed>1</DayAccessed>
+    <URL>https://github.com/xoofx/markdig</URL>
+    <Author>
+      <Author>
+        <NameList>
+          <Person>
+            <Last>Bertels</Last>
+            <First>Alexandre</First>
+          </Person>
+        </NameList>
+      </Author>
+    </Author>
+  </Source>
+  <Source>
+    <Tag>sixlabors2023</Tag>
+    <SourceType>InternetSite</SourceType>
+    <Guid>{8d828ca4-0e59-4170-bff9-ab6434d3ccff}</Guid>
+    <LCID>0</LCID>
+    <InternetSiteTitle>ImageSharp -- A Modern, Cross-Platform, 2D Graphics Library</InternetSiteTitle>
+    <YearAccessed>2026</YearAccessed>
+    <MonthAccessed>March</MonthAccessed>
+    <DayAccessed>1</DayAccessed>
+    <URL>https://sixlabors.com/products/imagesharp</URL>
+  </Source>
+  <Source>
+    <Tag>microsoftOpenXml</Tag>
+    <SourceType>DocumentFromInternetSite</SourceType>
+    <Guid>{e4a47711-d798-4aa3-9f7d-170a9407a9eb}</Guid>
+    <LCID>0</LCID>
+    <InternetSiteTitle>Open XML SDK Documentation</InternetSiteTitle>
+    <Year>2023</Year>
+    <Month>November</Month>
+    <Day>1</Day>
+    <YearAccessed>2026</YearAccessed>
+    <MonthAccessed>March</MonthAccessed>
+    <DayAccessed>1</DayAccessed>
+    <URL>https://learn.microsoft.com/en-us/office/open-xml/open-xml-sdk</URL>
+    <Author>
+      <Author>
+        <NameList>
+          <Person>
+            <Last>Microsoft Corporation</Last>
+          </Person>
+        </NameList>
+      </Author>
+    </Author>
+  </Source>
+  <Source>
+    <Tag>openxmlWebSite2024</Tag>
+    <SourceType>InternetSite</SourceType>
+    <Guid>{90f14bd5-9d53-44dc-84ea-e21367437bbc}</Guid>
+    <LCID>0</LCID>
+    <InternetSiteTitle>ECMA-376 Office Open XML File Formats</InternetSiteTitle>
+    <YearAccessed>2026</YearAccessed>
+    <MonthAccessed>March</MonthAccessed>
+    <DayAccessed>1</DayAccessed>
+    <URL>https://www.ecma-international.org/publications-and-standards/standards/ecma-376</URL>
+  </Source>
+  <Source>
+    <Tag>techWritingCase2019</Tag>
+    <SourceType>JournalArticle</SourceType>
+    <Guid>{71220dc8-053d-42f4-9d6f-38f71f22751b}</Guid>
+    <LCID>0</LCID>
+    <Title>Technological Developments in Document and Information Design</Title>
+    <JournalName>Journal of Technical Writing and Communication</JournalName>
+    <Year>2019</Year>
+    <Pages>3-22</Pages>
+    <Volume>49</Volume>
+    <Issue>1</Issue>
+    <Author>
+      <Author>
+        <NameList>
+          <Person>
+            <Last>Ganier</Last>
+            <First>Franck</First>
+          </Person>
+          <Person>
+            <Last>de Jong</Last>
+            <First>Menno</First>
+          </Person>
+        </NameList>
+      </Author>
+    </Author>
+  </Source>
+</Sources>
 </file>
 
 <file path=customXml/item2.xml><?xml version="1.0" encoding="utf-8"?>
@@ -6124,7 +6040,12 @@
 </file>
 
 <file path=customXml/item3.xml><?xml version="1.0" encoding="utf-8"?>
-<b:Sources xmlns:b="http://schemas.openxmlformats.org/officeDocument/2006/bibliography" xmlns="http://schemas.openxmlformats.org/officeDocument/2006/bibliography" SelectedStyle="\HarvardAnglia2008OfficeOnline.xsl" StyleName="Harvard - Anglia" Version="2008"/>
+<?mso-contentType ?>
+<FormTemplates xmlns="http://schemas.microsoft.com/sharepoint/v3/contenttype/forms">
+  <Display>DocumentLibraryForm</Display>
+  <Edit>DocumentLibraryForm</Edit>
+  <New>DocumentLibraryForm</New>
+</FormTemplates>
 </file>
 
 <file path=customXml/item4.xml><?xml version="1.0" encoding="utf-8"?>
@@ -6136,9 +6057,9 @@
 </file>
 
 <file path=customXml/itemProps1.xml><?xml version="1.0" encoding="utf-8"?>
-<ds:datastoreItem xmlns:ds="http://schemas.openxmlformats.org/officeDocument/2006/customXml" ds:itemID="{D563FAF1-25D1-4364-A7C3-653252437014}">
+<ds:datastoreItem xmlns:ds="http://schemas.openxmlformats.org/officeDocument/2006/customXml" ds:itemID="{F87ADE8A-7433-4DFD-BD1C-461D522E64B8}">
   <ds:schemaRefs>
-    <ds:schemaRef ds:uri="http://schemas.microsoft.com/sharepoint/v3/contenttype/forms"/>
+    <ds:schemaRef ds:uri="http://schemas.openxmlformats.org/officeDocument/2006/bibliography"/>
   </ds:schemaRefs>
 </ds:datastoreItem>
 </file>
@@ -6162,9 +6083,9 @@
 </file>
 
 <file path=customXml/itemProps3.xml><?xml version="1.0" encoding="utf-8"?>
-<ds:datastoreItem xmlns:ds="http://schemas.openxmlformats.org/officeDocument/2006/customXml" ds:itemID="{F87ADE8A-7433-4DFD-BD1C-461D522E64B8}">
+<ds:datastoreItem xmlns:ds="http://schemas.openxmlformats.org/officeDocument/2006/customXml" ds:itemID="{D563FAF1-25D1-4364-A7C3-653252437014}">
   <ds:schemaRefs>
-    <ds:schemaRef ds:uri="http://schemas.openxmlformats.org/officeDocument/2006/bibliography"/>
+    <ds:schemaRef ds:uri="http://schemas.microsoft.com/sharepoint/v3/contenttype/forms"/>
   </ds:schemaRefs>
 </ds:datastoreItem>
 </file>
@@ -6172,15 +6093,9 @@
 <file path=customXml/itemProps4.xml><?xml version="1.0" encoding="utf-8"?>
 <ds:datastoreItem xmlns:ds="http://schemas.openxmlformats.org/officeDocument/2006/customXml" ds:itemID="{9CA3B924-3DC0-41EE-AC41-317A90F10772}">
   <ds:schemaRefs>
-    <ds:schemaRef ds:uri="http://purl.org/dc/elements/1.1/"/>
+    <ds:schemaRef ds:uri="http://schemas.microsoft.com/office/2006/metadata/properties"/>
+    <ds:schemaRef ds:uri="http://schemas.microsoft.com/office/infopath/2007/PartnerControls"/>
     <ds:schemaRef ds:uri="57c0d702-c152-4b86-8b69-4b6a17c0e79a"/>
-    <ds:schemaRef ds:uri="http://www.w3.org/XML/1998/namespace"/>
-    <ds:schemaRef ds:uri="http://purl.org/dc/dcmitype/"/>
-    <ds:schemaRef ds:uri="http://schemas.microsoft.com/office/2006/documentManagement/types"/>
-    <ds:schemaRef ds:uri="http://schemas.openxmlformats.org/package/2006/metadata/core-properties"/>
-    <ds:schemaRef ds:uri="http://schemas.microsoft.com/office/infopath/2007/PartnerControls"/>
-    <ds:schemaRef ds:uri="http://schemas.microsoft.com/office/2006/metadata/properties"/>
-    <ds:schemaRef ds:uri="http://purl.org/dc/terms/"/>
   </ds:schemaRefs>
 </ds:datastoreItem>
 </file>
</xml_diff>

<commit_message>
Add support for formatted code blocks with inline styling options
</commit_message>
<xml_diff>
--- a/sample/output.docx
+++ b/sample/output.docx
@@ -861,7 +861,7 @@
           <wp:inline distT="0" distB="0" distL="0" distR="0">
             <wp:extent cx="2857500" cy="2857500"/>
             <wp:effectExtent l="0" t="0" r="0" b="0"/>
-            <wp:docPr id="1941850628" name="Picture 1941850628"/>
+            <wp:docPr id="2067402145" name="Picture 2067402145"/>
             <wp:cNvGraphicFramePr>
               <a:graphicFrameLocks xmlns:a="http://schemas.openxmlformats.org/drawingml/2006/main" noChangeAspect="1"/>
             </wp:cNvGraphicFramePr>
@@ -869,11 +869,11 @@
               <a:graphicData uri="http://schemas.openxmlformats.org/drawingml/2006/picture">
                 <pic:pic xmlns:pic="http://schemas.openxmlformats.org/drawingml/2006/picture">
                   <pic:nvPicPr>
-                    <pic:cNvPr id="1941850654" name="placeholder-500.png"/>
+                    <pic:cNvPr id="2067402174" name="placeholder-500.png"/>
                     <pic:cNvPicPr/>
                   </pic:nvPicPr>
                   <pic:blipFill>
-                    <a:blip r:embed="R34da34e8c8954f70"/>
+                    <a:blip r:embed="R148dc1755a2c4883"/>
                     <a:stretch>
                       <a:fillRect/>
                     </a:stretch>
@@ -938,7 +938,7 @@
           <wp:inline distT="0" distB="0" distL="0" distR="0">
             <wp:extent cx="3810000" cy="2857500"/>
             <wp:effectExtent l="0" t="0" r="0" b="0"/>
-            <wp:docPr id="1942383342" name="Picture 1942383342"/>
+            <wp:docPr id="2067925208" name="Picture 2067925208"/>
             <wp:cNvGraphicFramePr>
               <a:graphicFrameLocks xmlns:a="http://schemas.openxmlformats.org/drawingml/2006/main" noChangeAspect="1"/>
             </wp:cNvGraphicFramePr>
@@ -946,11 +946,11 @@
               <a:graphicData uri="http://schemas.openxmlformats.org/drawingml/2006/picture">
                 <pic:pic xmlns:pic="http://schemas.openxmlformats.org/drawingml/2006/picture">
                   <pic:nvPicPr>
-                    <pic:cNvPr id="1942383345" name="placeholder-400-300.png"/>
+                    <pic:cNvPr id="2067925211" name="placeholder-400-300.png"/>
                     <pic:cNvPicPr/>
                   </pic:nvPicPr>
                   <pic:blipFill>
-                    <a:blip r:embed="R86e63d85e6e748f8"/>
+                    <a:blip r:embed="Re5966bc4bdee4796"/>
                     <a:stretch>
                       <a:fillRect/>
                     </a:stretch>
@@ -1377,7 +1377,7 @@
           <wp:inline distT="0" distB="0" distL="0" distR="0">
             <wp:extent cx="3810000" cy="3810000"/>
             <wp:effectExtent l="0" t="0" r="0" b="0"/>
-            <wp:docPr id="1942397508" name="Picture 1942397508"/>
+            <wp:docPr id="2067938277" name="Picture 2067938277"/>
             <wp:cNvGraphicFramePr>
               <a:graphicFrameLocks xmlns:a="http://schemas.openxmlformats.org/drawingml/2006/main" noChangeAspect="1"/>
             </wp:cNvGraphicFramePr>
@@ -1385,11 +1385,11 @@
               <a:graphicData uri="http://schemas.openxmlformats.org/drawingml/2006/picture">
                 <pic:pic xmlns:pic="http://schemas.openxmlformats.org/drawingml/2006/picture">
                   <pic:nvPicPr>
-                    <pic:cNvPr id="1942397512" name="placeholder-500.png"/>
+                    <pic:cNvPr id="2067938281" name="placeholder-500.png"/>
                     <pic:cNvPicPr/>
                   </pic:nvPicPr>
                   <pic:blipFill>
-                    <a:blip r:embed="R7f75ffd7c9d74e5a"/>
+                    <a:blip r:embed="R018f75af042e4fd3"/>
                     <a:stretch>
                       <a:fillRect/>
                     </a:stretch>
@@ -1746,6 +1746,52 @@
     </w:p>
     <w:p>
       <w:pPr>
+        <w:pStyle w:val="Heading4"/>
+      </w:pPr>
+      <w:r>
+        <w:t xml:space="preserve">Codeblock With Formatting</w:t>
+      </w:r>
+    </w:p>
+    <w:p>
+      <w:pPr>
+        <w:pStyle w:val="Code4"/>
+      </w:pPr>
+      <w:r>
+        <w:t xml:space="preserve">This is </w:t>
+      </w:r>
+      <w:r>
+        <w:rPr>
+          <w:b/>
+        </w:rPr>
+        <w:t xml:space="preserve">bold</w:t>
+      </w:r>
+      <w:r>
+        <w:t xml:space="preserve"> and </w:t>
+      </w:r>
+      <w:r>
+        <w:rPr>
+          <w:i/>
+        </w:rPr>
+        <w:t xml:space="preserve">italic</w:t>
+      </w:r>
+      <w:r>
+        <w:t xml:space="preserve">, but </w:t>
+      </w:r>
+      <w:r>
+        <w:t xml:space="preserve">~~</w:t>
+      </w:r>
+      <w:r>
+        <w:t xml:space="preserve">this</w:t>
+      </w:r>
+      <w:r>
+        <w:t xml:space="preserve">~~</w:t>
+      </w:r>
+      <w:r>
+        <w:t xml:space="preserve"> is not struck through.</w:t>
+      </w:r>
+    </w:p>
+    <w:p>
+      <w:pPr>
         <w:pStyle w:val="Body4"/>
       </w:pPr>
       <w:r>
@@ -2603,7 +2649,7 @@
   <w:abstractNum w:abstractNumId="5">
     <w:multiLevelType w:val="hybridMultilevel"/>
     <w:lvl w:ilvl="0">
-      <w:tmpl w:val="415DAAB0"/>
+      <w:tmpl w:val="FFC59036"/>
       <w:numFmt w:val="bullet"/>
       <w:lvlText w:val=""/>
       <w:rPr>
@@ -2615,7 +2661,7 @@
       </w:pPr>
     </w:lvl>
     <w:lvl w:ilvl="1">
-      <w:tmpl w:val="898454EA"/>
+      <w:tmpl w:val="FFDD88BA"/>
       <w:numFmt w:val="bullet"/>
       <w:lvlText w:val="o"/>
       <w:rPr>
@@ -2627,7 +2673,7 @@
       </w:pPr>
     </w:lvl>
     <w:lvl w:ilvl="2">
-      <w:tmpl w:val="BF6DA22C"/>
+      <w:tmpl w:val="338EE10F"/>
       <w:numFmt w:val="bullet"/>
       <w:lvlText w:val=""/>
       <w:rPr>
@@ -2639,7 +2685,7 @@
       </w:pPr>
     </w:lvl>
     <w:lvl w:ilvl="3">
-      <w:tmpl w:val="22D699C8"/>
+      <w:tmpl w:val="03FA1628"/>
       <w:numFmt w:val="bullet"/>
       <w:lvlText w:val=""/>
       <w:rPr>
@@ -2651,7 +2697,7 @@
       </w:pPr>
     </w:lvl>
     <w:lvl w:ilvl="4">
-      <w:tmpl w:val="4FBF5011"/>
+      <w:tmpl w:val="2C309A98"/>
       <w:numFmt w:val="bullet"/>
       <w:lvlText w:val="o"/>
       <w:rPr>
@@ -2663,7 +2709,7 @@
       </w:pPr>
     </w:lvl>
     <w:lvl w:ilvl="5">
-      <w:tmpl w:val="339EA900"/>
+      <w:tmpl w:val="79DA8A3E"/>
       <w:numFmt w:val="bullet"/>
       <w:lvlText w:val=""/>
       <w:rPr>
@@ -2675,7 +2721,7 @@
       </w:pPr>
     </w:lvl>
     <w:lvl w:ilvl="6">
-      <w:tmpl w:val="F7B9538E"/>
+      <w:tmpl w:val="61A13AEA"/>
       <w:numFmt w:val="bullet"/>
       <w:lvlText w:val=""/>
       <w:rPr>
@@ -2687,7 +2733,7 @@
       </w:pPr>
     </w:lvl>
     <w:lvl w:ilvl="7">
-      <w:tmpl w:val="F65AB274"/>
+      <w:tmpl w:val="3E871292"/>
       <w:numFmt w:val="bullet"/>
       <w:lvlText w:val="o"/>
       <w:rPr>
@@ -2699,7 +2745,7 @@
       </w:pPr>
     </w:lvl>
     <w:lvl w:ilvl="8">
-      <w:tmpl w:val="B709CCA6"/>
+      <w:tmpl w:val="3A5D5D9A"/>
       <w:numFmt w:val="bullet"/>
       <w:lvlText w:val=""/>
       <w:rPr>
@@ -2714,7 +2760,7 @@
   <w:abstractNum w:abstractNumId="6">
     <w:multiLevelType w:val="hybridMultilevel"/>
     <w:lvl w:ilvl="0">
-      <w:tmpl w:val="64012012"/>
+      <w:tmpl w:val="36C7B255"/>
       <w:start w:val="1"/>
       <w:numFmt w:val="decimal"/>
       <w:lvlText w:val="%1."/>
@@ -2724,7 +2770,7 @@
       </w:pPr>
     </w:lvl>
     <w:lvl w:ilvl="1">
-      <w:tmpl w:val="805C15F0"/>
+      <w:tmpl w:val="4ADA7780"/>
       <w:start w:val="1"/>
       <w:numFmt w:val="lowerLetter"/>
       <w:lvlText w:val="%2."/>
@@ -2734,7 +2780,7 @@
       </w:pPr>
     </w:lvl>
     <w:lvl w:ilvl="2">
-      <w:tmpl w:val="9F8A6F37"/>
+      <w:tmpl w:val="AB755074"/>
       <w:start w:val="1"/>
       <w:numFmt w:val="lowerRoman"/>
       <w:lvlText w:val="%3."/>
@@ -2744,7 +2790,7 @@
       </w:pPr>
     </w:lvl>
     <w:lvl w:ilvl="3">
-      <w:tmpl w:val="44E4A159"/>
+      <w:tmpl w:val="518D9890"/>
       <w:start w:val="1"/>
       <w:numFmt w:val="decimal"/>
       <w:lvlText w:val="%4."/>
@@ -2754,7 +2800,7 @@
       </w:pPr>
     </w:lvl>
     <w:lvl w:ilvl="4">
-      <w:tmpl w:val="6D4ACA9A"/>
+      <w:tmpl w:val="F231D386"/>
       <w:start w:val="1"/>
       <w:numFmt w:val="lowerLetter"/>
       <w:lvlText w:val="%5."/>
@@ -2764,7 +2810,7 @@
       </w:pPr>
     </w:lvl>
     <w:lvl w:ilvl="5">
-      <w:tmpl w:val="74C59E97"/>
+      <w:tmpl w:val="9389C7AC"/>
       <w:start w:val="1"/>
       <w:numFmt w:val="lowerRoman"/>
       <w:lvlText w:val="%6."/>
@@ -2774,7 +2820,7 @@
       </w:pPr>
     </w:lvl>
     <w:lvl w:ilvl="6">
-      <w:tmpl w:val="D29B210D"/>
+      <w:tmpl w:val="122F936B"/>
       <w:start w:val="1"/>
       <w:numFmt w:val="decimal"/>
       <w:lvlText w:val="%7."/>
@@ -2784,7 +2830,7 @@
       </w:pPr>
     </w:lvl>
     <w:lvl w:ilvl="7">
-      <w:tmpl w:val="C089D73C"/>
+      <w:tmpl w:val="AFBE1935"/>
       <w:start w:val="1"/>
       <w:numFmt w:val="lowerLetter"/>
       <w:lvlText w:val="%8."/>
@@ -2794,7 +2840,7 @@
       </w:pPr>
     </w:lvl>
     <w:lvl w:ilvl="8">
-      <w:tmpl w:val="14627979"/>
+      <w:tmpl w:val="AAC8948F"/>
       <w:start w:val="1"/>
       <w:numFmt w:val="lowerRoman"/>
       <w:lvlText w:val="%9."/>
@@ -2807,7 +2853,7 @@
   <w:abstractNum w:abstractNumId="7">
     <w:multiLevelType w:val="hybridMultilevel"/>
     <w:lvl w:ilvl="0">
-      <w:tmpl w:val="0BC4FEAD"/>
+      <w:tmpl w:val="CFF85651"/>
       <w:numFmt w:val="bullet"/>
       <w:lvlText w:val=""/>
       <w:rPr>
@@ -2819,7 +2865,7 @@
       </w:pPr>
     </w:lvl>
     <w:lvl w:ilvl="1">
-      <w:tmpl w:val="12054741"/>
+      <w:tmpl w:val="338A5293"/>
       <w:numFmt w:val="bullet"/>
       <w:lvlText w:val="o"/>
       <w:rPr>
@@ -2831,7 +2877,7 @@
       </w:pPr>
     </w:lvl>
     <w:lvl w:ilvl="2">
-      <w:tmpl w:val="A7471226"/>
+      <w:tmpl w:val="D3E4ECD9"/>
       <w:numFmt w:val="bullet"/>
       <w:lvlText w:val=""/>
       <w:rPr>
@@ -2843,7 +2889,7 @@
       </w:pPr>
     </w:lvl>
     <w:lvl w:ilvl="3">
-      <w:tmpl w:val="DBFFCB85"/>
+      <w:tmpl w:val="47F96F4B"/>
       <w:numFmt w:val="bullet"/>
       <w:lvlText w:val=""/>
       <w:rPr>
@@ -2855,7 +2901,7 @@
       </w:pPr>
     </w:lvl>
     <w:lvl w:ilvl="4">
-      <w:tmpl w:val="569192F9"/>
+      <w:tmpl w:val="8454F88A"/>
       <w:numFmt w:val="bullet"/>
       <w:lvlText w:val="o"/>
       <w:rPr>
@@ -2867,7 +2913,7 @@
       </w:pPr>
     </w:lvl>
     <w:lvl w:ilvl="5">
-      <w:tmpl w:val="4BBED378"/>
+      <w:tmpl w:val="75417603"/>
       <w:numFmt w:val="bullet"/>
       <w:lvlText w:val=""/>
       <w:rPr>
@@ -2879,7 +2925,7 @@
       </w:pPr>
     </w:lvl>
     <w:lvl w:ilvl="6">
-      <w:tmpl w:val="149C0E87"/>
+      <w:tmpl w:val="D95B7422"/>
       <w:numFmt w:val="bullet"/>
       <w:lvlText w:val=""/>
       <w:rPr>
@@ -2891,7 +2937,7 @@
       </w:pPr>
     </w:lvl>
     <w:lvl w:ilvl="7">
-      <w:tmpl w:val="4C556FA4"/>
+      <w:tmpl w:val="BE059BD3"/>
       <w:numFmt w:val="bullet"/>
       <w:lvlText w:val="o"/>
       <w:rPr>
@@ -2903,7 +2949,7 @@
       </w:pPr>
     </w:lvl>
     <w:lvl w:ilvl="8">
-      <w:tmpl w:val="82DB02D0"/>
+      <w:tmpl w:val="39FB4C90"/>
       <w:numFmt w:val="bullet"/>
       <w:lvlText w:val=""/>
       <w:rPr>
@@ -2918,7 +2964,7 @@
   <w:abstractNum w:abstractNumId="8">
     <w:multiLevelType w:val="hybridMultilevel"/>
     <w:lvl w:ilvl="0">
-      <w:tmpl w:val="B58B6B39"/>
+      <w:tmpl w:val="F251C032"/>
       <w:start w:val="1"/>
       <w:numFmt w:val="decimal"/>
       <w:lvlText w:val="%1."/>
@@ -2928,7 +2974,7 @@
       </w:pPr>
     </w:lvl>
     <w:lvl w:ilvl="1">
-      <w:tmpl w:val="4E408C21"/>
+      <w:tmpl w:val="9DCF4EC6"/>
       <w:start w:val="1"/>
       <w:numFmt w:val="lowerLetter"/>
       <w:lvlText w:val="%2."/>
@@ -2938,7 +2984,7 @@
       </w:pPr>
     </w:lvl>
     <w:lvl w:ilvl="2">
-      <w:tmpl w:val="B1D4F396"/>
+      <w:tmpl w:val="E0B0FA8D"/>
       <w:start w:val="1"/>
       <w:numFmt w:val="lowerRoman"/>
       <w:lvlText w:val="%3."/>
@@ -2948,7 +2994,7 @@
       </w:pPr>
     </w:lvl>
     <w:lvl w:ilvl="3">
-      <w:tmpl w:val="3705B45B"/>
+      <w:tmpl w:val="C6759DB6"/>
       <w:start w:val="1"/>
       <w:numFmt w:val="decimal"/>
       <w:lvlText w:val="%4."/>
@@ -2958,7 +3004,7 @@
       </w:pPr>
     </w:lvl>
     <w:lvl w:ilvl="4">
-      <w:tmpl w:val="1204AD27"/>
+      <w:tmpl w:val="62BD8ACF"/>
       <w:start w:val="1"/>
       <w:numFmt w:val="lowerLetter"/>
       <w:lvlText w:val="%5."/>
@@ -2968,7 +3014,7 @@
       </w:pPr>
     </w:lvl>
     <w:lvl w:ilvl="5">
-      <w:tmpl w:val="612819B2"/>
+      <w:tmpl w:val="D8C71ADB"/>
       <w:start w:val="1"/>
       <w:numFmt w:val="lowerRoman"/>
       <w:lvlText w:val="%6."/>
@@ -2978,7 +3024,7 @@
       </w:pPr>
     </w:lvl>
     <w:lvl w:ilvl="6">
-      <w:tmpl w:val="7A8DE3F5"/>
+      <w:tmpl w:val="757B536F"/>
       <w:start w:val="1"/>
       <w:numFmt w:val="decimal"/>
       <w:lvlText w:val="%7."/>
@@ -2988,7 +3034,7 @@
       </w:pPr>
     </w:lvl>
     <w:lvl w:ilvl="7">
-      <w:tmpl w:val="2D2B3346"/>
+      <w:tmpl w:val="DF164786"/>
       <w:start w:val="1"/>
       <w:numFmt w:val="lowerLetter"/>
       <w:lvlText w:val="%8."/>
@@ -2998,7 +3044,7 @@
       </w:pPr>
     </w:lvl>
     <w:lvl w:ilvl="8">
-      <w:tmpl w:val="975746F5"/>
+      <w:tmpl w:val="79CD0F5E"/>
       <w:start w:val="1"/>
       <w:numFmt w:val="lowerRoman"/>
       <w:lvlText w:val="%9."/>
@@ -3011,7 +3057,7 @@
   <w:abstractNum w:abstractNumId="9">
     <w:multiLevelType w:val="hybridMultilevel"/>
     <w:lvl w:ilvl="0">
-      <w:tmpl w:val="8816EB75"/>
+      <w:tmpl w:val="F6053A6D"/>
       <w:numFmt w:val="bullet"/>
       <w:lvlText w:val=""/>
       <w:rPr>
@@ -3023,7 +3069,7 @@
       </w:pPr>
     </w:lvl>
     <w:lvl w:ilvl="1">
-      <w:tmpl w:val="B4D53873"/>
+      <w:tmpl w:val="492D5E42"/>
       <w:numFmt w:val="bullet"/>
       <w:lvlText w:val="o"/>
       <w:rPr>
@@ -3035,7 +3081,7 @@
       </w:pPr>
     </w:lvl>
     <w:lvl w:ilvl="2">
-      <w:tmpl w:val="0BDD08BD"/>
+      <w:tmpl w:val="7EAD9726"/>
       <w:numFmt w:val="bullet"/>
       <w:lvlText w:val=""/>
       <w:rPr>
@@ -3047,7 +3093,7 @@
       </w:pPr>
     </w:lvl>
     <w:lvl w:ilvl="3">
-      <w:tmpl w:val="CD55BDC6"/>
+      <w:tmpl w:val="F43DD6B2"/>
       <w:numFmt w:val="bullet"/>
       <w:lvlText w:val=""/>
       <w:rPr>
@@ -3059,7 +3105,7 @@
       </w:pPr>
     </w:lvl>
     <w:lvl w:ilvl="4">
-      <w:tmpl w:val="E3BB2A7C"/>
+      <w:tmpl w:val="FB333CEF"/>
       <w:numFmt w:val="bullet"/>
       <w:lvlText w:val="o"/>
       <w:rPr>
@@ -3071,7 +3117,7 @@
       </w:pPr>
     </w:lvl>
     <w:lvl w:ilvl="5">
-      <w:tmpl w:val="3219D582"/>
+      <w:tmpl w:val="E7867031"/>
       <w:numFmt w:val="bullet"/>
       <w:lvlText w:val=""/>
       <w:rPr>
@@ -3083,7 +3129,7 @@
       </w:pPr>
     </w:lvl>
     <w:lvl w:ilvl="6">
-      <w:tmpl w:val="ED163CEE"/>
+      <w:tmpl w:val="82653974"/>
       <w:numFmt w:val="bullet"/>
       <w:lvlText w:val=""/>
       <w:rPr>
@@ -3095,7 +3141,7 @@
       </w:pPr>
     </w:lvl>
     <w:lvl w:ilvl="7">
-      <w:tmpl w:val="E7B999CA"/>
+      <w:tmpl w:val="6B8372E2"/>
       <w:numFmt w:val="bullet"/>
       <w:lvlText w:val="o"/>
       <w:rPr>
@@ -3107,7 +3153,7 @@
       </w:pPr>
     </w:lvl>
     <w:lvl w:ilvl="8">
-      <w:tmpl w:val="EEA97F8E"/>
+      <w:tmpl w:val="E2234832"/>
       <w:numFmt w:val="bullet"/>
       <w:lvlText w:val=""/>
       <w:rPr>
@@ -3122,7 +3168,7 @@
   <w:abstractNum w:abstractNumId="10">
     <w:multiLevelType w:val="hybridMultilevel"/>
     <w:lvl w:ilvl="0">
-      <w:tmpl w:val="89BC1367"/>
+      <w:tmpl w:val="B0270459"/>
       <w:start w:val="1"/>
       <w:numFmt w:val="decimal"/>
       <w:lvlText w:val="%1."/>
@@ -3132,7 +3178,7 @@
       </w:pPr>
     </w:lvl>
     <w:lvl w:ilvl="1">
-      <w:tmpl w:val="4C690154"/>
+      <w:tmpl w:val="83AA0F8D"/>
       <w:start w:val="1"/>
       <w:numFmt w:val="lowerLetter"/>
       <w:lvlText w:val="%2."/>
@@ -3142,7 +3188,7 @@
       </w:pPr>
     </w:lvl>
     <w:lvl w:ilvl="2">
-      <w:tmpl w:val="560FC19E"/>
+      <w:tmpl w:val="1670A338"/>
       <w:start w:val="1"/>
       <w:numFmt w:val="lowerRoman"/>
       <w:lvlText w:val="%3."/>
@@ -3152,7 +3198,7 @@
       </w:pPr>
     </w:lvl>
     <w:lvl w:ilvl="3">
-      <w:tmpl w:val="84D0D860"/>
+      <w:tmpl w:val="E2F96100"/>
       <w:start w:val="1"/>
       <w:numFmt w:val="decimal"/>
       <w:lvlText w:val="%4."/>
@@ -3162,7 +3208,7 @@
       </w:pPr>
     </w:lvl>
     <w:lvl w:ilvl="4">
-      <w:tmpl w:val="85D0D96E"/>
+      <w:tmpl w:val="1FAB14FB"/>
       <w:start w:val="1"/>
       <w:numFmt w:val="lowerLetter"/>
       <w:lvlText w:val="%5."/>
@@ -3172,7 +3218,7 @@
       </w:pPr>
     </w:lvl>
     <w:lvl w:ilvl="5">
-      <w:tmpl w:val="BF3EDD08"/>
+      <w:tmpl w:val="6A24A543"/>
       <w:start w:val="1"/>
       <w:numFmt w:val="lowerRoman"/>
       <w:lvlText w:val="%6."/>
@@ -3182,7 +3228,7 @@
       </w:pPr>
     </w:lvl>
     <w:lvl w:ilvl="6">
-      <w:tmpl w:val="2913081B"/>
+      <w:tmpl w:val="74964711"/>
       <w:start w:val="1"/>
       <w:numFmt w:val="decimal"/>
       <w:lvlText w:val="%7."/>
@@ -3192,7 +3238,7 @@
       </w:pPr>
     </w:lvl>
     <w:lvl w:ilvl="7">
-      <w:tmpl w:val="51343EF4"/>
+      <w:tmpl w:val="CEF61A9C"/>
       <w:start w:val="1"/>
       <w:numFmt w:val="lowerLetter"/>
       <w:lvlText w:val="%8."/>
@@ -3202,7 +3248,7 @@
       </w:pPr>
     </w:lvl>
     <w:lvl w:ilvl="8">
-      <w:tmpl w:val="18E21B1A"/>
+      <w:tmpl w:val="DB8473D6"/>
       <w:start w:val="1"/>
       <w:numFmt w:val="lowerRoman"/>
       <w:lvlText w:val="%9."/>
@@ -3215,7 +3261,7 @@
   <w:abstractNum w:abstractNumId="11">
     <w:multiLevelType w:val="hybridMultilevel"/>
     <w:lvl w:ilvl="0">
-      <w:tmpl w:val="3BBFFF02"/>
+      <w:tmpl w:val="5068F321"/>
       <w:numFmt w:val="bullet"/>
       <w:lvlText w:val=""/>
       <w:rPr>
@@ -3227,7 +3273,7 @@
       </w:pPr>
     </w:lvl>
     <w:lvl w:ilvl="1">
-      <w:tmpl w:val="6ECF714D"/>
+      <w:tmpl w:val="3D9A9D26"/>
       <w:numFmt w:val="bullet"/>
       <w:lvlText w:val="o"/>
       <w:rPr>
@@ -3239,7 +3285,7 @@
       </w:pPr>
     </w:lvl>
     <w:lvl w:ilvl="2">
-      <w:tmpl w:val="83F2D7C2"/>
+      <w:tmpl w:val="C7AEA791"/>
       <w:numFmt w:val="bullet"/>
       <w:lvlText w:val=""/>
       <w:rPr>
@@ -3251,7 +3297,7 @@
       </w:pPr>
     </w:lvl>
     <w:lvl w:ilvl="3">
-      <w:tmpl w:val="A34027BC"/>
+      <w:tmpl w:val="6975A61A"/>
       <w:numFmt w:val="bullet"/>
       <w:lvlText w:val=""/>
       <w:rPr>
@@ -3263,7 +3309,7 @@
       </w:pPr>
     </w:lvl>
     <w:lvl w:ilvl="4">
-      <w:tmpl w:val="EF4304C0"/>
+      <w:tmpl w:val="69DB7C31"/>
       <w:numFmt w:val="bullet"/>
       <w:lvlText w:val="o"/>
       <w:rPr>
@@ -3275,7 +3321,7 @@
       </w:pPr>
     </w:lvl>
     <w:lvl w:ilvl="5">
-      <w:tmpl w:val="8515DAEA"/>
+      <w:tmpl w:val="21081EC3"/>
       <w:numFmt w:val="bullet"/>
       <w:lvlText w:val=""/>
       <w:rPr>
@@ -3287,7 +3333,7 @@
       </w:pPr>
     </w:lvl>
     <w:lvl w:ilvl="6">
-      <w:tmpl w:val="A554715F"/>
+      <w:tmpl w:val="29EFB8CB"/>
       <w:numFmt w:val="bullet"/>
       <w:lvlText w:val=""/>
       <w:rPr>
@@ -3299,7 +3345,7 @@
       </w:pPr>
     </w:lvl>
     <w:lvl w:ilvl="7">
-      <w:tmpl w:val="8AFF5D3F"/>
+      <w:tmpl w:val="7F9E71F6"/>
       <w:numFmt w:val="bullet"/>
       <w:lvlText w:val="o"/>
       <w:rPr>
@@ -3311,7 +3357,7 @@
       </w:pPr>
     </w:lvl>
     <w:lvl w:ilvl="8">
-      <w:tmpl w:val="F3FD98A6"/>
+      <w:tmpl w:val="26433D36"/>
       <w:numFmt w:val="bullet"/>
       <w:lvlText w:val=""/>
       <w:rPr>
@@ -3326,7 +3372,7 @@
   <w:abstractNum w:abstractNumId="12">
     <w:multiLevelType w:val="hybridMultilevel"/>
     <w:lvl w:ilvl="0">
-      <w:tmpl w:val="78D20BC9"/>
+      <w:tmpl w:val="44FF1FD8"/>
       <w:start w:val="1"/>
       <w:numFmt w:val="decimal"/>
       <w:lvlText w:val="%1."/>
@@ -3336,7 +3382,7 @@
       </w:pPr>
     </w:lvl>
     <w:lvl w:ilvl="1">
-      <w:tmpl w:val="EA7540EB"/>
+      <w:tmpl w:val="F5DB356E"/>
       <w:start w:val="1"/>
       <w:numFmt w:val="lowerLetter"/>
       <w:lvlText w:val="%2."/>
@@ -3346,7 +3392,7 @@
       </w:pPr>
     </w:lvl>
     <w:lvl w:ilvl="2">
-      <w:tmpl w:val="F7257D24"/>
+      <w:tmpl w:val="26981617"/>
       <w:start w:val="1"/>
       <w:numFmt w:val="lowerRoman"/>
       <w:lvlText w:val="%3."/>
@@ -3356,7 +3402,7 @@
       </w:pPr>
     </w:lvl>
     <w:lvl w:ilvl="3">
-      <w:tmpl w:val="8EFC8A9C"/>
+      <w:tmpl w:val="25EC7B61"/>
       <w:start w:val="1"/>
       <w:numFmt w:val="decimal"/>
       <w:lvlText w:val="%4."/>
@@ -3366,7 +3412,7 @@
       </w:pPr>
     </w:lvl>
     <w:lvl w:ilvl="4">
-      <w:tmpl w:val="E98A9FF8"/>
+      <w:tmpl w:val="5FFCF9DD"/>
       <w:start w:val="1"/>
       <w:numFmt w:val="lowerLetter"/>
       <w:lvlText w:val="%5."/>
@@ -3376,7 +3422,7 @@
       </w:pPr>
     </w:lvl>
     <w:lvl w:ilvl="5">
-      <w:tmpl w:val="1625A25E"/>
+      <w:tmpl w:val="2F152449"/>
       <w:start w:val="1"/>
       <w:numFmt w:val="lowerRoman"/>
       <w:lvlText w:val="%6."/>
@@ -3386,7 +3432,7 @@
       </w:pPr>
     </w:lvl>
     <w:lvl w:ilvl="6">
-      <w:tmpl w:val="1FE71BAB"/>
+      <w:tmpl w:val="4D3D1337"/>
       <w:start w:val="1"/>
       <w:numFmt w:val="decimal"/>
       <w:lvlText w:val="%7."/>
@@ -3396,7 +3442,7 @@
       </w:pPr>
     </w:lvl>
     <w:lvl w:ilvl="7">
-      <w:tmpl w:val="B5C08981"/>
+      <w:tmpl w:val="6FF76EBB"/>
       <w:start w:val="1"/>
       <w:numFmt w:val="lowerLetter"/>
       <w:lvlText w:val="%8."/>
@@ -3406,7 +3452,7 @@
       </w:pPr>
     </w:lvl>
     <w:lvl w:ilvl="8">
-      <w:tmpl w:val="7684168F"/>
+      <w:tmpl w:val="E32562BF"/>
       <w:start w:val="1"/>
       <w:numFmt w:val="lowerRoman"/>
       <w:lvlText w:val="%9."/>
@@ -3419,7 +3465,7 @@
   <w:abstractNum w:abstractNumId="13">
     <w:multiLevelType w:val="hybridMultilevel"/>
     <w:lvl w:ilvl="0">
-      <w:tmpl w:val="0C7D11CB"/>
+      <w:tmpl w:val="0B2DCFE2"/>
       <w:numFmt w:val="bullet"/>
       <w:lvlText w:val=""/>
       <w:rPr>
@@ -3431,7 +3477,7 @@
       </w:pPr>
     </w:lvl>
     <w:lvl w:ilvl="1">
-      <w:tmpl w:val="D93F485B"/>
+      <w:tmpl w:val="F1358F1C"/>
       <w:numFmt w:val="bullet"/>
       <w:lvlText w:val="o"/>
       <w:rPr>
@@ -3443,7 +3489,7 @@
       </w:pPr>
     </w:lvl>
     <w:lvl w:ilvl="2">
-      <w:tmpl w:val="15755A29"/>
+      <w:tmpl w:val="E8666A06"/>
       <w:numFmt w:val="bullet"/>
       <w:lvlText w:val=""/>
       <w:rPr>
@@ -3455,7 +3501,7 @@
       </w:pPr>
     </w:lvl>
     <w:lvl w:ilvl="3">
-      <w:tmpl w:val="476C9417"/>
+      <w:tmpl w:val="97501307"/>
       <w:numFmt w:val="bullet"/>
       <w:lvlText w:val=""/>
       <w:rPr>
@@ -3467,7 +3513,7 @@
       </w:pPr>
     </w:lvl>
     <w:lvl w:ilvl="4">
-      <w:tmpl w:val="3A30FDA4"/>
+      <w:tmpl w:val="73B9D5BD"/>
       <w:numFmt w:val="bullet"/>
       <w:lvlText w:val="o"/>
       <w:rPr>
@@ -3479,7 +3525,7 @@
       </w:pPr>
     </w:lvl>
     <w:lvl w:ilvl="5">
-      <w:tmpl w:val="34D71DE9"/>
+      <w:tmpl w:val="4A6442FB"/>
       <w:numFmt w:val="bullet"/>
       <w:lvlText w:val=""/>
       <w:rPr>
@@ -3491,7 +3537,7 @@
       </w:pPr>
     </w:lvl>
     <w:lvl w:ilvl="6">
-      <w:tmpl w:val="1723AE3C"/>
+      <w:tmpl w:val="ADE1EB21"/>
       <w:numFmt w:val="bullet"/>
       <w:lvlText w:val=""/>
       <w:rPr>
@@ -3503,7 +3549,7 @@
       </w:pPr>
     </w:lvl>
     <w:lvl w:ilvl="7">
-      <w:tmpl w:val="A6F37995"/>
+      <w:tmpl w:val="8E19E120"/>
       <w:numFmt w:val="bullet"/>
       <w:lvlText w:val="o"/>
       <w:rPr>
@@ -3515,7 +3561,7 @@
       </w:pPr>
     </w:lvl>
     <w:lvl w:ilvl="8">
-      <w:tmpl w:val="C5D32387"/>
+      <w:tmpl w:val="15982935"/>
       <w:numFmt w:val="bullet"/>
       <w:lvlText w:val=""/>
       <w:rPr>
@@ -3530,7 +3576,7 @@
   <w:abstractNum w:abstractNumId="14">
     <w:multiLevelType w:val="hybridMultilevel"/>
     <w:lvl w:ilvl="0">
-      <w:tmpl w:val="9EF31D1B"/>
+      <w:tmpl w:val="2C8A05C1"/>
       <w:numFmt w:val="bullet"/>
       <w:lvlText w:val=""/>
       <w:rPr>
@@ -3542,7 +3588,7 @@
       </w:pPr>
     </w:lvl>
     <w:lvl w:ilvl="1">
-      <w:tmpl w:val="4B2E1FD4"/>
+      <w:tmpl w:val="86EAEC25"/>
       <w:numFmt w:val="bullet"/>
       <w:lvlText w:val="o"/>
       <w:rPr>
@@ -3554,7 +3600,7 @@
       </w:pPr>
     </w:lvl>
     <w:lvl w:ilvl="2">
-      <w:tmpl w:val="0A2136F0"/>
+      <w:tmpl w:val="74669C2C"/>
       <w:numFmt w:val="bullet"/>
       <w:lvlText w:val=""/>
       <w:rPr>
@@ -3566,7 +3612,7 @@
       </w:pPr>
     </w:lvl>
     <w:lvl w:ilvl="3">
-      <w:tmpl w:val="A976D4F2"/>
+      <w:tmpl w:val="A3E1AB5D"/>
       <w:numFmt w:val="bullet"/>
       <w:lvlText w:val=""/>
       <w:rPr>
@@ -3578,7 +3624,7 @@
       </w:pPr>
     </w:lvl>
     <w:lvl w:ilvl="4">
-      <w:tmpl w:val="4789E06C"/>
+      <w:tmpl w:val="170DBF52"/>
       <w:numFmt w:val="bullet"/>
       <w:lvlText w:val="o"/>
       <w:rPr>
@@ -3590,7 +3636,7 @@
       </w:pPr>
     </w:lvl>
     <w:lvl w:ilvl="5">
-      <w:tmpl w:val="EBEF9B0C"/>
+      <w:tmpl w:val="5DAC48D4"/>
       <w:numFmt w:val="bullet"/>
       <w:lvlText w:val=""/>
       <w:rPr>
@@ -3602,7 +3648,7 @@
       </w:pPr>
     </w:lvl>
     <w:lvl w:ilvl="6">
-      <w:tmpl w:val="F843F38E"/>
+      <w:tmpl w:val="D70D537D"/>
       <w:numFmt w:val="bullet"/>
       <w:lvlText w:val=""/>
       <w:rPr>
@@ -3614,7 +3660,7 @@
       </w:pPr>
     </w:lvl>
     <w:lvl w:ilvl="7">
-      <w:tmpl w:val="D02A7446"/>
+      <w:tmpl w:val="AFD3A9B8"/>
       <w:numFmt w:val="bullet"/>
       <w:lvlText w:val="o"/>
       <w:rPr>
@@ -3626,7 +3672,7 @@
       </w:pPr>
     </w:lvl>
     <w:lvl w:ilvl="8">
-      <w:tmpl w:val="DF244816"/>
+      <w:tmpl w:val="07428A64"/>
       <w:numFmt w:val="bullet"/>
       <w:lvlText w:val=""/>
       <w:rPr>
@@ -3641,7 +3687,7 @@
   <w:abstractNum w:abstractNumId="15">
     <w:multiLevelType w:val="hybridMultilevel"/>
     <w:lvl w:ilvl="0">
-      <w:tmpl w:val="BEED45EF"/>
+      <w:tmpl w:val="EF3FBD0A"/>
       <w:start w:val="1"/>
       <w:numFmt w:val="decimal"/>
       <w:lvlText w:val="%1."/>
@@ -3651,7 +3697,7 @@
       </w:pPr>
     </w:lvl>
     <w:lvl w:ilvl="1">
-      <w:tmpl w:val="D1E45756"/>
+      <w:tmpl w:val="D3F1BAD6"/>
       <w:start w:val="1"/>
       <w:numFmt w:val="lowerLetter"/>
       <w:lvlText w:val="%2."/>
@@ -3661,7 +3707,7 @@
       </w:pPr>
     </w:lvl>
     <w:lvl w:ilvl="2">
-      <w:tmpl w:val="B1F5834F"/>
+      <w:tmpl w:val="891FA53C"/>
       <w:start w:val="1"/>
       <w:numFmt w:val="lowerRoman"/>
       <w:lvlText w:val="%3."/>
@@ -3671,7 +3717,7 @@
       </w:pPr>
     </w:lvl>
     <w:lvl w:ilvl="3">
-      <w:tmpl w:val="5F090746"/>
+      <w:tmpl w:val="45EE4295"/>
       <w:start w:val="1"/>
       <w:numFmt w:val="decimal"/>
       <w:lvlText w:val="%4."/>
@@ -3681,7 +3727,7 @@
       </w:pPr>
     </w:lvl>
     <w:lvl w:ilvl="4">
-      <w:tmpl w:val="289088CF"/>
+      <w:tmpl w:val="67711BC8"/>
       <w:start w:val="1"/>
       <w:numFmt w:val="lowerLetter"/>
       <w:lvlText w:val="%5."/>
@@ -3691,7 +3737,7 @@
       </w:pPr>
     </w:lvl>
     <w:lvl w:ilvl="5">
-      <w:tmpl w:val="689002C8"/>
+      <w:tmpl w:val="ED21B2E0"/>
       <w:start w:val="1"/>
       <w:numFmt w:val="lowerRoman"/>
       <w:lvlText w:val="%6."/>
@@ -3701,7 +3747,7 @@
       </w:pPr>
     </w:lvl>
     <w:lvl w:ilvl="6">
-      <w:tmpl w:val="6F4236B8"/>
+      <w:tmpl w:val="0975F62E"/>
       <w:start w:val="1"/>
       <w:numFmt w:val="decimal"/>
       <w:lvlText w:val="%7."/>
@@ -3711,7 +3757,7 @@
       </w:pPr>
     </w:lvl>
     <w:lvl w:ilvl="7">
-      <w:tmpl w:val="74F50767"/>
+      <w:tmpl w:val="AE5D755F"/>
       <w:start w:val="1"/>
       <w:numFmt w:val="lowerLetter"/>
       <w:lvlText w:val="%8."/>
@@ -3721,7 +3767,7 @@
       </w:pPr>
     </w:lvl>
     <w:lvl w:ilvl="8">
-      <w:tmpl w:val="E668F4B2"/>
+      <w:tmpl w:val="06231849"/>
       <w:start w:val="1"/>
       <w:numFmt w:val="lowerRoman"/>
       <w:lvlText w:val="%9."/>
@@ -3734,7 +3780,7 @@
   <w:abstractNum w:abstractNumId="16">
     <w:multiLevelType w:val="hybridMultilevel"/>
     <w:lvl w:ilvl="0">
-      <w:tmpl w:val="DC4FDD70"/>
+      <w:tmpl w:val="C5202BD1"/>
       <w:numFmt w:val="bullet"/>
       <w:lvlText w:val=""/>
       <w:rPr>
@@ -3746,7 +3792,7 @@
       </w:pPr>
     </w:lvl>
     <w:lvl w:ilvl="1">
-      <w:tmpl w:val="EB2F1A6B"/>
+      <w:tmpl w:val="C4EC0DBF"/>
       <w:numFmt w:val="bullet"/>
       <w:lvlText w:val="o"/>
       <w:rPr>
@@ -3758,7 +3804,7 @@
       </w:pPr>
     </w:lvl>
     <w:lvl w:ilvl="2">
-      <w:tmpl w:val="F585FB58"/>
+      <w:tmpl w:val="CEA23E40"/>
       <w:numFmt w:val="bullet"/>
       <w:lvlText w:val=""/>
       <w:rPr>
@@ -3770,7 +3816,7 @@
       </w:pPr>
     </w:lvl>
     <w:lvl w:ilvl="3">
-      <w:tmpl w:val="379D031D"/>
+      <w:tmpl w:val="4B5A6B79"/>
       <w:numFmt w:val="bullet"/>
       <w:lvlText w:val=""/>
       <w:rPr>
@@ -3782,7 +3828,7 @@
       </w:pPr>
     </w:lvl>
     <w:lvl w:ilvl="4">
-      <w:tmpl w:val="EB5FC4CC"/>
+      <w:tmpl w:val="F348F764"/>
       <w:numFmt w:val="bullet"/>
       <w:lvlText w:val="o"/>
       <w:rPr>
@@ -3794,7 +3840,7 @@
       </w:pPr>
     </w:lvl>
     <w:lvl w:ilvl="5">
-      <w:tmpl w:val="6C529835"/>
+      <w:tmpl w:val="0F44A5EC"/>
       <w:numFmt w:val="bullet"/>
       <w:lvlText w:val=""/>
       <w:rPr>
@@ -3806,7 +3852,7 @@
       </w:pPr>
     </w:lvl>
     <w:lvl w:ilvl="6">
-      <w:tmpl w:val="0A8CCEFA"/>
+      <w:tmpl w:val="E2854B5E"/>
       <w:numFmt w:val="bullet"/>
       <w:lvlText w:val=""/>
       <w:rPr>
@@ -3818,7 +3864,7 @@
       </w:pPr>
     </w:lvl>
     <w:lvl w:ilvl="7">
-      <w:tmpl w:val="4096C947"/>
+      <w:tmpl w:val="960F32B0"/>
       <w:numFmt w:val="bullet"/>
       <w:lvlText w:val="o"/>
       <w:rPr>
@@ -3830,7 +3876,7 @@
       </w:pPr>
     </w:lvl>
     <w:lvl w:ilvl="8">
-      <w:tmpl w:val="E2E8D40E"/>
+      <w:tmpl w:val="0C1ACD74"/>
       <w:numFmt w:val="bullet"/>
       <w:lvlText w:val=""/>
       <w:rPr>
@@ -3845,7 +3891,7 @@
   <w:abstractNum w:abstractNumId="17">
     <w:multiLevelType w:val="hybridMultilevel"/>
     <w:lvl w:ilvl="0">
-      <w:tmpl w:val="2F47D9A4"/>
+      <w:tmpl w:val="ECB15161"/>
       <w:start w:val="1"/>
       <w:numFmt w:val="decimal"/>
       <w:lvlText w:val="%1."/>
@@ -3855,7 +3901,7 @@
       </w:pPr>
     </w:lvl>
     <w:lvl w:ilvl="1">
-      <w:tmpl w:val="96FF576F"/>
+      <w:tmpl w:val="6064685D"/>
       <w:start w:val="1"/>
       <w:numFmt w:val="lowerLetter"/>
       <w:lvlText w:val="%2."/>
@@ -3865,7 +3911,7 @@
       </w:pPr>
     </w:lvl>
     <w:lvl w:ilvl="2">
-      <w:tmpl w:val="30023430"/>
+      <w:tmpl w:val="8849426D"/>
       <w:start w:val="1"/>
       <w:numFmt w:val="lowerRoman"/>
       <w:lvlText w:val="%3."/>
@@ -3875,7 +3921,7 @@
       </w:pPr>
     </w:lvl>
     <w:lvl w:ilvl="3">
-      <w:tmpl w:val="ED792C95"/>
+      <w:tmpl w:val="2452C2B0"/>
       <w:start w:val="1"/>
       <w:numFmt w:val="decimal"/>
       <w:lvlText w:val="%4."/>
@@ -3885,7 +3931,7 @@
       </w:pPr>
     </w:lvl>
     <w:lvl w:ilvl="4">
-      <w:tmpl w:val="BF945D6F"/>
+      <w:tmpl w:val="87ED3E3E"/>
       <w:start w:val="1"/>
       <w:numFmt w:val="lowerLetter"/>
       <w:lvlText w:val="%5."/>
@@ -3895,7 +3941,7 @@
       </w:pPr>
     </w:lvl>
     <w:lvl w:ilvl="5">
-      <w:tmpl w:val="95CE591E"/>
+      <w:tmpl w:val="E7CA9318"/>
       <w:start w:val="1"/>
       <w:numFmt w:val="lowerRoman"/>
       <w:lvlText w:val="%6."/>
@@ -3905,7 +3951,7 @@
       </w:pPr>
     </w:lvl>
     <w:lvl w:ilvl="6">
-      <w:tmpl w:val="25CAE245"/>
+      <w:tmpl w:val="C330CB71"/>
       <w:start w:val="1"/>
       <w:numFmt w:val="decimal"/>
       <w:lvlText w:val="%7."/>
@@ -3915,7 +3961,7 @@
       </w:pPr>
     </w:lvl>
     <w:lvl w:ilvl="7">
-      <w:tmpl w:val="0B7FD510"/>
+      <w:tmpl w:val="B4ADE87B"/>
       <w:start w:val="1"/>
       <w:numFmt w:val="lowerLetter"/>
       <w:lvlText w:val="%8."/>
@@ -3925,7 +3971,7 @@
       </w:pPr>
     </w:lvl>
     <w:lvl w:ilvl="8">
-      <w:tmpl w:val="CF05B728"/>
+      <w:tmpl w:val="85E1B3AA"/>
       <w:start w:val="1"/>
       <w:numFmt w:val="lowerRoman"/>
       <w:lvlText w:val="%9."/>
@@ -3938,7 +3984,7 @@
   <w:abstractNum w:abstractNumId="18">
     <w:multiLevelType w:val="hybridMultilevel"/>
     <w:lvl w:ilvl="0">
-      <w:tmpl w:val="77255A96"/>
+      <w:tmpl w:val="5046D70C"/>
       <w:numFmt w:val="bullet"/>
       <w:lvlText w:val=""/>
       <w:rPr>
@@ -3950,7 +3996,7 @@
       </w:pPr>
     </w:lvl>
     <w:lvl w:ilvl="1">
-      <w:tmpl w:val="9EE066B8"/>
+      <w:tmpl w:val="379E9F20"/>
       <w:numFmt w:val="bullet"/>
       <w:lvlText w:val="o"/>
       <w:rPr>
@@ -3962,7 +4008,7 @@
       </w:pPr>
     </w:lvl>
     <w:lvl w:ilvl="2">
-      <w:tmpl w:val="072FFE02"/>
+      <w:tmpl w:val="E37E6F4B"/>
       <w:numFmt w:val="bullet"/>
       <w:lvlText w:val=""/>
       <w:rPr>
@@ -3974,7 +4020,7 @@
       </w:pPr>
     </w:lvl>
     <w:lvl w:ilvl="3">
-      <w:tmpl w:val="2F30ECBD"/>
+      <w:tmpl w:val="FDD52E31"/>
       <w:numFmt w:val="bullet"/>
       <w:lvlText w:val=""/>
       <w:rPr>
@@ -3986,7 +4032,7 @@
       </w:pPr>
     </w:lvl>
     <w:lvl w:ilvl="4">
-      <w:tmpl w:val="44BC27C4"/>
+      <w:tmpl w:val="7ED8655D"/>
       <w:numFmt w:val="bullet"/>
       <w:lvlText w:val="o"/>
       <w:rPr>
@@ -3998,7 +4044,7 @@
       </w:pPr>
     </w:lvl>
     <w:lvl w:ilvl="5">
-      <w:tmpl w:val="63873A1B"/>
+      <w:tmpl w:val="3DA454A9"/>
       <w:numFmt w:val="bullet"/>
       <w:lvlText w:val=""/>
       <w:rPr>
@@ -4010,7 +4056,7 @@
       </w:pPr>
     </w:lvl>
     <w:lvl w:ilvl="6">
-      <w:tmpl w:val="83E0D9CC"/>
+      <w:tmpl w:val="2F179A25"/>
       <w:numFmt w:val="bullet"/>
       <w:lvlText w:val=""/>
       <w:rPr>
@@ -4022,7 +4068,7 @@
       </w:pPr>
     </w:lvl>
     <w:lvl w:ilvl="7">
-      <w:tmpl w:val="750804BE"/>
+      <w:tmpl w:val="CACFABCD"/>
       <w:numFmt w:val="bullet"/>
       <w:lvlText w:val="o"/>
       <w:rPr>
@@ -4034,7 +4080,7 @@
       </w:pPr>
     </w:lvl>
     <w:lvl w:ilvl="8">
-      <w:tmpl w:val="05114169"/>
+      <w:tmpl w:val="A73751AD"/>
       <w:numFmt w:val="bullet"/>
       <w:lvlText w:val=""/>
       <w:rPr>
@@ -5690,7 +5736,7 @@
   <Source>
     <Tag>fielding2000</Tag>
     <SourceType>Book</SourceType>
-    <Guid>{17cfdc38-b417-4826-ac28-be9ea3cada98}</Guid>
+    <Guid>{fe023994-00c6-4e68-b856-ffd72a00e92a}</Guid>
     <LCID>0</LCID>
     <Title>Architectural Styles and the Design of Network-based Software Architectures</Title>
     <Year>2000</Year>
@@ -5710,7 +5756,7 @@
   <Source>
     <Tag>humble2010</Tag>
     <SourceType>Book</SourceType>
-    <Guid>{f588004b-e20c-4c46-9175-cf721d78e976}</Guid>
+    <Guid>{98a1bcab-e437-41bf-959d-4961eeebeceb}</Guid>
     <LCID>0</LCID>
     <Title>Continuous Delivery</Title>
     <Year>2010</Year>
@@ -5735,7 +5781,7 @@
   <Source>
     <Tag>fowler2018</Tag>
     <SourceType>BookSection</SourceType>
-    <Guid>{fc3ebf26-e33e-4631-930e-db5934e3051f}</Guid>
+    <Guid>{7c5e94d7-c87b-4c2c-ad91-4e4554474997}</Guid>
     <LCID>0</LCID>
     <Title>Configuration Patterns</Title>
     <BookTitle>Refactoring -- Improving the Design of Existing Code</BookTitle>
@@ -5765,7 +5811,7 @@
   <Source>
     <Tag>markdig2024</Tag>
     <SourceType>InternetSite</SourceType>
-    <Guid>{9c582a3d-d952-4253-8a48-7abf16788ac2}</Guid>
+    <Guid>{80dea4f0-2d55-469d-a860-08f14794bad4}</Guid>
     <LCID>0</LCID>
     <InternetSiteTitle>Markdig -- A Fast, Powerful, CommonMark Compliant Markdown Processor</InternetSiteTitle>
     <YearAccessed>2026</YearAccessed>
@@ -5786,7 +5832,7 @@
   <Source>
     <Tag>sixlabors2023</Tag>
     <SourceType>InternetSite</SourceType>
-    <Guid>{8d828ca4-0e59-4170-bff9-ab6434d3ccff}</Guid>
+    <Guid>{b2f0409b-4d30-493c-b5c7-d54cc106f1c2}</Guid>
     <LCID>0</LCID>
     <InternetSiteTitle>ImageSharp -- A Modern, Cross-Platform, 2D Graphics Library</InternetSiteTitle>
     <YearAccessed>2026</YearAccessed>
@@ -5797,7 +5843,7 @@
   <Source>
     <Tag>microsoftOpenXml</Tag>
     <SourceType>DocumentFromInternetSite</SourceType>
-    <Guid>{e4a47711-d798-4aa3-9f7d-170a9407a9eb}</Guid>
+    <Guid>{a6f53d06-c4b7-4c13-b011-e895a468d226}</Guid>
     <LCID>0</LCID>
     <InternetSiteTitle>Open XML SDK Documentation</InternetSiteTitle>
     <Year>2023</Year>
@@ -5820,7 +5866,7 @@
   <Source>
     <Tag>openxmlWebSite2024</Tag>
     <SourceType>InternetSite</SourceType>
-    <Guid>{90f14bd5-9d53-44dc-84ea-e21367437bbc}</Guid>
+    <Guid>{86b60e39-f71c-4a78-b260-e8f81580855b}</Guid>
     <LCID>0</LCID>
     <InternetSiteTitle>ECMA-376 Office Open XML File Formats</InternetSiteTitle>
     <YearAccessed>2026</YearAccessed>
@@ -5831,7 +5877,7 @@
   <Source>
     <Tag>techWritingCase2019</Tag>
     <SourceType>JournalArticle</SourceType>
-    <Guid>{71220dc8-053d-42f4-9d6f-38f71f22751b}</Guid>
+    <Guid>{6bbec312-4b5c-40f6-a33b-bcc934a5f10f}</Guid>
     <LCID>0</LCID>
     <Title>Technological Developments in Document and Information Design</Title>
     <JournalName>Journal of Technical Writing and Communication</JournalName>

</xml_diff>

<commit_message>
Enhance Markdown processing to handle leading whitespace and update example code block formatting
</commit_message>
<xml_diff>
--- a/sample/output.docx
+++ b/sample/output.docx
@@ -861,7 +861,7 @@
           <wp:inline distT="0" distB="0" distL="0" distR="0">
             <wp:extent cx="2857500" cy="2857500"/>
             <wp:effectExtent l="0" t="0" r="0" b="0"/>
-            <wp:docPr id="2067402145" name="Picture 2067402145"/>
+            <wp:docPr id="96434640" name="Picture 96434640"/>
             <wp:cNvGraphicFramePr>
               <a:graphicFrameLocks xmlns:a="http://schemas.openxmlformats.org/drawingml/2006/main" noChangeAspect="1"/>
             </wp:cNvGraphicFramePr>
@@ -869,11 +869,11 @@
               <a:graphicData uri="http://schemas.openxmlformats.org/drawingml/2006/picture">
                 <pic:pic xmlns:pic="http://schemas.openxmlformats.org/drawingml/2006/picture">
                   <pic:nvPicPr>
-                    <pic:cNvPr id="2067402174" name="placeholder-500.png"/>
+                    <pic:cNvPr id="96434666" name="placeholder-500.png"/>
                     <pic:cNvPicPr/>
                   </pic:nvPicPr>
                   <pic:blipFill>
-                    <a:blip r:embed="R148dc1755a2c4883"/>
+                    <a:blip r:embed="Rb7f343593bfb4cc5"/>
                     <a:stretch>
                       <a:fillRect/>
                     </a:stretch>
@@ -938,7 +938,7 @@
           <wp:inline distT="0" distB="0" distL="0" distR="0">
             <wp:extent cx="3810000" cy="2857500"/>
             <wp:effectExtent l="0" t="0" r="0" b="0"/>
-            <wp:docPr id="2067925208" name="Picture 2067925208"/>
+            <wp:docPr id="97135876" name="Picture 97135876"/>
             <wp:cNvGraphicFramePr>
               <a:graphicFrameLocks xmlns:a="http://schemas.openxmlformats.org/drawingml/2006/main" noChangeAspect="1"/>
             </wp:cNvGraphicFramePr>
@@ -946,11 +946,11 @@
               <a:graphicData uri="http://schemas.openxmlformats.org/drawingml/2006/picture">
                 <pic:pic xmlns:pic="http://schemas.openxmlformats.org/drawingml/2006/picture">
                   <pic:nvPicPr>
-                    <pic:cNvPr id="2067925211" name="placeholder-400-300.png"/>
+                    <pic:cNvPr id="97135879" name="placeholder-400-300.png"/>
                     <pic:cNvPicPr/>
                   </pic:nvPicPr>
                   <pic:blipFill>
-                    <a:blip r:embed="Re5966bc4bdee4796"/>
+                    <a:blip r:embed="R804db769e8aa45f7"/>
                     <a:stretch>
                       <a:fillRect/>
                     </a:stretch>
@@ -1377,7 +1377,7 @@
           <wp:inline distT="0" distB="0" distL="0" distR="0">
             <wp:extent cx="3810000" cy="3810000"/>
             <wp:effectExtent l="0" t="0" r="0" b="0"/>
-            <wp:docPr id="2067938277" name="Picture 2067938277"/>
+            <wp:docPr id="97150442" name="Picture 97150442"/>
             <wp:cNvGraphicFramePr>
               <a:graphicFrameLocks xmlns:a="http://schemas.openxmlformats.org/drawingml/2006/main" noChangeAspect="1"/>
             </wp:cNvGraphicFramePr>
@@ -1385,11 +1385,11 @@
               <a:graphicData uri="http://schemas.openxmlformats.org/drawingml/2006/picture">
                 <pic:pic xmlns:pic="http://schemas.openxmlformats.org/drawingml/2006/picture">
                   <pic:nvPicPr>
-                    <pic:cNvPr id="2067938281" name="placeholder-500.png"/>
+                    <pic:cNvPr id="97150444" name="placeholder-500.png"/>
                     <pic:cNvPicPr/>
                   </pic:nvPicPr>
                   <pic:blipFill>
-                    <a:blip r:embed="R018f75af042e4fd3"/>
+                    <a:blip r:embed="R0815e2051e3d4604"/>
                     <a:stretch>
                       <a:fillRect/>
                     </a:stretch>
@@ -1761,18 +1761,33 @@
       </w:r>
       <w:r>
         <w:rPr>
-          <w:b/>
+          <w:u w:val="single"/>
         </w:rPr>
+        <w:t xml:space="preserve">underline</w:t>
+      </w:r>
+      <w:r>
+        <w:t xml:space="preserve">, </w:t>
+      </w:r>
+      <w:r>
+        <w:t xml:space="preserve">**</w:t>
+      </w:r>
+      <w:r>
         <w:t xml:space="preserve">bold</w:t>
       </w:r>
       <w:r>
+        <w:t xml:space="preserve">**</w:t>
+      </w:r>
+      <w:r>
         <w:t xml:space="preserve"> and </w:t>
       </w:r>
       <w:r>
-        <w:rPr>
-          <w:i/>
-        </w:rPr>
+        <w:t xml:space="preserve">_</w:t>
+      </w:r>
+      <w:r>
         <w:t xml:space="preserve">italic</w:t>
+      </w:r>
+      <w:r>
+        <w:t xml:space="preserve">_</w:t>
       </w:r>
       <w:r>
         <w:t xml:space="preserve">, but </w:t>
@@ -2649,7 +2664,7 @@
   <w:abstractNum w:abstractNumId="5">
     <w:multiLevelType w:val="hybridMultilevel"/>
     <w:lvl w:ilvl="0">
-      <w:tmpl w:val="FFC59036"/>
+      <w:tmpl w:val="8A8C3852"/>
       <w:numFmt w:val="bullet"/>
       <w:lvlText w:val=""/>
       <w:rPr>
@@ -2661,7 +2676,7 @@
       </w:pPr>
     </w:lvl>
     <w:lvl w:ilvl="1">
-      <w:tmpl w:val="FFDD88BA"/>
+      <w:tmpl w:val="76FB9888"/>
       <w:numFmt w:val="bullet"/>
       <w:lvlText w:val="o"/>
       <w:rPr>
@@ -2673,7 +2688,7 @@
       </w:pPr>
     </w:lvl>
     <w:lvl w:ilvl="2">
-      <w:tmpl w:val="338EE10F"/>
+      <w:tmpl w:val="96A03C27"/>
       <w:numFmt w:val="bullet"/>
       <w:lvlText w:val=""/>
       <w:rPr>
@@ -2685,7 +2700,7 @@
       </w:pPr>
     </w:lvl>
     <w:lvl w:ilvl="3">
-      <w:tmpl w:val="03FA1628"/>
+      <w:tmpl w:val="E0346E05"/>
       <w:numFmt w:val="bullet"/>
       <w:lvlText w:val=""/>
       <w:rPr>
@@ -2697,7 +2712,7 @@
       </w:pPr>
     </w:lvl>
     <w:lvl w:ilvl="4">
-      <w:tmpl w:val="2C309A98"/>
+      <w:tmpl w:val="75D04BB9"/>
       <w:numFmt w:val="bullet"/>
       <w:lvlText w:val="o"/>
       <w:rPr>
@@ -2709,7 +2724,7 @@
       </w:pPr>
     </w:lvl>
     <w:lvl w:ilvl="5">
-      <w:tmpl w:val="79DA8A3E"/>
+      <w:tmpl w:val="4F0B0607"/>
       <w:numFmt w:val="bullet"/>
       <w:lvlText w:val=""/>
       <w:rPr>
@@ -2721,7 +2736,7 @@
       </w:pPr>
     </w:lvl>
     <w:lvl w:ilvl="6">
-      <w:tmpl w:val="61A13AEA"/>
+      <w:tmpl w:val="B795C0F7"/>
       <w:numFmt w:val="bullet"/>
       <w:lvlText w:val=""/>
       <w:rPr>
@@ -2733,7 +2748,7 @@
       </w:pPr>
     </w:lvl>
     <w:lvl w:ilvl="7">
-      <w:tmpl w:val="3E871292"/>
+      <w:tmpl w:val="EC6F441B"/>
       <w:numFmt w:val="bullet"/>
       <w:lvlText w:val="o"/>
       <w:rPr>
@@ -2745,7 +2760,7 @@
       </w:pPr>
     </w:lvl>
     <w:lvl w:ilvl="8">
-      <w:tmpl w:val="3A5D5D9A"/>
+      <w:tmpl w:val="F8838FBC"/>
       <w:numFmt w:val="bullet"/>
       <w:lvlText w:val=""/>
       <w:rPr>
@@ -2760,7 +2775,7 @@
   <w:abstractNum w:abstractNumId="6">
     <w:multiLevelType w:val="hybridMultilevel"/>
     <w:lvl w:ilvl="0">
-      <w:tmpl w:val="36C7B255"/>
+      <w:tmpl w:val="9C7372D0"/>
       <w:start w:val="1"/>
       <w:numFmt w:val="decimal"/>
       <w:lvlText w:val="%1."/>
@@ -2770,7 +2785,7 @@
       </w:pPr>
     </w:lvl>
     <w:lvl w:ilvl="1">
-      <w:tmpl w:val="4ADA7780"/>
+      <w:tmpl w:val="BE4D1E9C"/>
       <w:start w:val="1"/>
       <w:numFmt w:val="lowerLetter"/>
       <w:lvlText w:val="%2."/>
@@ -2780,7 +2795,7 @@
       </w:pPr>
     </w:lvl>
     <w:lvl w:ilvl="2">
-      <w:tmpl w:val="AB755074"/>
+      <w:tmpl w:val="ACC06EED"/>
       <w:start w:val="1"/>
       <w:numFmt w:val="lowerRoman"/>
       <w:lvlText w:val="%3."/>
@@ -2790,7 +2805,7 @@
       </w:pPr>
     </w:lvl>
     <w:lvl w:ilvl="3">
-      <w:tmpl w:val="518D9890"/>
+      <w:tmpl w:val="CA635319"/>
       <w:start w:val="1"/>
       <w:numFmt w:val="decimal"/>
       <w:lvlText w:val="%4."/>
@@ -2800,7 +2815,7 @@
       </w:pPr>
     </w:lvl>
     <w:lvl w:ilvl="4">
-      <w:tmpl w:val="F231D386"/>
+      <w:tmpl w:val="094FB61A"/>
       <w:start w:val="1"/>
       <w:numFmt w:val="lowerLetter"/>
       <w:lvlText w:val="%5."/>
@@ -2810,7 +2825,7 @@
       </w:pPr>
     </w:lvl>
     <w:lvl w:ilvl="5">
-      <w:tmpl w:val="9389C7AC"/>
+      <w:tmpl w:val="B8F3F0AE"/>
       <w:start w:val="1"/>
       <w:numFmt w:val="lowerRoman"/>
       <w:lvlText w:val="%6."/>
@@ -2820,7 +2835,7 @@
       </w:pPr>
     </w:lvl>
     <w:lvl w:ilvl="6">
-      <w:tmpl w:val="122F936B"/>
+      <w:tmpl w:val="9E395B91"/>
       <w:start w:val="1"/>
       <w:numFmt w:val="decimal"/>
       <w:lvlText w:val="%7."/>
@@ -2830,7 +2845,7 @@
       </w:pPr>
     </w:lvl>
     <w:lvl w:ilvl="7">
-      <w:tmpl w:val="AFBE1935"/>
+      <w:tmpl w:val="7BA16D0C"/>
       <w:start w:val="1"/>
       <w:numFmt w:val="lowerLetter"/>
       <w:lvlText w:val="%8."/>
@@ -2840,7 +2855,7 @@
       </w:pPr>
     </w:lvl>
     <w:lvl w:ilvl="8">
-      <w:tmpl w:val="AAC8948F"/>
+      <w:tmpl w:val="E6F51D46"/>
       <w:start w:val="1"/>
       <w:numFmt w:val="lowerRoman"/>
       <w:lvlText w:val="%9."/>
@@ -2853,7 +2868,7 @@
   <w:abstractNum w:abstractNumId="7">
     <w:multiLevelType w:val="hybridMultilevel"/>
     <w:lvl w:ilvl="0">
-      <w:tmpl w:val="CFF85651"/>
+      <w:tmpl w:val="18A3A3F9"/>
       <w:numFmt w:val="bullet"/>
       <w:lvlText w:val=""/>
       <w:rPr>
@@ -2865,7 +2880,7 @@
       </w:pPr>
     </w:lvl>
     <w:lvl w:ilvl="1">
-      <w:tmpl w:val="338A5293"/>
+      <w:tmpl w:val="3884BAB1"/>
       <w:numFmt w:val="bullet"/>
       <w:lvlText w:val="o"/>
       <w:rPr>
@@ -2877,7 +2892,7 @@
       </w:pPr>
     </w:lvl>
     <w:lvl w:ilvl="2">
-      <w:tmpl w:val="D3E4ECD9"/>
+      <w:tmpl w:val="BEE688BF"/>
       <w:numFmt w:val="bullet"/>
       <w:lvlText w:val=""/>
       <w:rPr>
@@ -2889,7 +2904,7 @@
       </w:pPr>
     </w:lvl>
     <w:lvl w:ilvl="3">
-      <w:tmpl w:val="47F96F4B"/>
+      <w:tmpl w:val="8C19B699"/>
       <w:numFmt w:val="bullet"/>
       <w:lvlText w:val=""/>
       <w:rPr>
@@ -2901,7 +2916,7 @@
       </w:pPr>
     </w:lvl>
     <w:lvl w:ilvl="4">
-      <w:tmpl w:val="8454F88A"/>
+      <w:tmpl w:val="7008EF1D"/>
       <w:numFmt w:val="bullet"/>
       <w:lvlText w:val="o"/>
       <w:rPr>
@@ -2913,7 +2928,7 @@
       </w:pPr>
     </w:lvl>
     <w:lvl w:ilvl="5">
-      <w:tmpl w:val="75417603"/>
+      <w:tmpl w:val="4F1D2D36"/>
       <w:numFmt w:val="bullet"/>
       <w:lvlText w:val=""/>
       <w:rPr>
@@ -2925,7 +2940,7 @@
       </w:pPr>
     </w:lvl>
     <w:lvl w:ilvl="6">
-      <w:tmpl w:val="D95B7422"/>
+      <w:tmpl w:val="3268A953"/>
       <w:numFmt w:val="bullet"/>
       <w:lvlText w:val=""/>
       <w:rPr>
@@ -2937,7 +2952,7 @@
       </w:pPr>
     </w:lvl>
     <w:lvl w:ilvl="7">
-      <w:tmpl w:val="BE059BD3"/>
+      <w:tmpl w:val="1E6E3FBF"/>
       <w:numFmt w:val="bullet"/>
       <w:lvlText w:val="o"/>
       <w:rPr>
@@ -2949,7 +2964,7 @@
       </w:pPr>
     </w:lvl>
     <w:lvl w:ilvl="8">
-      <w:tmpl w:val="39FB4C90"/>
+      <w:tmpl w:val="3E7CBAE5"/>
       <w:numFmt w:val="bullet"/>
       <w:lvlText w:val=""/>
       <w:rPr>
@@ -2964,7 +2979,7 @@
   <w:abstractNum w:abstractNumId="8">
     <w:multiLevelType w:val="hybridMultilevel"/>
     <w:lvl w:ilvl="0">
-      <w:tmpl w:val="F251C032"/>
+      <w:tmpl w:val="A46FB9D6"/>
       <w:start w:val="1"/>
       <w:numFmt w:val="decimal"/>
       <w:lvlText w:val="%1."/>
@@ -2974,7 +2989,7 @@
       </w:pPr>
     </w:lvl>
     <w:lvl w:ilvl="1">
-      <w:tmpl w:val="9DCF4EC6"/>
+      <w:tmpl w:val="03233549"/>
       <w:start w:val="1"/>
       <w:numFmt w:val="lowerLetter"/>
       <w:lvlText w:val="%2."/>
@@ -2984,7 +2999,7 @@
       </w:pPr>
     </w:lvl>
     <w:lvl w:ilvl="2">
-      <w:tmpl w:val="E0B0FA8D"/>
+      <w:tmpl w:val="A66986EB"/>
       <w:start w:val="1"/>
       <w:numFmt w:val="lowerRoman"/>
       <w:lvlText w:val="%3."/>
@@ -2994,7 +3009,7 @@
       </w:pPr>
     </w:lvl>
     <w:lvl w:ilvl="3">
-      <w:tmpl w:val="C6759DB6"/>
+      <w:tmpl w:val="1E859924"/>
       <w:start w:val="1"/>
       <w:numFmt w:val="decimal"/>
       <w:lvlText w:val="%4."/>
@@ -3004,7 +3019,7 @@
       </w:pPr>
     </w:lvl>
     <w:lvl w:ilvl="4">
-      <w:tmpl w:val="62BD8ACF"/>
+      <w:tmpl w:val="52E36145"/>
       <w:start w:val="1"/>
       <w:numFmt w:val="lowerLetter"/>
       <w:lvlText w:val="%5."/>
@@ -3014,7 +3029,7 @@
       </w:pPr>
     </w:lvl>
     <w:lvl w:ilvl="5">
-      <w:tmpl w:val="D8C71ADB"/>
+      <w:tmpl w:val="55CE28FD"/>
       <w:start w:val="1"/>
       <w:numFmt w:val="lowerRoman"/>
       <w:lvlText w:val="%6."/>
@@ -3024,7 +3039,7 @@
       </w:pPr>
     </w:lvl>
     <w:lvl w:ilvl="6">
-      <w:tmpl w:val="757B536F"/>
+      <w:tmpl w:val="86290571"/>
       <w:start w:val="1"/>
       <w:numFmt w:val="decimal"/>
       <w:lvlText w:val="%7."/>
@@ -3034,7 +3049,7 @@
       </w:pPr>
     </w:lvl>
     <w:lvl w:ilvl="7">
-      <w:tmpl w:val="DF164786"/>
+      <w:tmpl w:val="6ABD0A7B"/>
       <w:start w:val="1"/>
       <w:numFmt w:val="lowerLetter"/>
       <w:lvlText w:val="%8."/>
@@ -3044,7 +3059,7 @@
       </w:pPr>
     </w:lvl>
     <w:lvl w:ilvl="8">
-      <w:tmpl w:val="79CD0F5E"/>
+      <w:tmpl w:val="5A365221"/>
       <w:start w:val="1"/>
       <w:numFmt w:val="lowerRoman"/>
       <w:lvlText w:val="%9."/>
@@ -3057,7 +3072,7 @@
   <w:abstractNum w:abstractNumId="9">
     <w:multiLevelType w:val="hybridMultilevel"/>
     <w:lvl w:ilvl="0">
-      <w:tmpl w:val="F6053A6D"/>
+      <w:tmpl w:val="7970757F"/>
       <w:numFmt w:val="bullet"/>
       <w:lvlText w:val=""/>
       <w:rPr>
@@ -3069,7 +3084,7 @@
       </w:pPr>
     </w:lvl>
     <w:lvl w:ilvl="1">
-      <w:tmpl w:val="492D5E42"/>
+      <w:tmpl w:val="E96705EE"/>
       <w:numFmt w:val="bullet"/>
       <w:lvlText w:val="o"/>
       <w:rPr>
@@ -3081,7 +3096,7 @@
       </w:pPr>
     </w:lvl>
     <w:lvl w:ilvl="2">
-      <w:tmpl w:val="7EAD9726"/>
+      <w:tmpl w:val="5B77B9A1"/>
       <w:numFmt w:val="bullet"/>
       <w:lvlText w:val=""/>
       <w:rPr>
@@ -3093,7 +3108,7 @@
       </w:pPr>
     </w:lvl>
     <w:lvl w:ilvl="3">
-      <w:tmpl w:val="F43DD6B2"/>
+      <w:tmpl w:val="B5E8ADB1"/>
       <w:numFmt w:val="bullet"/>
       <w:lvlText w:val=""/>
       <w:rPr>
@@ -3105,7 +3120,7 @@
       </w:pPr>
     </w:lvl>
     <w:lvl w:ilvl="4">
-      <w:tmpl w:val="FB333CEF"/>
+      <w:tmpl w:val="47553DFA"/>
       <w:numFmt w:val="bullet"/>
       <w:lvlText w:val="o"/>
       <w:rPr>
@@ -3117,7 +3132,7 @@
       </w:pPr>
     </w:lvl>
     <w:lvl w:ilvl="5">
-      <w:tmpl w:val="E7867031"/>
+      <w:tmpl w:val="C4780319"/>
       <w:numFmt w:val="bullet"/>
       <w:lvlText w:val=""/>
       <w:rPr>
@@ -3129,7 +3144,7 @@
       </w:pPr>
     </w:lvl>
     <w:lvl w:ilvl="6">
-      <w:tmpl w:val="82653974"/>
+      <w:tmpl w:val="83648A1A"/>
       <w:numFmt w:val="bullet"/>
       <w:lvlText w:val=""/>
       <w:rPr>
@@ -3141,7 +3156,7 @@
       </w:pPr>
     </w:lvl>
     <w:lvl w:ilvl="7">
-      <w:tmpl w:val="6B8372E2"/>
+      <w:tmpl w:val="35705FAC"/>
       <w:numFmt w:val="bullet"/>
       <w:lvlText w:val="o"/>
       <w:rPr>
@@ -3153,7 +3168,7 @@
       </w:pPr>
     </w:lvl>
     <w:lvl w:ilvl="8">
-      <w:tmpl w:val="E2234832"/>
+      <w:tmpl w:val="02AC78A8"/>
       <w:numFmt w:val="bullet"/>
       <w:lvlText w:val=""/>
       <w:rPr>
@@ -3168,7 +3183,7 @@
   <w:abstractNum w:abstractNumId="10">
     <w:multiLevelType w:val="hybridMultilevel"/>
     <w:lvl w:ilvl="0">
-      <w:tmpl w:val="B0270459"/>
+      <w:tmpl w:val="38753541"/>
       <w:start w:val="1"/>
       <w:numFmt w:val="decimal"/>
       <w:lvlText w:val="%1."/>
@@ -3178,7 +3193,7 @@
       </w:pPr>
     </w:lvl>
     <w:lvl w:ilvl="1">
-      <w:tmpl w:val="83AA0F8D"/>
+      <w:tmpl w:val="AB2C1267"/>
       <w:start w:val="1"/>
       <w:numFmt w:val="lowerLetter"/>
       <w:lvlText w:val="%2."/>
@@ -3188,7 +3203,7 @@
       </w:pPr>
     </w:lvl>
     <w:lvl w:ilvl="2">
-      <w:tmpl w:val="1670A338"/>
+      <w:tmpl w:val="6EA7E996"/>
       <w:start w:val="1"/>
       <w:numFmt w:val="lowerRoman"/>
       <w:lvlText w:val="%3."/>
@@ -3198,7 +3213,7 @@
       </w:pPr>
     </w:lvl>
     <w:lvl w:ilvl="3">
-      <w:tmpl w:val="E2F96100"/>
+      <w:tmpl w:val="455F43EB"/>
       <w:start w:val="1"/>
       <w:numFmt w:val="decimal"/>
       <w:lvlText w:val="%4."/>
@@ -3208,7 +3223,7 @@
       </w:pPr>
     </w:lvl>
     <w:lvl w:ilvl="4">
-      <w:tmpl w:val="1FAB14FB"/>
+      <w:tmpl w:val="9A398B19"/>
       <w:start w:val="1"/>
       <w:numFmt w:val="lowerLetter"/>
       <w:lvlText w:val="%5."/>
@@ -3218,7 +3233,7 @@
       </w:pPr>
     </w:lvl>
     <w:lvl w:ilvl="5">
-      <w:tmpl w:val="6A24A543"/>
+      <w:tmpl w:val="1BEE08B2"/>
       <w:start w:val="1"/>
       <w:numFmt w:val="lowerRoman"/>
       <w:lvlText w:val="%6."/>
@@ -3228,7 +3243,7 @@
       </w:pPr>
     </w:lvl>
     <w:lvl w:ilvl="6">
-      <w:tmpl w:val="74964711"/>
+      <w:tmpl w:val="0C49F7CA"/>
       <w:start w:val="1"/>
       <w:numFmt w:val="decimal"/>
       <w:lvlText w:val="%7."/>
@@ -3238,7 +3253,7 @@
       </w:pPr>
     </w:lvl>
     <w:lvl w:ilvl="7">
-      <w:tmpl w:val="CEF61A9C"/>
+      <w:tmpl w:val="F0F87777"/>
       <w:start w:val="1"/>
       <w:numFmt w:val="lowerLetter"/>
       <w:lvlText w:val="%8."/>
@@ -3248,7 +3263,7 @@
       </w:pPr>
     </w:lvl>
     <w:lvl w:ilvl="8">
-      <w:tmpl w:val="DB8473D6"/>
+      <w:tmpl w:val="275A797F"/>
       <w:start w:val="1"/>
       <w:numFmt w:val="lowerRoman"/>
       <w:lvlText w:val="%9."/>
@@ -3261,7 +3276,7 @@
   <w:abstractNum w:abstractNumId="11">
     <w:multiLevelType w:val="hybridMultilevel"/>
     <w:lvl w:ilvl="0">
-      <w:tmpl w:val="5068F321"/>
+      <w:tmpl w:val="DB1D49D7"/>
       <w:numFmt w:val="bullet"/>
       <w:lvlText w:val=""/>
       <w:rPr>
@@ -3273,7 +3288,7 @@
       </w:pPr>
     </w:lvl>
     <w:lvl w:ilvl="1">
-      <w:tmpl w:val="3D9A9D26"/>
+      <w:tmpl w:val="95DA0C93"/>
       <w:numFmt w:val="bullet"/>
       <w:lvlText w:val="o"/>
       <w:rPr>
@@ -3285,7 +3300,7 @@
       </w:pPr>
     </w:lvl>
     <w:lvl w:ilvl="2">
-      <w:tmpl w:val="C7AEA791"/>
+      <w:tmpl w:val="EE4CB993"/>
       <w:numFmt w:val="bullet"/>
       <w:lvlText w:val=""/>
       <w:rPr>
@@ -3297,7 +3312,7 @@
       </w:pPr>
     </w:lvl>
     <w:lvl w:ilvl="3">
-      <w:tmpl w:val="6975A61A"/>
+      <w:tmpl w:val="F3B2C27E"/>
       <w:numFmt w:val="bullet"/>
       <w:lvlText w:val=""/>
       <w:rPr>
@@ -3309,7 +3324,7 @@
       </w:pPr>
     </w:lvl>
     <w:lvl w:ilvl="4">
-      <w:tmpl w:val="69DB7C31"/>
+      <w:tmpl w:val="157758E6"/>
       <w:numFmt w:val="bullet"/>
       <w:lvlText w:val="o"/>
       <w:rPr>
@@ -3321,7 +3336,7 @@
       </w:pPr>
     </w:lvl>
     <w:lvl w:ilvl="5">
-      <w:tmpl w:val="21081EC3"/>
+      <w:tmpl w:val="D43DC96F"/>
       <w:numFmt w:val="bullet"/>
       <w:lvlText w:val=""/>
       <w:rPr>
@@ -3333,7 +3348,7 @@
       </w:pPr>
     </w:lvl>
     <w:lvl w:ilvl="6">
-      <w:tmpl w:val="29EFB8CB"/>
+      <w:tmpl w:val="4501D510"/>
       <w:numFmt w:val="bullet"/>
       <w:lvlText w:val=""/>
       <w:rPr>
@@ -3345,7 +3360,7 @@
       </w:pPr>
     </w:lvl>
     <w:lvl w:ilvl="7">
-      <w:tmpl w:val="7F9E71F6"/>
+      <w:tmpl w:val="91FB5526"/>
       <w:numFmt w:val="bullet"/>
       <w:lvlText w:val="o"/>
       <w:rPr>
@@ -3357,7 +3372,7 @@
       </w:pPr>
     </w:lvl>
     <w:lvl w:ilvl="8">
-      <w:tmpl w:val="26433D36"/>
+      <w:tmpl w:val="7D9F59E4"/>
       <w:numFmt w:val="bullet"/>
       <w:lvlText w:val=""/>
       <w:rPr>
@@ -3372,7 +3387,7 @@
   <w:abstractNum w:abstractNumId="12">
     <w:multiLevelType w:val="hybridMultilevel"/>
     <w:lvl w:ilvl="0">
-      <w:tmpl w:val="44FF1FD8"/>
+      <w:tmpl w:val="31DBDA35"/>
       <w:start w:val="1"/>
       <w:numFmt w:val="decimal"/>
       <w:lvlText w:val="%1."/>
@@ -3382,7 +3397,7 @@
       </w:pPr>
     </w:lvl>
     <w:lvl w:ilvl="1">
-      <w:tmpl w:val="F5DB356E"/>
+      <w:tmpl w:val="6C1CD597"/>
       <w:start w:val="1"/>
       <w:numFmt w:val="lowerLetter"/>
       <w:lvlText w:val="%2."/>
@@ -3392,7 +3407,7 @@
       </w:pPr>
     </w:lvl>
     <w:lvl w:ilvl="2">
-      <w:tmpl w:val="26981617"/>
+      <w:tmpl w:val="A233336B"/>
       <w:start w:val="1"/>
       <w:numFmt w:val="lowerRoman"/>
       <w:lvlText w:val="%3."/>
@@ -3402,7 +3417,7 @@
       </w:pPr>
     </w:lvl>
     <w:lvl w:ilvl="3">
-      <w:tmpl w:val="25EC7B61"/>
+      <w:tmpl w:val="DFC7D852"/>
       <w:start w:val="1"/>
       <w:numFmt w:val="decimal"/>
       <w:lvlText w:val="%4."/>
@@ -3412,7 +3427,7 @@
       </w:pPr>
     </w:lvl>
     <w:lvl w:ilvl="4">
-      <w:tmpl w:val="5FFCF9DD"/>
+      <w:tmpl w:val="CF42A0C7"/>
       <w:start w:val="1"/>
       <w:numFmt w:val="lowerLetter"/>
       <w:lvlText w:val="%5."/>
@@ -3422,7 +3437,7 @@
       </w:pPr>
     </w:lvl>
     <w:lvl w:ilvl="5">
-      <w:tmpl w:val="2F152449"/>
+      <w:tmpl w:val="DE5252EA"/>
       <w:start w:val="1"/>
       <w:numFmt w:val="lowerRoman"/>
       <w:lvlText w:val="%6."/>
@@ -3432,7 +3447,7 @@
       </w:pPr>
     </w:lvl>
     <w:lvl w:ilvl="6">
-      <w:tmpl w:val="4D3D1337"/>
+      <w:tmpl w:val="B06E64FE"/>
       <w:start w:val="1"/>
       <w:numFmt w:val="decimal"/>
       <w:lvlText w:val="%7."/>
@@ -3442,7 +3457,7 @@
       </w:pPr>
     </w:lvl>
     <w:lvl w:ilvl="7">
-      <w:tmpl w:val="6FF76EBB"/>
+      <w:tmpl w:val="92666152"/>
       <w:start w:val="1"/>
       <w:numFmt w:val="lowerLetter"/>
       <w:lvlText w:val="%8."/>
@@ -3452,7 +3467,7 @@
       </w:pPr>
     </w:lvl>
     <w:lvl w:ilvl="8">
-      <w:tmpl w:val="E32562BF"/>
+      <w:tmpl w:val="912A393B"/>
       <w:start w:val="1"/>
       <w:numFmt w:val="lowerRoman"/>
       <w:lvlText w:val="%9."/>
@@ -3465,7 +3480,7 @@
   <w:abstractNum w:abstractNumId="13">
     <w:multiLevelType w:val="hybridMultilevel"/>
     <w:lvl w:ilvl="0">
-      <w:tmpl w:val="0B2DCFE2"/>
+      <w:tmpl w:val="585FBE65"/>
       <w:numFmt w:val="bullet"/>
       <w:lvlText w:val=""/>
       <w:rPr>
@@ -3477,7 +3492,7 @@
       </w:pPr>
     </w:lvl>
     <w:lvl w:ilvl="1">
-      <w:tmpl w:val="F1358F1C"/>
+      <w:tmpl w:val="8BC7E749"/>
       <w:numFmt w:val="bullet"/>
       <w:lvlText w:val="o"/>
       <w:rPr>
@@ -3489,7 +3504,7 @@
       </w:pPr>
     </w:lvl>
     <w:lvl w:ilvl="2">
-      <w:tmpl w:val="E8666A06"/>
+      <w:tmpl w:val="D1C7DEC3"/>
       <w:numFmt w:val="bullet"/>
       <w:lvlText w:val=""/>
       <w:rPr>
@@ -3501,7 +3516,7 @@
       </w:pPr>
     </w:lvl>
     <w:lvl w:ilvl="3">
-      <w:tmpl w:val="97501307"/>
+      <w:tmpl w:val="BD31D7CC"/>
       <w:numFmt w:val="bullet"/>
       <w:lvlText w:val=""/>
       <w:rPr>
@@ -3513,7 +3528,7 @@
       </w:pPr>
     </w:lvl>
     <w:lvl w:ilvl="4">
-      <w:tmpl w:val="73B9D5BD"/>
+      <w:tmpl w:val="48911343"/>
       <w:numFmt w:val="bullet"/>
       <w:lvlText w:val="o"/>
       <w:rPr>
@@ -3525,7 +3540,7 @@
       </w:pPr>
     </w:lvl>
     <w:lvl w:ilvl="5">
-      <w:tmpl w:val="4A6442FB"/>
+      <w:tmpl w:val="A007C9C7"/>
       <w:numFmt w:val="bullet"/>
       <w:lvlText w:val=""/>
       <w:rPr>
@@ -3537,7 +3552,7 @@
       </w:pPr>
     </w:lvl>
     <w:lvl w:ilvl="6">
-      <w:tmpl w:val="ADE1EB21"/>
+      <w:tmpl w:val="710B4754"/>
       <w:numFmt w:val="bullet"/>
       <w:lvlText w:val=""/>
       <w:rPr>
@@ -3549,7 +3564,7 @@
       </w:pPr>
     </w:lvl>
     <w:lvl w:ilvl="7">
-      <w:tmpl w:val="8E19E120"/>
+      <w:tmpl w:val="D4B8C2B3"/>
       <w:numFmt w:val="bullet"/>
       <w:lvlText w:val="o"/>
       <w:rPr>
@@ -3561,7 +3576,7 @@
       </w:pPr>
     </w:lvl>
     <w:lvl w:ilvl="8">
-      <w:tmpl w:val="15982935"/>
+      <w:tmpl w:val="9B05293D"/>
       <w:numFmt w:val="bullet"/>
       <w:lvlText w:val=""/>
       <w:rPr>
@@ -3576,7 +3591,7 @@
   <w:abstractNum w:abstractNumId="14">
     <w:multiLevelType w:val="hybridMultilevel"/>
     <w:lvl w:ilvl="0">
-      <w:tmpl w:val="2C8A05C1"/>
+      <w:tmpl w:val="F8A51FC1"/>
       <w:numFmt w:val="bullet"/>
       <w:lvlText w:val=""/>
       <w:rPr>
@@ -3588,7 +3603,7 @@
       </w:pPr>
     </w:lvl>
     <w:lvl w:ilvl="1">
-      <w:tmpl w:val="86EAEC25"/>
+      <w:tmpl w:val="624AA914"/>
       <w:numFmt w:val="bullet"/>
       <w:lvlText w:val="o"/>
       <w:rPr>
@@ -3600,7 +3615,7 @@
       </w:pPr>
     </w:lvl>
     <w:lvl w:ilvl="2">
-      <w:tmpl w:val="74669C2C"/>
+      <w:tmpl w:val="B2A1F9A8"/>
       <w:numFmt w:val="bullet"/>
       <w:lvlText w:val=""/>
       <w:rPr>
@@ -3612,7 +3627,7 @@
       </w:pPr>
     </w:lvl>
     <w:lvl w:ilvl="3">
-      <w:tmpl w:val="A3E1AB5D"/>
+      <w:tmpl w:val="3BE176FA"/>
       <w:numFmt w:val="bullet"/>
       <w:lvlText w:val=""/>
       <w:rPr>
@@ -3624,7 +3639,7 @@
       </w:pPr>
     </w:lvl>
     <w:lvl w:ilvl="4">
-      <w:tmpl w:val="170DBF52"/>
+      <w:tmpl w:val="FA023F1C"/>
       <w:numFmt w:val="bullet"/>
       <w:lvlText w:val="o"/>
       <w:rPr>
@@ -3636,7 +3651,7 @@
       </w:pPr>
     </w:lvl>
     <w:lvl w:ilvl="5">
-      <w:tmpl w:val="5DAC48D4"/>
+      <w:tmpl w:val="0E8B05BE"/>
       <w:numFmt w:val="bullet"/>
       <w:lvlText w:val=""/>
       <w:rPr>
@@ -3648,7 +3663,7 @@
       </w:pPr>
     </w:lvl>
     <w:lvl w:ilvl="6">
-      <w:tmpl w:val="D70D537D"/>
+      <w:tmpl w:val="D234A0DB"/>
       <w:numFmt w:val="bullet"/>
       <w:lvlText w:val=""/>
       <w:rPr>
@@ -3660,7 +3675,7 @@
       </w:pPr>
     </w:lvl>
     <w:lvl w:ilvl="7">
-      <w:tmpl w:val="AFD3A9B8"/>
+      <w:tmpl w:val="23073377"/>
       <w:numFmt w:val="bullet"/>
       <w:lvlText w:val="o"/>
       <w:rPr>
@@ -3672,7 +3687,7 @@
       </w:pPr>
     </w:lvl>
     <w:lvl w:ilvl="8">
-      <w:tmpl w:val="07428A64"/>
+      <w:tmpl w:val="8500520D"/>
       <w:numFmt w:val="bullet"/>
       <w:lvlText w:val=""/>
       <w:rPr>
@@ -3687,7 +3702,7 @@
   <w:abstractNum w:abstractNumId="15">
     <w:multiLevelType w:val="hybridMultilevel"/>
     <w:lvl w:ilvl="0">
-      <w:tmpl w:val="EF3FBD0A"/>
+      <w:tmpl w:val="C2868EC9"/>
       <w:start w:val="1"/>
       <w:numFmt w:val="decimal"/>
       <w:lvlText w:val="%1."/>
@@ -3697,7 +3712,7 @@
       </w:pPr>
     </w:lvl>
     <w:lvl w:ilvl="1">
-      <w:tmpl w:val="D3F1BAD6"/>
+      <w:tmpl w:val="FA5C66FC"/>
       <w:start w:val="1"/>
       <w:numFmt w:val="lowerLetter"/>
       <w:lvlText w:val="%2."/>
@@ -3707,7 +3722,7 @@
       </w:pPr>
     </w:lvl>
     <w:lvl w:ilvl="2">
-      <w:tmpl w:val="891FA53C"/>
+      <w:tmpl w:val="64E7B684"/>
       <w:start w:val="1"/>
       <w:numFmt w:val="lowerRoman"/>
       <w:lvlText w:val="%3."/>
@@ -3717,7 +3732,7 @@
       </w:pPr>
     </w:lvl>
     <w:lvl w:ilvl="3">
-      <w:tmpl w:val="45EE4295"/>
+      <w:tmpl w:val="4E41F270"/>
       <w:start w:val="1"/>
       <w:numFmt w:val="decimal"/>
       <w:lvlText w:val="%4."/>
@@ -3727,7 +3742,7 @@
       </w:pPr>
     </w:lvl>
     <w:lvl w:ilvl="4">
-      <w:tmpl w:val="67711BC8"/>
+      <w:tmpl w:val="C467215A"/>
       <w:start w:val="1"/>
       <w:numFmt w:val="lowerLetter"/>
       <w:lvlText w:val="%5."/>
@@ -3737,7 +3752,7 @@
       </w:pPr>
     </w:lvl>
     <w:lvl w:ilvl="5">
-      <w:tmpl w:val="ED21B2E0"/>
+      <w:tmpl w:val="82ABF36C"/>
       <w:start w:val="1"/>
       <w:numFmt w:val="lowerRoman"/>
       <w:lvlText w:val="%6."/>
@@ -3747,7 +3762,7 @@
       </w:pPr>
     </w:lvl>
     <w:lvl w:ilvl="6">
-      <w:tmpl w:val="0975F62E"/>
+      <w:tmpl w:val="25E6C906"/>
       <w:start w:val="1"/>
       <w:numFmt w:val="decimal"/>
       <w:lvlText w:val="%7."/>
@@ -3757,7 +3772,7 @@
       </w:pPr>
     </w:lvl>
     <w:lvl w:ilvl="7">
-      <w:tmpl w:val="AE5D755F"/>
+      <w:tmpl w:val="1F4CB2C3"/>
       <w:start w:val="1"/>
       <w:numFmt w:val="lowerLetter"/>
       <w:lvlText w:val="%8."/>
@@ -3767,7 +3782,7 @@
       </w:pPr>
     </w:lvl>
     <w:lvl w:ilvl="8">
-      <w:tmpl w:val="06231849"/>
+      <w:tmpl w:val="1875CBEC"/>
       <w:start w:val="1"/>
       <w:numFmt w:val="lowerRoman"/>
       <w:lvlText w:val="%9."/>
@@ -3780,7 +3795,7 @@
   <w:abstractNum w:abstractNumId="16">
     <w:multiLevelType w:val="hybridMultilevel"/>
     <w:lvl w:ilvl="0">
-      <w:tmpl w:val="C5202BD1"/>
+      <w:tmpl w:val="80E4D12D"/>
       <w:numFmt w:val="bullet"/>
       <w:lvlText w:val=""/>
       <w:rPr>
@@ -3792,7 +3807,7 @@
       </w:pPr>
     </w:lvl>
     <w:lvl w:ilvl="1">
-      <w:tmpl w:val="C4EC0DBF"/>
+      <w:tmpl w:val="C8858BF1"/>
       <w:numFmt w:val="bullet"/>
       <w:lvlText w:val="o"/>
       <w:rPr>
@@ -3804,7 +3819,7 @@
       </w:pPr>
     </w:lvl>
     <w:lvl w:ilvl="2">
-      <w:tmpl w:val="CEA23E40"/>
+      <w:tmpl w:val="1BCC69DD"/>
       <w:numFmt w:val="bullet"/>
       <w:lvlText w:val=""/>
       <w:rPr>
@@ -3816,7 +3831,7 @@
       </w:pPr>
     </w:lvl>
     <w:lvl w:ilvl="3">
-      <w:tmpl w:val="4B5A6B79"/>
+      <w:tmpl w:val="AFADEFA0"/>
       <w:numFmt w:val="bullet"/>
       <w:lvlText w:val=""/>
       <w:rPr>
@@ -3828,7 +3843,7 @@
       </w:pPr>
     </w:lvl>
     <w:lvl w:ilvl="4">
-      <w:tmpl w:val="F348F764"/>
+      <w:tmpl w:val="9D9DF322"/>
       <w:numFmt w:val="bullet"/>
       <w:lvlText w:val="o"/>
       <w:rPr>
@@ -3840,7 +3855,7 @@
       </w:pPr>
     </w:lvl>
     <w:lvl w:ilvl="5">
-      <w:tmpl w:val="0F44A5EC"/>
+      <w:tmpl w:val="6F366438"/>
       <w:numFmt w:val="bullet"/>
       <w:lvlText w:val=""/>
       <w:rPr>
@@ -3852,7 +3867,7 @@
       </w:pPr>
     </w:lvl>
     <w:lvl w:ilvl="6">
-      <w:tmpl w:val="E2854B5E"/>
+      <w:tmpl w:val="3ADCE3F4"/>
       <w:numFmt w:val="bullet"/>
       <w:lvlText w:val=""/>
       <w:rPr>
@@ -3864,7 +3879,7 @@
       </w:pPr>
     </w:lvl>
     <w:lvl w:ilvl="7">
-      <w:tmpl w:val="960F32B0"/>
+      <w:tmpl w:val="7E9EC9EE"/>
       <w:numFmt w:val="bullet"/>
       <w:lvlText w:val="o"/>
       <w:rPr>
@@ -3876,7 +3891,7 @@
       </w:pPr>
     </w:lvl>
     <w:lvl w:ilvl="8">
-      <w:tmpl w:val="0C1ACD74"/>
+      <w:tmpl w:val="567E6052"/>
       <w:numFmt w:val="bullet"/>
       <w:lvlText w:val=""/>
       <w:rPr>
@@ -3891,7 +3906,7 @@
   <w:abstractNum w:abstractNumId="17">
     <w:multiLevelType w:val="hybridMultilevel"/>
     <w:lvl w:ilvl="0">
-      <w:tmpl w:val="ECB15161"/>
+      <w:tmpl w:val="69A604B9"/>
       <w:start w:val="1"/>
       <w:numFmt w:val="decimal"/>
       <w:lvlText w:val="%1."/>
@@ -3901,7 +3916,7 @@
       </w:pPr>
     </w:lvl>
     <w:lvl w:ilvl="1">
-      <w:tmpl w:val="6064685D"/>
+      <w:tmpl w:val="A8FC5D18"/>
       <w:start w:val="1"/>
       <w:numFmt w:val="lowerLetter"/>
       <w:lvlText w:val="%2."/>
@@ -3911,7 +3926,7 @@
       </w:pPr>
     </w:lvl>
     <w:lvl w:ilvl="2">
-      <w:tmpl w:val="8849426D"/>
+      <w:tmpl w:val="00DD9189"/>
       <w:start w:val="1"/>
       <w:numFmt w:val="lowerRoman"/>
       <w:lvlText w:val="%3."/>
@@ -3921,7 +3936,7 @@
       </w:pPr>
     </w:lvl>
     <w:lvl w:ilvl="3">
-      <w:tmpl w:val="2452C2B0"/>
+      <w:tmpl w:val="11096AFA"/>
       <w:start w:val="1"/>
       <w:numFmt w:val="decimal"/>
       <w:lvlText w:val="%4."/>
@@ -3931,7 +3946,7 @@
       </w:pPr>
     </w:lvl>
     <w:lvl w:ilvl="4">
-      <w:tmpl w:val="87ED3E3E"/>
+      <w:tmpl w:val="1894D330"/>
       <w:start w:val="1"/>
       <w:numFmt w:val="lowerLetter"/>
       <w:lvlText w:val="%5."/>
@@ -3941,7 +3956,7 @@
       </w:pPr>
     </w:lvl>
     <w:lvl w:ilvl="5">
-      <w:tmpl w:val="E7CA9318"/>
+      <w:tmpl w:val="B836FA12"/>
       <w:start w:val="1"/>
       <w:numFmt w:val="lowerRoman"/>
       <w:lvlText w:val="%6."/>
@@ -3951,7 +3966,7 @@
       </w:pPr>
     </w:lvl>
     <w:lvl w:ilvl="6">
-      <w:tmpl w:val="C330CB71"/>
+      <w:tmpl w:val="E62E7942"/>
       <w:start w:val="1"/>
       <w:numFmt w:val="decimal"/>
       <w:lvlText w:val="%7."/>
@@ -3961,7 +3976,7 @@
       </w:pPr>
     </w:lvl>
     <w:lvl w:ilvl="7">
-      <w:tmpl w:val="B4ADE87B"/>
+      <w:tmpl w:val="D564D9A3"/>
       <w:start w:val="1"/>
       <w:numFmt w:val="lowerLetter"/>
       <w:lvlText w:val="%8."/>
@@ -3971,7 +3986,7 @@
       </w:pPr>
     </w:lvl>
     <w:lvl w:ilvl="8">
-      <w:tmpl w:val="85E1B3AA"/>
+      <w:tmpl w:val="3E38351A"/>
       <w:start w:val="1"/>
       <w:numFmt w:val="lowerRoman"/>
       <w:lvlText w:val="%9."/>
@@ -3984,7 +3999,7 @@
   <w:abstractNum w:abstractNumId="18">
     <w:multiLevelType w:val="hybridMultilevel"/>
     <w:lvl w:ilvl="0">
-      <w:tmpl w:val="5046D70C"/>
+      <w:tmpl w:val="24C67C6F"/>
       <w:numFmt w:val="bullet"/>
       <w:lvlText w:val=""/>
       <w:rPr>
@@ -3996,7 +4011,7 @@
       </w:pPr>
     </w:lvl>
     <w:lvl w:ilvl="1">
-      <w:tmpl w:val="379E9F20"/>
+      <w:tmpl w:val="64938A1B"/>
       <w:numFmt w:val="bullet"/>
       <w:lvlText w:val="o"/>
       <w:rPr>
@@ -4008,7 +4023,7 @@
       </w:pPr>
     </w:lvl>
     <w:lvl w:ilvl="2">
-      <w:tmpl w:val="E37E6F4B"/>
+      <w:tmpl w:val="E8A12B69"/>
       <w:numFmt w:val="bullet"/>
       <w:lvlText w:val=""/>
       <w:rPr>
@@ -4020,7 +4035,7 @@
       </w:pPr>
     </w:lvl>
     <w:lvl w:ilvl="3">
-      <w:tmpl w:val="FDD52E31"/>
+      <w:tmpl w:val="6CEB0D67"/>
       <w:numFmt w:val="bullet"/>
       <w:lvlText w:val=""/>
       <w:rPr>
@@ -4032,7 +4047,7 @@
       </w:pPr>
     </w:lvl>
     <w:lvl w:ilvl="4">
-      <w:tmpl w:val="7ED8655D"/>
+      <w:tmpl w:val="BDCC9E3E"/>
       <w:numFmt w:val="bullet"/>
       <w:lvlText w:val="o"/>
       <w:rPr>
@@ -4044,7 +4059,7 @@
       </w:pPr>
     </w:lvl>
     <w:lvl w:ilvl="5">
-      <w:tmpl w:val="3DA454A9"/>
+      <w:tmpl w:val="4B0B3CC0"/>
       <w:numFmt w:val="bullet"/>
       <w:lvlText w:val=""/>
       <w:rPr>
@@ -4056,7 +4071,7 @@
       </w:pPr>
     </w:lvl>
     <w:lvl w:ilvl="6">
-      <w:tmpl w:val="2F179A25"/>
+      <w:tmpl w:val="5D1D0256"/>
       <w:numFmt w:val="bullet"/>
       <w:lvlText w:val=""/>
       <w:rPr>
@@ -4068,7 +4083,7 @@
       </w:pPr>
     </w:lvl>
     <w:lvl w:ilvl="7">
-      <w:tmpl w:val="CACFABCD"/>
+      <w:tmpl w:val="0BC089B5"/>
       <w:numFmt w:val="bullet"/>
       <w:lvlText w:val="o"/>
       <w:rPr>
@@ -4080,7 +4095,7 @@
       </w:pPr>
     </w:lvl>
     <w:lvl w:ilvl="8">
-      <w:tmpl w:val="A73751AD"/>
+      <w:tmpl w:val="9BD33517"/>
       <w:numFmt w:val="bullet"/>
       <w:lvlText w:val=""/>
       <w:rPr>
@@ -5736,7 +5751,7 @@
   <Source>
     <Tag>fielding2000</Tag>
     <SourceType>Book</SourceType>
-    <Guid>{fe023994-00c6-4e68-b856-ffd72a00e92a}</Guid>
+    <Guid>{af588a9b-a827-4b4c-acfa-5d617665ec3c}</Guid>
     <LCID>0</LCID>
     <Title>Architectural Styles and the Design of Network-based Software Architectures</Title>
     <Year>2000</Year>
@@ -5756,7 +5771,7 @@
   <Source>
     <Tag>humble2010</Tag>
     <SourceType>Book</SourceType>
-    <Guid>{98a1bcab-e437-41bf-959d-4961eeebeceb}</Guid>
+    <Guid>{0d6d2498-f1c2-4981-9dbc-bf078fa76dc7}</Guid>
     <LCID>0</LCID>
     <Title>Continuous Delivery</Title>
     <Year>2010</Year>
@@ -5781,7 +5796,7 @@
   <Source>
     <Tag>fowler2018</Tag>
     <SourceType>BookSection</SourceType>
-    <Guid>{7c5e94d7-c87b-4c2c-ad91-4e4554474997}</Guid>
+    <Guid>{1e09481e-d48b-4039-9524-1c35bbf9ff86}</Guid>
     <LCID>0</LCID>
     <Title>Configuration Patterns</Title>
     <BookTitle>Refactoring -- Improving the Design of Existing Code</BookTitle>
@@ -5811,7 +5826,7 @@
   <Source>
     <Tag>markdig2024</Tag>
     <SourceType>InternetSite</SourceType>
-    <Guid>{80dea4f0-2d55-469d-a860-08f14794bad4}</Guid>
+    <Guid>{41ec2755-be24-45ea-ae25-f1cdbbf916f4}</Guid>
     <LCID>0</LCID>
     <InternetSiteTitle>Markdig -- A Fast, Powerful, CommonMark Compliant Markdown Processor</InternetSiteTitle>
     <YearAccessed>2026</YearAccessed>
@@ -5832,7 +5847,7 @@
   <Source>
     <Tag>sixlabors2023</Tag>
     <SourceType>InternetSite</SourceType>
-    <Guid>{b2f0409b-4d30-493c-b5c7-d54cc106f1c2}</Guid>
+    <Guid>{55bd87b5-dd30-47f6-a115-66e299f1759b}</Guid>
     <LCID>0</LCID>
     <InternetSiteTitle>ImageSharp -- A Modern, Cross-Platform, 2D Graphics Library</InternetSiteTitle>
     <YearAccessed>2026</YearAccessed>
@@ -5843,7 +5858,7 @@
   <Source>
     <Tag>microsoftOpenXml</Tag>
     <SourceType>DocumentFromInternetSite</SourceType>
-    <Guid>{a6f53d06-c4b7-4c13-b011-e895a468d226}</Guid>
+    <Guid>{587a2b52-3fd5-4817-9224-2d14e7ec7f70}</Guid>
     <LCID>0</LCID>
     <InternetSiteTitle>Open XML SDK Documentation</InternetSiteTitle>
     <Year>2023</Year>
@@ -5866,7 +5881,7 @@
   <Source>
     <Tag>openxmlWebSite2024</Tag>
     <SourceType>InternetSite</SourceType>
-    <Guid>{86b60e39-f71c-4a78-b260-e8f81580855b}</Guid>
+    <Guid>{2f9d0030-23f7-4b49-8295-29d28085491e}</Guid>
     <LCID>0</LCID>
     <InternetSiteTitle>ECMA-376 Office Open XML File Formats</InternetSiteTitle>
     <YearAccessed>2026</YearAccessed>
@@ -5877,7 +5892,7 @@
   <Source>
     <Tag>techWritingCase2019</Tag>
     <SourceType>JournalArticle</SourceType>
-    <Guid>{6bbec312-4b5c-40f6-a33b-bcc934a5f10f}</Guid>
+    <Guid>{38e3fbf5-200e-43ee-93bf-be05bcbfd769}</Guid>
     <LCID>0</LCID>
     <Title>Technological Developments in Document and Information Design</Title>
     <JournalName>Journal of Technical Writing and Communication</JournalName>

</xml_diff>

<commit_message>
Implement internal cross-references and bookmark support in DOCX output
</commit_message>
<xml_diff>
--- a/sample/output.docx
+++ b/sample/output.docx
@@ -88,6 +88,8 @@
       <w:pPr>
         <w:pStyle w:val="Heading1"/>
       </w:pPr>
+      <w:bookmarkStart w:name="project-example-markdown-features" w:id="1"/>
+      <w:bookmarkEnd w:id="1"/>
       <w:r>
         <w:t xml:space="preserve">Project Example: Markdown Features</w:t>
       </w:r>
@@ -104,6 +106,8 @@
       <w:pPr>
         <w:pStyle w:val="Heading2"/>
       </w:pPr>
+      <w:bookmarkStart w:name="overview" w:id="2"/>
+      <w:bookmarkEnd w:id="2"/>
       <w:r>
         <w:t xml:space="preserve">Overview</w:t>
       </w:r>
@@ -144,6 +148,58 @@
       </w:r>
       <w:r>
         <w:t xml:space="preserve">formatting.</w:t>
+      </w:r>
+    </w:p>
+    <w:p>
+      <w:pPr>
+        <w:pStyle w:val="Body2"/>
+      </w:pPr>
+      <w:r>
+        <w:t xml:space="preserve">Quick links: </w:t>
+      </w:r>
+      <w:hyperlink w:history="true" w:anchor="install">
+        <w:r>
+          <w:rPr>
+            <w:rStyle w:val="Hyperlink"/>
+          </w:rPr>
+          <w:t xml:space="preserve">Installation</w:t>
+        </w:r>
+      </w:hyperlink>
+      <w:r>
+        <w:t xml:space="preserve">, </w:t>
+      </w:r>
+      <w:hyperlink w:history="true" w:anchor="tbl-config-options">
+        <w:r>
+          <w:rPr>
+            <w:rStyle w:val="Hyperlink"/>
+          </w:rPr>
+          <w:t xml:space="preserve">Configuration table</w:t>
+        </w:r>
+      </w:hyperlink>
+      <w:r>
+        <w:t xml:space="preserve">, </w:t>
+      </w:r>
+      <w:hyperlink w:history="true" w:anchor="api-get-items">
+        <w:r>
+          <w:rPr>
+            <w:rStyle w:val="Hyperlink"/>
+          </w:rPr>
+          <w:t xml:space="preserve">Primary API endpoint</w:t>
+        </w:r>
+      </w:hyperlink>
+      <w:r>
+        <w:t xml:space="preserve">, and </w:t>
+      </w:r>
+      <w:hyperlink w:history="true" w:anchor="fig-sample-placeholder">
+        <w:r>
+          <w:rPr>
+            <w:rStyle w:val="Hyperlink"/>
+          </w:rPr>
+          <w:t xml:space="preserve">sample image</w:t>
+        </w:r>
+      </w:hyperlink>
+      <w:r>
+        <w:t xml:space="preserve">.</w:t>
       </w:r>
     </w:p>
     <w:p>
@@ -330,6 +386,8 @@
       <w:pPr>
         <w:pStyle w:val="Heading3"/>
       </w:pPr>
+      <w:bookmarkStart w:name="details-level-3" w:id="3"/>
+      <w:bookmarkEnd w:id="3"/>
       <w:r>
         <w:t xml:space="preserve">Details (Level 3)</w:t>
       </w:r>
@@ -408,6 +466,8 @@
       <w:pPr>
         <w:pStyle w:val="Heading4"/>
       </w:pPr>
+      <w:bookmarkStart w:name="notes-level-4" w:id="4"/>
+      <w:bookmarkEnd w:id="4"/>
       <w:r>
         <w:t xml:space="preserve">Notes (Level 4)</w:t>
       </w:r>
@@ -472,6 +532,97 @@
       <w:pPr>
         <w:pStyle w:val="Heading1"/>
       </w:pPr>
+      <w:bookmarkStart w:name="page-breaks-and-whitespace" w:id="5"/>
+      <w:bookmarkEnd w:id="5"/>
+      <w:r>
+        <w:t xml:space="preserve">Page Breaks and Whitespace</w:t>
+      </w:r>
+    </w:p>
+    <w:p>
+      <w:pPr>
+        <w:pStyle w:val="Body1"/>
+      </w:pPr>
+      <w:r>
+        <w:t xml:space="preserve">This section demonstrates how to force content onto a new page and manage vertical whitespace.</w:t>
+      </w:r>
+    </w:p>
+    <w:p>
+      <w:pPr>
+        <w:pStyle w:val="Heading2"/>
+      </w:pPr>
+      <w:bookmarkStart w:name="example-page-break" w:id="6"/>
+      <w:bookmarkEnd w:id="6"/>
+      <w:r>
+        <w:t xml:space="preserve">Example Page Break</w:t>
+      </w:r>
+    </w:p>
+    <w:p>
+      <w:pPr>
+        <w:pStyle w:val="Body2"/>
+      </w:pPr>
+      <w:r>
+        <w:t xml:space="preserve">Below this paragraph is a hard page break.</w:t>
+      </w:r>
+    </w:p>
+    <w:p>
+      <w:pPr>
+        <w:pStyle w:val="Body2"/>
+      </w:pPr>
+      <w:r>
+        <w:br w:type="page"/>
+      </w:r>
+    </w:p>
+    <w:p>
+      <w:pPr>
+        <w:pStyle w:val="Body2"/>
+      </w:pPr>
+      <w:r>
+        <w:t xml:space="preserve">This content starts on a new page.</w:t>
+      </w:r>
+    </w:p>
+    <w:p>
+      <w:pPr>
+        <w:pStyle w:val="Heading2"/>
+      </w:pPr>
+      <w:bookmarkStart w:name="empty-paragraph-example" w:id="7"/>
+      <w:bookmarkEnd w:id="7"/>
+      <w:r>
+        <w:t xml:space="preserve">Empty Paragraph Example</w:t>
+      </w:r>
+    </w:p>
+    <w:p>
+      <w:pPr>
+        <w:pStyle w:val="Body2"/>
+      </w:pPr>
+      <w:r>
+        <w:t xml:space="preserve">Sometimes you need a little more space. The line below this has </w:t>
+      </w:r>
+      <w:r>
+        <w:t xml:space="preserve">&amp;nbsp;</w:t>
+      </w:r>
+      <w:r>
+        <w:t xml:space="preserve">:</w:t>
+      </w:r>
+    </w:p>
+    <w:p>
+      <w:pPr>
+        <w:pStyle w:val="Body2"/>
+      </w:pPr>
+    </w:p>
+    <w:p>
+      <w:pPr>
+        <w:pStyle w:val="Body2"/>
+      </w:pPr>
+      <w:r>
+        <w:t xml:space="preserve">This text follows an empty paragraph.</w:t>
+      </w:r>
+    </w:p>
+    <w:p>
+      <w:pPr>
+        <w:pStyle w:val="Heading1"/>
+      </w:pPr>
+      <w:bookmarkStart w:name="usage-examples" w:id="8"/>
+      <w:bookmarkEnd w:id="8"/>
       <w:r>
         <w:t xml:space="preserve">Usage Examples</w:t>
       </w:r>
@@ -488,6 +639,8 @@
       <w:pPr>
         <w:pStyle w:val="Heading2"/>
       </w:pPr>
+      <w:bookmarkStart w:name="install" w:id="9"/>
+      <w:bookmarkEnd w:id="9"/>
       <w:r>
         <w:t xml:space="preserve">Installation</w:t>
       </w:r>
@@ -498,6 +651,36 @@
       </w:pPr>
       <w:r>
         <w:t xml:space="preserve">Instructions and lists for install.</w:t>
+      </w:r>
+    </w:p>
+    <w:p>
+      <w:pPr>
+        <w:pStyle w:val="Body2"/>
+      </w:pPr>
+      <w:r>
+        <w:t xml:space="preserve">See </w:t>
+      </w:r>
+      <w:hyperlink w:history="true" w:anchor="install-download">
+        <w:r>
+          <w:rPr>
+            <w:rStyle w:val="Hyperlink"/>
+          </w:rPr>
+          <w:t xml:space="preserve">download step</w:t>
+        </w:r>
+      </w:hyperlink>
+      <w:r>
+        <w:t xml:space="preserve"> and </w:t>
+      </w:r>
+      <w:hyperlink w:history="true" w:anchor="install-run">
+        <w:r>
+          <w:rPr>
+            <w:rStyle w:val="Hyperlink"/>
+          </w:rPr>
+          <w:t xml:space="preserve">run installer step</w:t>
+        </w:r>
+      </w:hyperlink>
+      <w:r>
+        <w:t xml:space="preserve">.</w:t>
       </w:r>
     </w:p>
     <w:p>
@@ -508,8 +691,10 @@
           <w:numId w:val="11"/>
         </w:numPr>
       </w:pPr>
-      <w:r>
-        <w:t xml:space="preserve">Download package</w:t>
+      <w:bookmarkStart w:name="install-download" w:id="10"/>
+      <w:bookmarkEnd w:id="10"/>
+      <w:r>
+        <w:t xml:space="preserve">Download package </w:t>
       </w:r>
     </w:p>
     <w:p>
@@ -532,8 +717,10 @@
           <w:numId w:val="12"/>
         </w:numPr>
       </w:pPr>
-      <w:r>
-        <w:t xml:space="preserve">Run installer</w:t>
+      <w:bookmarkStart w:name="install-run" w:id="11"/>
+      <w:bookmarkEnd w:id="11"/>
+      <w:r>
+        <w:t xml:space="preserve">Run installer </w:t>
       </w:r>
     </w:p>
     <w:p>
@@ -552,6 +739,8 @@
       <w:pPr>
         <w:pStyle w:val="Heading3"/>
       </w:pPr>
+      <w:bookmarkStart w:name="configuration" w:id="12"/>
+      <w:bookmarkEnd w:id="12"/>
       <w:r>
         <w:t xml:space="preserve">Configuration</w:t>
       </w:r>
@@ -569,6 +758,8 @@
         <w:pStyle w:val="Caption"/>
         <w:jc w:val="center"/>
       </w:pPr>
+      <w:bookmarkStart w:name="tbl-config-options" w:id="13"/>
+      <w:bookmarkEnd w:id="13"/>
       <w:r>
         <w:t xml:space="preserve">Table </w:t>
       </w:r>
@@ -620,12 +811,8 @@
           <w:p>
             <w:pPr>
               <w:pStyle w:val="Normal"/>
-              <w:jc w:val="center"/>
             </w:pPr>
             <w:r>
-              <w:rPr>
-                <w:b/>
-              </w:rPr>
               <w:t xml:space="preserve">Option</w:t>
             </w:r>
           </w:p>
@@ -642,12 +829,8 @@
           <w:p>
             <w:pPr>
               <w:pStyle w:val="Normal"/>
-              <w:jc w:val="center"/>
             </w:pPr>
             <w:r>
-              <w:rPr>
-                <w:b/>
-              </w:rPr>
               <w:t xml:space="preserve">Description</w:t>
             </w:r>
           </w:p>
@@ -664,12 +847,8 @@
           <w:p>
             <w:pPr>
               <w:pStyle w:val="Normal"/>
-              <w:jc w:val="center"/>
             </w:pPr>
             <w:r>
-              <w:rPr>
-                <w:b/>
-              </w:rPr>
               <w:t xml:space="preserve">Default</w:t>
             </w:r>
           </w:p>
@@ -846,8 +1025,16 @@
     </w:tbl>
     <w:p>
       <w:pPr>
+        <w:pStyle w:val="Normal"/>
+        <w:spacing w:after="0" w:line="360" w:lineRule="auto"/>
+      </w:pPr>
+    </w:p>
+    <w:p>
+      <w:pPr>
         <w:pStyle w:val="Heading3"/>
       </w:pPr>
+      <w:bookmarkStart w:name="image-examples" w:id="14"/>
+      <w:bookmarkEnd w:id="14"/>
       <w:r>
         <w:t xml:space="preserve">Image</w:t>
       </w:r>
@@ -860,8 +1047,8 @@
         <w:drawing>
           <wp:inline distT="0" distB="0" distL="0" distR="0">
             <wp:extent cx="2857500" cy="2857500"/>
-            <wp:effectExtent l="0" t="0" r="0" b="0"/>
-            <wp:docPr id="96434640" name="Picture 96434640"/>
+            <wp:effectExtent l="6350" t="6350" r="6350" b="6350"/>
+            <wp:docPr id="1894536106" name="Picture 1894536106"/>
             <wp:cNvGraphicFramePr>
               <a:graphicFrameLocks xmlns:a="http://schemas.openxmlformats.org/drawingml/2006/main" noChangeAspect="1"/>
             </wp:cNvGraphicFramePr>
@@ -869,11 +1056,11 @@
               <a:graphicData uri="http://schemas.openxmlformats.org/drawingml/2006/picture">
                 <pic:pic xmlns:pic="http://schemas.openxmlformats.org/drawingml/2006/picture">
                   <pic:nvPicPr>
-                    <pic:cNvPr id="96434666" name="placeholder-500.png"/>
+                    <pic:cNvPr id="1894536183" name="placeholder-500.png"/>
                     <pic:cNvPicPr/>
                   </pic:nvPicPr>
                   <pic:blipFill>
-                    <a:blip r:embed="Rb7f343593bfb4cc5"/>
+                    <a:blip r:embed="R023f55e63b56447a"/>
                     <a:stretch>
                       <a:fillRect/>
                     </a:stretch>
@@ -904,6 +1091,8 @@
         <w:pStyle w:val="Caption"/>
         <w:jc w:val="center"/>
       </w:pPr>
+      <w:bookmarkStart w:name="fig-placeholder-square" w:id="15"/>
+      <w:bookmarkEnd w:id="15"/>
       <w:r>
         <w:t xml:space="preserve">Figure </w:t>
       </w:r>
@@ -937,8 +1126,8 @@
         <w:drawing>
           <wp:inline distT="0" distB="0" distL="0" distR="0">
             <wp:extent cx="3810000" cy="2857500"/>
-            <wp:effectExtent l="0" t="0" r="0" b="0"/>
-            <wp:docPr id="97135876" name="Picture 97135876"/>
+            <wp:effectExtent l="6350" t="6350" r="6350" b="6350"/>
+            <wp:docPr id="1895269132" name="Picture 1895269132"/>
             <wp:cNvGraphicFramePr>
               <a:graphicFrameLocks xmlns:a="http://schemas.openxmlformats.org/drawingml/2006/main" noChangeAspect="1"/>
             </wp:cNvGraphicFramePr>
@@ -946,11 +1135,11 @@
               <a:graphicData uri="http://schemas.openxmlformats.org/drawingml/2006/picture">
                 <pic:pic xmlns:pic="http://schemas.openxmlformats.org/drawingml/2006/picture">
                   <pic:nvPicPr>
-                    <pic:cNvPr id="97135879" name="placeholder-400-300.png"/>
+                    <pic:cNvPr id="1895269142" name="placeholder-400-300.png"/>
                     <pic:cNvPicPr/>
                   </pic:nvPicPr>
                   <pic:blipFill>
-                    <a:blip r:embed="R804db769e8aa45f7"/>
+                    <a:blip r:embed="R2d6b3988c4234623"/>
                     <a:stretch>
                       <a:fillRect/>
                     </a:stretch>
@@ -981,6 +1170,8 @@
         <w:pStyle w:val="Caption"/>
         <w:jc w:val="center"/>
       </w:pPr>
+      <w:bookmarkStart w:name="fig-placeholder-rect" w:id="16"/>
+      <w:bookmarkEnd w:id="16"/>
       <w:r>
         <w:t xml:space="preserve">Figure </w:t>
       </w:r>
@@ -1010,6 +1201,8 @@
       <w:pPr>
         <w:pStyle w:val="Heading4"/>
       </w:pPr>
+      <w:bookmarkStart w:name="advanced-level-4-repeat" w:id="17"/>
+      <w:bookmarkEnd w:id="17"/>
       <w:r>
         <w:t xml:space="preserve">Advanced (Level 4 repeat)</w:t>
       </w:r>
@@ -1145,6 +1338,8 @@
       <w:pPr>
         <w:pStyle w:val="Heading1"/>
       </w:pPr>
+      <w:bookmarkStart w:name="api-reference" w:id="18"/>
+      <w:bookmarkEnd w:id="18"/>
       <w:r>
         <w:t xml:space="preserve">API Reference</w:t>
       </w:r>
@@ -1161,6 +1356,8 @@
       <w:pPr>
         <w:pStyle w:val="Heading2"/>
       </w:pPr>
+      <w:bookmarkStart w:name="api-endpoints" w:id="19"/>
+      <w:bookmarkEnd w:id="19"/>
       <w:r>
         <w:t xml:space="preserve">Endpoints</w:t>
       </w:r>
@@ -1171,6 +1368,36 @@
       </w:pPr>
       <w:r>
         <w:t xml:space="preserve">Short description plus lists and formatting.</w:t>
+      </w:r>
+    </w:p>
+    <w:p>
+      <w:pPr>
+        <w:pStyle w:val="Body2"/>
+      </w:pPr>
+      <w:r>
+        <w:t xml:space="preserve">See </w:t>
+      </w:r>
+      <w:hyperlink w:history="true" w:anchor="configuration">
+        <w:r>
+          <w:rPr>
+            <w:rStyle w:val="Hyperlink"/>
+          </w:rPr>
+          <w:t xml:space="preserve">configuration section</w:t>
+        </w:r>
+      </w:hyperlink>
+      <w:r>
+        <w:t xml:space="preserve"> and </w:t>
+      </w:r>
+      <w:hyperlink w:history="true" w:anchor="fig-placeholder-square">
+        <w:r>
+          <w:rPr>
+            <w:rStyle w:val="Hyperlink"/>
+          </w:rPr>
+          <w:t xml:space="preserve">square image example</w:t>
+        </w:r>
+      </w:hyperlink>
+      <w:r>
+        <w:t xml:space="preserve">.</w:t>
       </w:r>
     </w:p>
     <w:p>
@@ -1181,8 +1408,10 @@
           <w:numId w:val="14"/>
         </w:numPr>
       </w:pPr>
-      <w:r>
-        <w:t xml:space="preserve">GET /items — Retrieve items</w:t>
+      <w:bookmarkStart w:name="api-get-items" w:id="20"/>
+      <w:bookmarkEnd w:id="20"/>
+      <w:r>
+        <w:t xml:space="preserve">GET /items — Retrieve items </w:t>
       </w:r>
     </w:p>
     <w:p>
@@ -1205,8 +1434,10 @@
           <w:numId w:val="15"/>
         </w:numPr>
       </w:pPr>
-      <w:r>
-        <w:t xml:space="preserve">Authenticate</w:t>
+      <w:bookmarkStart w:name="api-auth-step" w:id="21"/>
+      <w:bookmarkEnd w:id="21"/>
+      <w:r>
+        <w:t xml:space="preserve">Authenticate </w:t>
       </w:r>
     </w:p>
     <w:p>
@@ -1225,6 +1456,8 @@
       <w:pPr>
         <w:pStyle w:val="Heading3"/>
       </w:pPr>
+      <w:bookmarkStart w:name="request-example" w:id="22"/>
+      <w:bookmarkEnd w:id="22"/>
       <w:r>
         <w:t xml:space="preserve">Request Example</w:t>
       </w:r>
@@ -1300,6 +1533,8 @@
       <w:pPr>
         <w:pStyle w:val="Heading4"/>
       </w:pPr>
+      <w:bookmarkStart w:name="response-notes" w:id="23"/>
+      <w:bookmarkEnd w:id="23"/>
       <w:r>
         <w:t xml:space="preserve">Response Notes</w:t>
       </w:r>
@@ -1364,6 +1599,8 @@
       <w:pPr>
         <w:pStyle w:val="Heading1"/>
       </w:pPr>
+      <w:bookmarkStart w:name="images-section" w:id="24"/>
+      <w:bookmarkEnd w:id="24"/>
       <w:r>
         <w:t xml:space="preserve">Images</w:t>
       </w:r>
@@ -1376,8 +1613,8 @@
         <w:drawing>
           <wp:inline distT="0" distB="0" distL="0" distR="0">
             <wp:extent cx="3810000" cy="3810000"/>
-            <wp:effectExtent l="0" t="0" r="0" b="0"/>
-            <wp:docPr id="97150442" name="Picture 97150442"/>
+            <wp:effectExtent l="6350" t="6350" r="6350" b="6350"/>
+            <wp:docPr id="1895289427" name="Picture 1895289427"/>
             <wp:cNvGraphicFramePr>
               <a:graphicFrameLocks xmlns:a="http://schemas.openxmlformats.org/drawingml/2006/main" noChangeAspect="1"/>
             </wp:cNvGraphicFramePr>
@@ -1385,11 +1622,11 @@
               <a:graphicData uri="http://schemas.openxmlformats.org/drawingml/2006/picture">
                 <pic:pic xmlns:pic="http://schemas.openxmlformats.org/drawingml/2006/picture">
                   <pic:nvPicPr>
-                    <pic:cNvPr id="97150444" name="placeholder-500.png"/>
+                    <pic:cNvPr id="1895289448" name="placeholder-500.png"/>
                     <pic:cNvPicPr/>
                   </pic:nvPicPr>
                   <pic:blipFill>
-                    <a:blip r:embed="R0815e2051e3d4604"/>
+                    <a:blip r:embed="R2dc4da1addcf41f5"/>
                     <a:stretch>
                       <a:fillRect/>
                     </a:stretch>
@@ -1420,6 +1657,8 @@
         <w:pStyle w:val="Caption"/>
         <w:jc w:val="center"/>
       </w:pPr>
+      <w:bookmarkStart w:name="fig-sample-placeholder" w:id="25"/>
+      <w:bookmarkEnd w:id="25"/>
       <w:r>
         <w:t xml:space="preserve">Figure </w:t>
       </w:r>
@@ -1449,6 +1688,8 @@
       <w:pPr>
         <w:pStyle w:val="Heading1"/>
       </w:pPr>
+      <w:bookmarkStart w:name="appendix" w:id="26"/>
+      <w:bookmarkEnd w:id="26"/>
       <w:r>
         <w:t xml:space="preserve">Appendix</w:t>
       </w:r>
@@ -1465,6 +1706,8 @@
       <w:pPr>
         <w:pStyle w:val="Heading2"/>
       </w:pPr>
+      <w:bookmarkStart w:name="formatting-examples" w:id="27"/>
+      <w:bookmarkEnd w:id="27"/>
       <w:r>
         <w:t xml:space="preserve">Formatting Examples</w:t>
       </w:r>
@@ -1534,6 +1777,8 @@
       <w:pPr>
         <w:pStyle w:val="Heading3"/>
       </w:pPr>
+      <w:bookmarkStart w:name="small-table" w:id="28"/>
+      <w:bookmarkEnd w:id="28"/>
       <w:r>
         <w:t xml:space="preserve">Small Table</w:t>
       </w:r>
@@ -1543,6 +1788,8 @@
         <w:pStyle w:val="Caption"/>
         <w:jc w:val="center"/>
       </w:pPr>
+      <w:bookmarkStart w:name="tbl-small-example" w:id="29"/>
+      <w:bookmarkEnd w:id="29"/>
       <w:r>
         <w:t xml:space="preserve">Table </w:t>
       </w:r>
@@ -1594,12 +1841,8 @@
           <w:p>
             <w:pPr>
               <w:pStyle w:val="Normal"/>
-              <w:jc w:val="center"/>
             </w:pPr>
             <w:r>
-              <w:rPr>
-                <w:b/>
-              </w:rPr>
               <w:t xml:space="preserve">Name</w:t>
             </w:r>
           </w:p>
@@ -1616,12 +1859,8 @@
           <w:p>
             <w:pPr>
               <w:pStyle w:val="Normal"/>
-              <w:jc w:val="center"/>
             </w:pPr>
             <w:r>
-              <w:rPr>
-                <w:b/>
-              </w:rPr>
               <w:t xml:space="preserve">Type</w:t>
             </w:r>
           </w:p>
@@ -1706,8 +1945,16 @@
     </w:tbl>
     <w:p>
       <w:pPr>
+        <w:pStyle w:val="Normal"/>
+        <w:spacing w:after="0" w:line="360" w:lineRule="auto"/>
+      </w:pPr>
+    </w:p>
+    <w:p>
+      <w:pPr>
         <w:pStyle w:val="Heading4"/>
       </w:pPr>
+      <w:bookmarkStart w:name="final-codeblock" w:id="30"/>
+      <w:bookmarkEnd w:id="30"/>
       <w:r>
         <w:t xml:space="preserve">Final Codeblock</w:t>
       </w:r>
@@ -1748,6 +1995,8 @@
       <w:pPr>
         <w:pStyle w:val="Heading4"/>
       </w:pPr>
+      <w:bookmarkStart w:name="codeblock-with-formatting" w:id="31"/>
+      <w:bookmarkEnd w:id="31"/>
       <w:r>
         <w:t xml:space="preserve">Codeblock With Formatting</w:t>
       </w:r>
@@ -1817,6 +2066,8 @@
       <w:pPr>
         <w:pStyle w:val="Heading1"/>
       </w:pPr>
+      <w:bookmarkStart w:name="references" w:id="32"/>
+      <w:bookmarkEnd w:id="32"/>
       <w:r>
         <w:t xml:space="preserve">References</w:t>
       </w:r>
@@ -1825,6 +2076,8 @@
       <w:pPr>
         <w:pStyle w:val="Heading2"/>
       </w:pPr>
+      <w:bookmarkStart w:name="inline-citations" w:id="33"/>
+      <w:bookmarkEnd w:id="33"/>
       <w:r>
         <w:t xml:space="preserve">Inline Citations</w:t>
       </w:r>
@@ -2664,7 +2917,7 @@
   <w:abstractNum w:abstractNumId="5">
     <w:multiLevelType w:val="hybridMultilevel"/>
     <w:lvl w:ilvl="0">
-      <w:tmpl w:val="8A8C3852"/>
+      <w:tmpl w:val="D1EE1365"/>
       <w:numFmt w:val="bullet"/>
       <w:lvlText w:val=""/>
       <w:rPr>
@@ -2676,7 +2929,7 @@
       </w:pPr>
     </w:lvl>
     <w:lvl w:ilvl="1">
-      <w:tmpl w:val="76FB9888"/>
+      <w:tmpl w:val="F5CF72A3"/>
       <w:numFmt w:val="bullet"/>
       <w:lvlText w:val="o"/>
       <w:rPr>
@@ -2688,7 +2941,7 @@
       </w:pPr>
     </w:lvl>
     <w:lvl w:ilvl="2">
-      <w:tmpl w:val="96A03C27"/>
+      <w:tmpl w:val="A27224A2"/>
       <w:numFmt w:val="bullet"/>
       <w:lvlText w:val=""/>
       <w:rPr>
@@ -2700,7 +2953,7 @@
       </w:pPr>
     </w:lvl>
     <w:lvl w:ilvl="3">
-      <w:tmpl w:val="E0346E05"/>
+      <w:tmpl w:val="82B1F095"/>
       <w:numFmt w:val="bullet"/>
       <w:lvlText w:val=""/>
       <w:rPr>
@@ -2712,7 +2965,7 @@
       </w:pPr>
     </w:lvl>
     <w:lvl w:ilvl="4">
-      <w:tmpl w:val="75D04BB9"/>
+      <w:tmpl w:val="F9A44758"/>
       <w:numFmt w:val="bullet"/>
       <w:lvlText w:val="o"/>
       <w:rPr>
@@ -2724,7 +2977,7 @@
       </w:pPr>
     </w:lvl>
     <w:lvl w:ilvl="5">
-      <w:tmpl w:val="4F0B0607"/>
+      <w:tmpl w:val="F44B49BE"/>
       <w:numFmt w:val="bullet"/>
       <w:lvlText w:val=""/>
       <w:rPr>
@@ -2736,7 +2989,7 @@
       </w:pPr>
     </w:lvl>
     <w:lvl w:ilvl="6">
-      <w:tmpl w:val="B795C0F7"/>
+      <w:tmpl w:val="3C27A899"/>
       <w:numFmt w:val="bullet"/>
       <w:lvlText w:val=""/>
       <w:rPr>
@@ -2748,7 +3001,7 @@
       </w:pPr>
     </w:lvl>
     <w:lvl w:ilvl="7">
-      <w:tmpl w:val="EC6F441B"/>
+      <w:tmpl w:val="988017CB"/>
       <w:numFmt w:val="bullet"/>
       <w:lvlText w:val="o"/>
       <w:rPr>
@@ -2760,7 +3013,7 @@
       </w:pPr>
     </w:lvl>
     <w:lvl w:ilvl="8">
-      <w:tmpl w:val="F8838FBC"/>
+      <w:tmpl w:val="D8E3E9E9"/>
       <w:numFmt w:val="bullet"/>
       <w:lvlText w:val=""/>
       <w:rPr>
@@ -2775,7 +3028,7 @@
   <w:abstractNum w:abstractNumId="6">
     <w:multiLevelType w:val="hybridMultilevel"/>
     <w:lvl w:ilvl="0">
-      <w:tmpl w:val="9C7372D0"/>
+      <w:tmpl w:val="B2CB7770"/>
       <w:start w:val="1"/>
       <w:numFmt w:val="decimal"/>
       <w:lvlText w:val="%1."/>
@@ -2785,7 +3038,7 @@
       </w:pPr>
     </w:lvl>
     <w:lvl w:ilvl="1">
-      <w:tmpl w:val="BE4D1E9C"/>
+      <w:tmpl w:val="37278744"/>
       <w:start w:val="1"/>
       <w:numFmt w:val="lowerLetter"/>
       <w:lvlText w:val="%2."/>
@@ -2795,7 +3048,7 @@
       </w:pPr>
     </w:lvl>
     <w:lvl w:ilvl="2">
-      <w:tmpl w:val="ACC06EED"/>
+      <w:tmpl w:val="6CC61415"/>
       <w:start w:val="1"/>
       <w:numFmt w:val="lowerRoman"/>
       <w:lvlText w:val="%3."/>
@@ -2805,7 +3058,7 @@
       </w:pPr>
     </w:lvl>
     <w:lvl w:ilvl="3">
-      <w:tmpl w:val="CA635319"/>
+      <w:tmpl w:val="28897B57"/>
       <w:start w:val="1"/>
       <w:numFmt w:val="decimal"/>
       <w:lvlText w:val="%4."/>
@@ -2815,7 +3068,7 @@
       </w:pPr>
     </w:lvl>
     <w:lvl w:ilvl="4">
-      <w:tmpl w:val="094FB61A"/>
+      <w:tmpl w:val="E4900C45"/>
       <w:start w:val="1"/>
       <w:numFmt w:val="lowerLetter"/>
       <w:lvlText w:val="%5."/>
@@ -2825,7 +3078,7 @@
       </w:pPr>
     </w:lvl>
     <w:lvl w:ilvl="5">
-      <w:tmpl w:val="B8F3F0AE"/>
+      <w:tmpl w:val="87C70B4C"/>
       <w:start w:val="1"/>
       <w:numFmt w:val="lowerRoman"/>
       <w:lvlText w:val="%6."/>
@@ -2835,7 +3088,7 @@
       </w:pPr>
     </w:lvl>
     <w:lvl w:ilvl="6">
-      <w:tmpl w:val="9E395B91"/>
+      <w:tmpl w:val="3A8509D9"/>
       <w:start w:val="1"/>
       <w:numFmt w:val="decimal"/>
       <w:lvlText w:val="%7."/>
@@ -2845,7 +3098,7 @@
       </w:pPr>
     </w:lvl>
     <w:lvl w:ilvl="7">
-      <w:tmpl w:val="7BA16D0C"/>
+      <w:tmpl w:val="1A181238"/>
       <w:start w:val="1"/>
       <w:numFmt w:val="lowerLetter"/>
       <w:lvlText w:val="%8."/>
@@ -2855,7 +3108,7 @@
       </w:pPr>
     </w:lvl>
     <w:lvl w:ilvl="8">
-      <w:tmpl w:val="E6F51D46"/>
+      <w:tmpl w:val="39E7E33B"/>
       <w:start w:val="1"/>
       <w:numFmt w:val="lowerRoman"/>
       <w:lvlText w:val="%9."/>
@@ -2868,7 +3121,7 @@
   <w:abstractNum w:abstractNumId="7">
     <w:multiLevelType w:val="hybridMultilevel"/>
     <w:lvl w:ilvl="0">
-      <w:tmpl w:val="18A3A3F9"/>
+      <w:tmpl w:val="2CF76AA0"/>
       <w:numFmt w:val="bullet"/>
       <w:lvlText w:val=""/>
       <w:rPr>
@@ -2880,7 +3133,7 @@
       </w:pPr>
     </w:lvl>
     <w:lvl w:ilvl="1">
-      <w:tmpl w:val="3884BAB1"/>
+      <w:tmpl w:val="AA77F96D"/>
       <w:numFmt w:val="bullet"/>
       <w:lvlText w:val="o"/>
       <w:rPr>
@@ -2892,7 +3145,7 @@
       </w:pPr>
     </w:lvl>
     <w:lvl w:ilvl="2">
-      <w:tmpl w:val="BEE688BF"/>
+      <w:tmpl w:val="D6FF60BF"/>
       <w:numFmt w:val="bullet"/>
       <w:lvlText w:val=""/>
       <w:rPr>
@@ -2904,7 +3157,7 @@
       </w:pPr>
     </w:lvl>
     <w:lvl w:ilvl="3">
-      <w:tmpl w:val="8C19B699"/>
+      <w:tmpl w:val="81E0EE26"/>
       <w:numFmt w:val="bullet"/>
       <w:lvlText w:val=""/>
       <w:rPr>
@@ -2916,7 +3169,7 @@
       </w:pPr>
     </w:lvl>
     <w:lvl w:ilvl="4">
-      <w:tmpl w:val="7008EF1D"/>
+      <w:tmpl w:val="856743FE"/>
       <w:numFmt w:val="bullet"/>
       <w:lvlText w:val="o"/>
       <w:rPr>
@@ -2928,7 +3181,7 @@
       </w:pPr>
     </w:lvl>
     <w:lvl w:ilvl="5">
-      <w:tmpl w:val="4F1D2D36"/>
+      <w:tmpl w:val="ED335843"/>
       <w:numFmt w:val="bullet"/>
       <w:lvlText w:val=""/>
       <w:rPr>
@@ -2940,7 +3193,7 @@
       </w:pPr>
     </w:lvl>
     <w:lvl w:ilvl="6">
-      <w:tmpl w:val="3268A953"/>
+      <w:tmpl w:val="11663778"/>
       <w:numFmt w:val="bullet"/>
       <w:lvlText w:val=""/>
       <w:rPr>
@@ -2952,7 +3205,7 @@
       </w:pPr>
     </w:lvl>
     <w:lvl w:ilvl="7">
-      <w:tmpl w:val="1E6E3FBF"/>
+      <w:tmpl w:val="624CCDC2"/>
       <w:numFmt w:val="bullet"/>
       <w:lvlText w:val="o"/>
       <w:rPr>
@@ -2964,7 +3217,7 @@
       </w:pPr>
     </w:lvl>
     <w:lvl w:ilvl="8">
-      <w:tmpl w:val="3E7CBAE5"/>
+      <w:tmpl w:val="FEDC4FDD"/>
       <w:numFmt w:val="bullet"/>
       <w:lvlText w:val=""/>
       <w:rPr>
@@ -2979,7 +3232,7 @@
   <w:abstractNum w:abstractNumId="8">
     <w:multiLevelType w:val="hybridMultilevel"/>
     <w:lvl w:ilvl="0">
-      <w:tmpl w:val="A46FB9D6"/>
+      <w:tmpl w:val="16F496E7"/>
       <w:start w:val="1"/>
       <w:numFmt w:val="decimal"/>
       <w:lvlText w:val="%1."/>
@@ -2989,7 +3242,7 @@
       </w:pPr>
     </w:lvl>
     <w:lvl w:ilvl="1">
-      <w:tmpl w:val="03233549"/>
+      <w:tmpl w:val="7E787B40"/>
       <w:start w:val="1"/>
       <w:numFmt w:val="lowerLetter"/>
       <w:lvlText w:val="%2."/>
@@ -2999,7 +3252,7 @@
       </w:pPr>
     </w:lvl>
     <w:lvl w:ilvl="2">
-      <w:tmpl w:val="A66986EB"/>
+      <w:tmpl w:val="936E3BAC"/>
       <w:start w:val="1"/>
       <w:numFmt w:val="lowerRoman"/>
       <w:lvlText w:val="%3."/>
@@ -3009,7 +3262,7 @@
       </w:pPr>
     </w:lvl>
     <w:lvl w:ilvl="3">
-      <w:tmpl w:val="1E859924"/>
+      <w:tmpl w:val="50F5F4D7"/>
       <w:start w:val="1"/>
       <w:numFmt w:val="decimal"/>
       <w:lvlText w:val="%4."/>
@@ -3019,7 +3272,7 @@
       </w:pPr>
     </w:lvl>
     <w:lvl w:ilvl="4">
-      <w:tmpl w:val="52E36145"/>
+      <w:tmpl w:val="E0FA6A5E"/>
       <w:start w:val="1"/>
       <w:numFmt w:val="lowerLetter"/>
       <w:lvlText w:val="%5."/>
@@ -3029,7 +3282,7 @@
       </w:pPr>
     </w:lvl>
     <w:lvl w:ilvl="5">
-      <w:tmpl w:val="55CE28FD"/>
+      <w:tmpl w:val="A20D6A0E"/>
       <w:start w:val="1"/>
       <w:numFmt w:val="lowerRoman"/>
       <w:lvlText w:val="%6."/>
@@ -3039,7 +3292,7 @@
       </w:pPr>
     </w:lvl>
     <w:lvl w:ilvl="6">
-      <w:tmpl w:val="86290571"/>
+      <w:tmpl w:val="47053C4B"/>
       <w:start w:val="1"/>
       <w:numFmt w:val="decimal"/>
       <w:lvlText w:val="%7."/>
@@ -3049,7 +3302,7 @@
       </w:pPr>
     </w:lvl>
     <w:lvl w:ilvl="7">
-      <w:tmpl w:val="6ABD0A7B"/>
+      <w:tmpl w:val="B910B3CF"/>
       <w:start w:val="1"/>
       <w:numFmt w:val="lowerLetter"/>
       <w:lvlText w:val="%8."/>
@@ -3059,7 +3312,7 @@
       </w:pPr>
     </w:lvl>
     <w:lvl w:ilvl="8">
-      <w:tmpl w:val="5A365221"/>
+      <w:tmpl w:val="E8D6DAD9"/>
       <w:start w:val="1"/>
       <w:numFmt w:val="lowerRoman"/>
       <w:lvlText w:val="%9."/>
@@ -3072,7 +3325,7 @@
   <w:abstractNum w:abstractNumId="9">
     <w:multiLevelType w:val="hybridMultilevel"/>
     <w:lvl w:ilvl="0">
-      <w:tmpl w:val="7970757F"/>
+      <w:tmpl w:val="C841527E"/>
       <w:numFmt w:val="bullet"/>
       <w:lvlText w:val=""/>
       <w:rPr>
@@ -3084,7 +3337,7 @@
       </w:pPr>
     </w:lvl>
     <w:lvl w:ilvl="1">
-      <w:tmpl w:val="E96705EE"/>
+      <w:tmpl w:val="AF7ABB0C"/>
       <w:numFmt w:val="bullet"/>
       <w:lvlText w:val="o"/>
       <w:rPr>
@@ -3096,7 +3349,7 @@
       </w:pPr>
     </w:lvl>
     <w:lvl w:ilvl="2">
-      <w:tmpl w:val="5B77B9A1"/>
+      <w:tmpl w:val="076F9F57"/>
       <w:numFmt w:val="bullet"/>
       <w:lvlText w:val=""/>
       <w:rPr>
@@ -3108,7 +3361,7 @@
       </w:pPr>
     </w:lvl>
     <w:lvl w:ilvl="3">
-      <w:tmpl w:val="B5E8ADB1"/>
+      <w:tmpl w:val="A476C7C1"/>
       <w:numFmt w:val="bullet"/>
       <w:lvlText w:val=""/>
       <w:rPr>
@@ -3120,7 +3373,7 @@
       </w:pPr>
     </w:lvl>
     <w:lvl w:ilvl="4">
-      <w:tmpl w:val="47553DFA"/>
+      <w:tmpl w:val="983A9A86"/>
       <w:numFmt w:val="bullet"/>
       <w:lvlText w:val="o"/>
       <w:rPr>
@@ -3132,7 +3385,7 @@
       </w:pPr>
     </w:lvl>
     <w:lvl w:ilvl="5">
-      <w:tmpl w:val="C4780319"/>
+      <w:tmpl w:val="1B9ADA2A"/>
       <w:numFmt w:val="bullet"/>
       <w:lvlText w:val=""/>
       <w:rPr>
@@ -3144,7 +3397,7 @@
       </w:pPr>
     </w:lvl>
     <w:lvl w:ilvl="6">
-      <w:tmpl w:val="83648A1A"/>
+      <w:tmpl w:val="3F6B9526"/>
       <w:numFmt w:val="bullet"/>
       <w:lvlText w:val=""/>
       <w:rPr>
@@ -3156,7 +3409,7 @@
       </w:pPr>
     </w:lvl>
     <w:lvl w:ilvl="7">
-      <w:tmpl w:val="35705FAC"/>
+      <w:tmpl w:val="4584E28E"/>
       <w:numFmt w:val="bullet"/>
       <w:lvlText w:val="o"/>
       <w:rPr>
@@ -3168,7 +3421,7 @@
       </w:pPr>
     </w:lvl>
     <w:lvl w:ilvl="8">
-      <w:tmpl w:val="02AC78A8"/>
+      <w:tmpl w:val="039A32CC"/>
       <w:numFmt w:val="bullet"/>
       <w:lvlText w:val=""/>
       <w:rPr>
@@ -3183,7 +3436,7 @@
   <w:abstractNum w:abstractNumId="10">
     <w:multiLevelType w:val="hybridMultilevel"/>
     <w:lvl w:ilvl="0">
-      <w:tmpl w:val="38753541"/>
+      <w:tmpl w:val="534859B2"/>
       <w:start w:val="1"/>
       <w:numFmt w:val="decimal"/>
       <w:lvlText w:val="%1."/>
@@ -3193,7 +3446,7 @@
       </w:pPr>
     </w:lvl>
     <w:lvl w:ilvl="1">
-      <w:tmpl w:val="AB2C1267"/>
+      <w:tmpl w:val="89E49722"/>
       <w:start w:val="1"/>
       <w:numFmt w:val="lowerLetter"/>
       <w:lvlText w:val="%2."/>
@@ -3203,7 +3456,7 @@
       </w:pPr>
     </w:lvl>
     <w:lvl w:ilvl="2">
-      <w:tmpl w:val="6EA7E996"/>
+      <w:tmpl w:val="39583504"/>
       <w:start w:val="1"/>
       <w:numFmt w:val="lowerRoman"/>
       <w:lvlText w:val="%3."/>
@@ -3213,7 +3466,7 @@
       </w:pPr>
     </w:lvl>
     <w:lvl w:ilvl="3">
-      <w:tmpl w:val="455F43EB"/>
+      <w:tmpl w:val="EA64FD29"/>
       <w:start w:val="1"/>
       <w:numFmt w:val="decimal"/>
       <w:lvlText w:val="%4."/>
@@ -3223,7 +3476,7 @@
       </w:pPr>
     </w:lvl>
     <w:lvl w:ilvl="4">
-      <w:tmpl w:val="9A398B19"/>
+      <w:tmpl w:val="A4946861"/>
       <w:start w:val="1"/>
       <w:numFmt w:val="lowerLetter"/>
       <w:lvlText w:val="%5."/>
@@ -3233,7 +3486,7 @@
       </w:pPr>
     </w:lvl>
     <w:lvl w:ilvl="5">
-      <w:tmpl w:val="1BEE08B2"/>
+      <w:tmpl w:val="2E21F10A"/>
       <w:start w:val="1"/>
       <w:numFmt w:val="lowerRoman"/>
       <w:lvlText w:val="%6."/>
@@ -3243,7 +3496,7 @@
       </w:pPr>
     </w:lvl>
     <w:lvl w:ilvl="6">
-      <w:tmpl w:val="0C49F7CA"/>
+      <w:tmpl w:val="2E7B3222"/>
       <w:start w:val="1"/>
       <w:numFmt w:val="decimal"/>
       <w:lvlText w:val="%7."/>
@@ -3253,7 +3506,7 @@
       </w:pPr>
     </w:lvl>
     <w:lvl w:ilvl="7">
-      <w:tmpl w:val="F0F87777"/>
+      <w:tmpl w:val="8FF5AC31"/>
       <w:start w:val="1"/>
       <w:numFmt w:val="lowerLetter"/>
       <w:lvlText w:val="%8."/>
@@ -3263,7 +3516,7 @@
       </w:pPr>
     </w:lvl>
     <w:lvl w:ilvl="8">
-      <w:tmpl w:val="275A797F"/>
+      <w:tmpl w:val="1D900E5C"/>
       <w:start w:val="1"/>
       <w:numFmt w:val="lowerRoman"/>
       <w:lvlText w:val="%9."/>
@@ -3276,7 +3529,7 @@
   <w:abstractNum w:abstractNumId="11">
     <w:multiLevelType w:val="hybridMultilevel"/>
     <w:lvl w:ilvl="0">
-      <w:tmpl w:val="DB1D49D7"/>
+      <w:tmpl w:val="AA76862F"/>
       <w:numFmt w:val="bullet"/>
       <w:lvlText w:val=""/>
       <w:rPr>
@@ -3288,7 +3541,7 @@
       </w:pPr>
     </w:lvl>
     <w:lvl w:ilvl="1">
-      <w:tmpl w:val="95DA0C93"/>
+      <w:tmpl w:val="7E948431"/>
       <w:numFmt w:val="bullet"/>
       <w:lvlText w:val="o"/>
       <w:rPr>
@@ -3300,7 +3553,7 @@
       </w:pPr>
     </w:lvl>
     <w:lvl w:ilvl="2">
-      <w:tmpl w:val="EE4CB993"/>
+      <w:tmpl w:val="39A255E7"/>
       <w:numFmt w:val="bullet"/>
       <w:lvlText w:val=""/>
       <w:rPr>
@@ -3312,7 +3565,7 @@
       </w:pPr>
     </w:lvl>
     <w:lvl w:ilvl="3">
-      <w:tmpl w:val="F3B2C27E"/>
+      <w:tmpl w:val="90EC560F"/>
       <w:numFmt w:val="bullet"/>
       <w:lvlText w:val=""/>
       <w:rPr>
@@ -3324,7 +3577,7 @@
       </w:pPr>
     </w:lvl>
     <w:lvl w:ilvl="4">
-      <w:tmpl w:val="157758E6"/>
+      <w:tmpl w:val="F9C3F253"/>
       <w:numFmt w:val="bullet"/>
       <w:lvlText w:val="o"/>
       <w:rPr>
@@ -3336,7 +3589,7 @@
       </w:pPr>
     </w:lvl>
     <w:lvl w:ilvl="5">
-      <w:tmpl w:val="D43DC96F"/>
+      <w:tmpl w:val="F35351B8"/>
       <w:numFmt w:val="bullet"/>
       <w:lvlText w:val=""/>
       <w:rPr>
@@ -3348,7 +3601,7 @@
       </w:pPr>
     </w:lvl>
     <w:lvl w:ilvl="6">
-      <w:tmpl w:val="4501D510"/>
+      <w:tmpl w:val="06D2C132"/>
       <w:numFmt w:val="bullet"/>
       <w:lvlText w:val=""/>
       <w:rPr>
@@ -3360,7 +3613,7 @@
       </w:pPr>
     </w:lvl>
     <w:lvl w:ilvl="7">
-      <w:tmpl w:val="91FB5526"/>
+      <w:tmpl w:val="584A2E88"/>
       <w:numFmt w:val="bullet"/>
       <w:lvlText w:val="o"/>
       <w:rPr>
@@ -3372,7 +3625,7 @@
       </w:pPr>
     </w:lvl>
     <w:lvl w:ilvl="8">
-      <w:tmpl w:val="7D9F59E4"/>
+      <w:tmpl w:val="5FA8BBD8"/>
       <w:numFmt w:val="bullet"/>
       <w:lvlText w:val=""/>
       <w:rPr>
@@ -3387,7 +3640,7 @@
   <w:abstractNum w:abstractNumId="12">
     <w:multiLevelType w:val="hybridMultilevel"/>
     <w:lvl w:ilvl="0">
-      <w:tmpl w:val="31DBDA35"/>
+      <w:tmpl w:val="D6385060"/>
       <w:start w:val="1"/>
       <w:numFmt w:val="decimal"/>
       <w:lvlText w:val="%1."/>
@@ -3397,7 +3650,7 @@
       </w:pPr>
     </w:lvl>
     <w:lvl w:ilvl="1">
-      <w:tmpl w:val="6C1CD597"/>
+      <w:tmpl w:val="2F23BE95"/>
       <w:start w:val="1"/>
       <w:numFmt w:val="lowerLetter"/>
       <w:lvlText w:val="%2."/>
@@ -3407,7 +3660,7 @@
       </w:pPr>
     </w:lvl>
     <w:lvl w:ilvl="2">
-      <w:tmpl w:val="A233336B"/>
+      <w:tmpl w:val="3BAB9884"/>
       <w:start w:val="1"/>
       <w:numFmt w:val="lowerRoman"/>
       <w:lvlText w:val="%3."/>
@@ -3417,7 +3670,7 @@
       </w:pPr>
     </w:lvl>
     <w:lvl w:ilvl="3">
-      <w:tmpl w:val="DFC7D852"/>
+      <w:tmpl w:val="502988BB"/>
       <w:start w:val="1"/>
       <w:numFmt w:val="decimal"/>
       <w:lvlText w:val="%4."/>
@@ -3427,7 +3680,7 @@
       </w:pPr>
     </w:lvl>
     <w:lvl w:ilvl="4">
-      <w:tmpl w:val="CF42A0C7"/>
+      <w:tmpl w:val="3829433B"/>
       <w:start w:val="1"/>
       <w:numFmt w:val="lowerLetter"/>
       <w:lvlText w:val="%5."/>
@@ -3437,7 +3690,7 @@
       </w:pPr>
     </w:lvl>
     <w:lvl w:ilvl="5">
-      <w:tmpl w:val="DE5252EA"/>
+      <w:tmpl w:val="D218360C"/>
       <w:start w:val="1"/>
       <w:numFmt w:val="lowerRoman"/>
       <w:lvlText w:val="%6."/>
@@ -3447,7 +3700,7 @@
       </w:pPr>
     </w:lvl>
     <w:lvl w:ilvl="6">
-      <w:tmpl w:val="B06E64FE"/>
+      <w:tmpl w:val="4B49D2A3"/>
       <w:start w:val="1"/>
       <w:numFmt w:val="decimal"/>
       <w:lvlText w:val="%7."/>
@@ -3457,7 +3710,7 @@
       </w:pPr>
     </w:lvl>
     <w:lvl w:ilvl="7">
-      <w:tmpl w:val="92666152"/>
+      <w:tmpl w:val="EFF17171"/>
       <w:start w:val="1"/>
       <w:numFmt w:val="lowerLetter"/>
       <w:lvlText w:val="%8."/>
@@ -3467,7 +3720,7 @@
       </w:pPr>
     </w:lvl>
     <w:lvl w:ilvl="8">
-      <w:tmpl w:val="912A393B"/>
+      <w:tmpl w:val="B1DA10D4"/>
       <w:start w:val="1"/>
       <w:numFmt w:val="lowerRoman"/>
       <w:lvlText w:val="%9."/>
@@ -3480,7 +3733,7 @@
   <w:abstractNum w:abstractNumId="13">
     <w:multiLevelType w:val="hybridMultilevel"/>
     <w:lvl w:ilvl="0">
-      <w:tmpl w:val="585FBE65"/>
+      <w:tmpl w:val="36015BDC"/>
       <w:numFmt w:val="bullet"/>
       <w:lvlText w:val=""/>
       <w:rPr>
@@ -3492,7 +3745,7 @@
       </w:pPr>
     </w:lvl>
     <w:lvl w:ilvl="1">
-      <w:tmpl w:val="8BC7E749"/>
+      <w:tmpl w:val="8370043F"/>
       <w:numFmt w:val="bullet"/>
       <w:lvlText w:val="o"/>
       <w:rPr>
@@ -3504,7 +3757,7 @@
       </w:pPr>
     </w:lvl>
     <w:lvl w:ilvl="2">
-      <w:tmpl w:val="D1C7DEC3"/>
+      <w:tmpl w:val="32823788"/>
       <w:numFmt w:val="bullet"/>
       <w:lvlText w:val=""/>
       <w:rPr>
@@ -3516,7 +3769,7 @@
       </w:pPr>
     </w:lvl>
     <w:lvl w:ilvl="3">
-      <w:tmpl w:val="BD31D7CC"/>
+      <w:tmpl w:val="80D5D3D8"/>
       <w:numFmt w:val="bullet"/>
       <w:lvlText w:val=""/>
       <w:rPr>
@@ -3528,7 +3781,7 @@
       </w:pPr>
     </w:lvl>
     <w:lvl w:ilvl="4">
-      <w:tmpl w:val="48911343"/>
+      <w:tmpl w:val="FEE4123E"/>
       <w:numFmt w:val="bullet"/>
       <w:lvlText w:val="o"/>
       <w:rPr>
@@ -3540,7 +3793,7 @@
       </w:pPr>
     </w:lvl>
     <w:lvl w:ilvl="5">
-      <w:tmpl w:val="A007C9C7"/>
+      <w:tmpl w:val="8C06D016"/>
       <w:numFmt w:val="bullet"/>
       <w:lvlText w:val=""/>
       <w:rPr>
@@ -3552,7 +3805,7 @@
       </w:pPr>
     </w:lvl>
     <w:lvl w:ilvl="6">
-      <w:tmpl w:val="710B4754"/>
+      <w:tmpl w:val="E05E0C6B"/>
       <w:numFmt w:val="bullet"/>
       <w:lvlText w:val=""/>
       <w:rPr>
@@ -3564,7 +3817,7 @@
       </w:pPr>
     </w:lvl>
     <w:lvl w:ilvl="7">
-      <w:tmpl w:val="D4B8C2B3"/>
+      <w:tmpl w:val="0A8E655C"/>
       <w:numFmt w:val="bullet"/>
       <w:lvlText w:val="o"/>
       <w:rPr>
@@ -3576,7 +3829,7 @@
       </w:pPr>
     </w:lvl>
     <w:lvl w:ilvl="8">
-      <w:tmpl w:val="9B05293D"/>
+      <w:tmpl w:val="FB345B5A"/>
       <w:numFmt w:val="bullet"/>
       <w:lvlText w:val=""/>
       <w:rPr>
@@ -3591,7 +3844,7 @@
   <w:abstractNum w:abstractNumId="14">
     <w:multiLevelType w:val="hybridMultilevel"/>
     <w:lvl w:ilvl="0">
-      <w:tmpl w:val="F8A51FC1"/>
+      <w:tmpl w:val="6A697B30"/>
       <w:numFmt w:val="bullet"/>
       <w:lvlText w:val=""/>
       <w:rPr>
@@ -3603,7 +3856,7 @@
       </w:pPr>
     </w:lvl>
     <w:lvl w:ilvl="1">
-      <w:tmpl w:val="624AA914"/>
+      <w:tmpl w:val="8E276E49"/>
       <w:numFmt w:val="bullet"/>
       <w:lvlText w:val="o"/>
       <w:rPr>
@@ -3615,7 +3868,7 @@
       </w:pPr>
     </w:lvl>
     <w:lvl w:ilvl="2">
-      <w:tmpl w:val="B2A1F9A8"/>
+      <w:tmpl w:val="92D3033B"/>
       <w:numFmt w:val="bullet"/>
       <w:lvlText w:val=""/>
       <w:rPr>
@@ -3627,7 +3880,7 @@
       </w:pPr>
     </w:lvl>
     <w:lvl w:ilvl="3">
-      <w:tmpl w:val="3BE176FA"/>
+      <w:tmpl w:val="918D9D59"/>
       <w:numFmt w:val="bullet"/>
       <w:lvlText w:val=""/>
       <w:rPr>
@@ -3639,7 +3892,7 @@
       </w:pPr>
     </w:lvl>
     <w:lvl w:ilvl="4">
-      <w:tmpl w:val="FA023F1C"/>
+      <w:tmpl w:val="EAC884A6"/>
       <w:numFmt w:val="bullet"/>
       <w:lvlText w:val="o"/>
       <w:rPr>
@@ -3651,7 +3904,7 @@
       </w:pPr>
     </w:lvl>
     <w:lvl w:ilvl="5">
-      <w:tmpl w:val="0E8B05BE"/>
+      <w:tmpl w:val="FEE10E79"/>
       <w:numFmt w:val="bullet"/>
       <w:lvlText w:val=""/>
       <w:rPr>
@@ -3663,7 +3916,7 @@
       </w:pPr>
     </w:lvl>
     <w:lvl w:ilvl="6">
-      <w:tmpl w:val="D234A0DB"/>
+      <w:tmpl w:val="2EBC1B33"/>
       <w:numFmt w:val="bullet"/>
       <w:lvlText w:val=""/>
       <w:rPr>
@@ -3675,7 +3928,7 @@
       </w:pPr>
     </w:lvl>
     <w:lvl w:ilvl="7">
-      <w:tmpl w:val="23073377"/>
+      <w:tmpl w:val="D6C39D23"/>
       <w:numFmt w:val="bullet"/>
       <w:lvlText w:val="o"/>
       <w:rPr>
@@ -3687,7 +3940,7 @@
       </w:pPr>
     </w:lvl>
     <w:lvl w:ilvl="8">
-      <w:tmpl w:val="8500520D"/>
+      <w:tmpl w:val="011786FA"/>
       <w:numFmt w:val="bullet"/>
       <w:lvlText w:val=""/>
       <w:rPr>
@@ -3702,7 +3955,7 @@
   <w:abstractNum w:abstractNumId="15">
     <w:multiLevelType w:val="hybridMultilevel"/>
     <w:lvl w:ilvl="0">
-      <w:tmpl w:val="C2868EC9"/>
+      <w:tmpl w:val="DCC7576D"/>
       <w:start w:val="1"/>
       <w:numFmt w:val="decimal"/>
       <w:lvlText w:val="%1."/>
@@ -3712,7 +3965,7 @@
       </w:pPr>
     </w:lvl>
     <w:lvl w:ilvl="1">
-      <w:tmpl w:val="FA5C66FC"/>
+      <w:tmpl w:val="C24FE743"/>
       <w:start w:val="1"/>
       <w:numFmt w:val="lowerLetter"/>
       <w:lvlText w:val="%2."/>
@@ -3722,7 +3975,7 @@
       </w:pPr>
     </w:lvl>
     <w:lvl w:ilvl="2">
-      <w:tmpl w:val="64E7B684"/>
+      <w:tmpl w:val="9D709CDE"/>
       <w:start w:val="1"/>
       <w:numFmt w:val="lowerRoman"/>
       <w:lvlText w:val="%3."/>
@@ -3732,7 +3985,7 @@
       </w:pPr>
     </w:lvl>
     <w:lvl w:ilvl="3">
-      <w:tmpl w:val="4E41F270"/>
+      <w:tmpl w:val="CC27D8F5"/>
       <w:start w:val="1"/>
       <w:numFmt w:val="decimal"/>
       <w:lvlText w:val="%4."/>
@@ -3742,7 +3995,7 @@
       </w:pPr>
     </w:lvl>
     <w:lvl w:ilvl="4">
-      <w:tmpl w:val="C467215A"/>
+      <w:tmpl w:val="3DAB5E1E"/>
       <w:start w:val="1"/>
       <w:numFmt w:val="lowerLetter"/>
       <w:lvlText w:val="%5."/>
@@ -3752,7 +4005,7 @@
       </w:pPr>
     </w:lvl>
     <w:lvl w:ilvl="5">
-      <w:tmpl w:val="82ABF36C"/>
+      <w:tmpl w:val="08115B30"/>
       <w:start w:val="1"/>
       <w:numFmt w:val="lowerRoman"/>
       <w:lvlText w:val="%6."/>
@@ -3762,7 +4015,7 @@
       </w:pPr>
     </w:lvl>
     <w:lvl w:ilvl="6">
-      <w:tmpl w:val="25E6C906"/>
+      <w:tmpl w:val="E6887C5C"/>
       <w:start w:val="1"/>
       <w:numFmt w:val="decimal"/>
       <w:lvlText w:val="%7."/>
@@ -3772,7 +4025,7 @@
       </w:pPr>
     </w:lvl>
     <w:lvl w:ilvl="7">
-      <w:tmpl w:val="1F4CB2C3"/>
+      <w:tmpl w:val="B41413A9"/>
       <w:start w:val="1"/>
       <w:numFmt w:val="lowerLetter"/>
       <w:lvlText w:val="%8."/>
@@ -3782,7 +4035,7 @@
       </w:pPr>
     </w:lvl>
     <w:lvl w:ilvl="8">
-      <w:tmpl w:val="1875CBEC"/>
+      <w:tmpl w:val="3F7CE643"/>
       <w:start w:val="1"/>
       <w:numFmt w:val="lowerRoman"/>
       <w:lvlText w:val="%9."/>
@@ -3795,7 +4048,7 @@
   <w:abstractNum w:abstractNumId="16">
     <w:multiLevelType w:val="hybridMultilevel"/>
     <w:lvl w:ilvl="0">
-      <w:tmpl w:val="80E4D12D"/>
+      <w:tmpl w:val="1E080839"/>
       <w:numFmt w:val="bullet"/>
       <w:lvlText w:val=""/>
       <w:rPr>
@@ -3807,7 +4060,7 @@
       </w:pPr>
     </w:lvl>
     <w:lvl w:ilvl="1">
-      <w:tmpl w:val="C8858BF1"/>
+      <w:tmpl w:val="38FF161B"/>
       <w:numFmt w:val="bullet"/>
       <w:lvlText w:val="o"/>
       <w:rPr>
@@ -3819,7 +4072,7 @@
       </w:pPr>
     </w:lvl>
     <w:lvl w:ilvl="2">
-      <w:tmpl w:val="1BCC69DD"/>
+      <w:tmpl w:val="EABF64EC"/>
       <w:numFmt w:val="bullet"/>
       <w:lvlText w:val=""/>
       <w:rPr>
@@ -3831,7 +4084,7 @@
       </w:pPr>
     </w:lvl>
     <w:lvl w:ilvl="3">
-      <w:tmpl w:val="AFADEFA0"/>
+      <w:tmpl w:val="A5054BBB"/>
       <w:numFmt w:val="bullet"/>
       <w:lvlText w:val=""/>
       <w:rPr>
@@ -3843,7 +4096,7 @@
       </w:pPr>
     </w:lvl>
     <w:lvl w:ilvl="4">
-      <w:tmpl w:val="9D9DF322"/>
+      <w:tmpl w:val="EB29F115"/>
       <w:numFmt w:val="bullet"/>
       <w:lvlText w:val="o"/>
       <w:rPr>
@@ -3855,7 +4108,7 @@
       </w:pPr>
     </w:lvl>
     <w:lvl w:ilvl="5">
-      <w:tmpl w:val="6F366438"/>
+      <w:tmpl w:val="5B4F5265"/>
       <w:numFmt w:val="bullet"/>
       <w:lvlText w:val=""/>
       <w:rPr>
@@ -3867,7 +4120,7 @@
       </w:pPr>
     </w:lvl>
     <w:lvl w:ilvl="6">
-      <w:tmpl w:val="3ADCE3F4"/>
+      <w:tmpl w:val="7483C617"/>
       <w:numFmt w:val="bullet"/>
       <w:lvlText w:val=""/>
       <w:rPr>
@@ -3879,7 +4132,7 @@
       </w:pPr>
     </w:lvl>
     <w:lvl w:ilvl="7">
-      <w:tmpl w:val="7E9EC9EE"/>
+      <w:tmpl w:val="103FF9E1"/>
       <w:numFmt w:val="bullet"/>
       <w:lvlText w:val="o"/>
       <w:rPr>
@@ -3891,7 +4144,7 @@
       </w:pPr>
     </w:lvl>
     <w:lvl w:ilvl="8">
-      <w:tmpl w:val="567E6052"/>
+      <w:tmpl w:val="F287D122"/>
       <w:numFmt w:val="bullet"/>
       <w:lvlText w:val=""/>
       <w:rPr>
@@ -3906,7 +4159,7 @@
   <w:abstractNum w:abstractNumId="17">
     <w:multiLevelType w:val="hybridMultilevel"/>
     <w:lvl w:ilvl="0">
-      <w:tmpl w:val="69A604B9"/>
+      <w:tmpl w:val="9B0C55CD"/>
       <w:start w:val="1"/>
       <w:numFmt w:val="decimal"/>
       <w:lvlText w:val="%1."/>
@@ -3916,7 +4169,7 @@
       </w:pPr>
     </w:lvl>
     <w:lvl w:ilvl="1">
-      <w:tmpl w:val="A8FC5D18"/>
+      <w:tmpl w:val="D08553AE"/>
       <w:start w:val="1"/>
       <w:numFmt w:val="lowerLetter"/>
       <w:lvlText w:val="%2."/>
@@ -3926,7 +4179,7 @@
       </w:pPr>
     </w:lvl>
     <w:lvl w:ilvl="2">
-      <w:tmpl w:val="00DD9189"/>
+      <w:tmpl w:val="C6D41AEA"/>
       <w:start w:val="1"/>
       <w:numFmt w:val="lowerRoman"/>
       <w:lvlText w:val="%3."/>
@@ -3936,7 +4189,7 @@
       </w:pPr>
     </w:lvl>
     <w:lvl w:ilvl="3">
-      <w:tmpl w:val="11096AFA"/>
+      <w:tmpl w:val="1F9392CD"/>
       <w:start w:val="1"/>
       <w:numFmt w:val="decimal"/>
       <w:lvlText w:val="%4."/>
@@ -3946,7 +4199,7 @@
       </w:pPr>
     </w:lvl>
     <w:lvl w:ilvl="4">
-      <w:tmpl w:val="1894D330"/>
+      <w:tmpl w:val="0D5C5232"/>
       <w:start w:val="1"/>
       <w:numFmt w:val="lowerLetter"/>
       <w:lvlText w:val="%5."/>
@@ -3956,7 +4209,7 @@
       </w:pPr>
     </w:lvl>
     <w:lvl w:ilvl="5">
-      <w:tmpl w:val="B836FA12"/>
+      <w:tmpl w:val="418C8ABB"/>
       <w:start w:val="1"/>
       <w:numFmt w:val="lowerRoman"/>
       <w:lvlText w:val="%6."/>
@@ -3966,7 +4219,7 @@
       </w:pPr>
     </w:lvl>
     <w:lvl w:ilvl="6">
-      <w:tmpl w:val="E62E7942"/>
+      <w:tmpl w:val="704E6A2D"/>
       <w:start w:val="1"/>
       <w:numFmt w:val="decimal"/>
       <w:lvlText w:val="%7."/>
@@ -3976,7 +4229,7 @@
       </w:pPr>
     </w:lvl>
     <w:lvl w:ilvl="7">
-      <w:tmpl w:val="D564D9A3"/>
+      <w:tmpl w:val="6DB90693"/>
       <w:start w:val="1"/>
       <w:numFmt w:val="lowerLetter"/>
       <w:lvlText w:val="%8."/>
@@ -3986,7 +4239,7 @@
       </w:pPr>
     </w:lvl>
     <w:lvl w:ilvl="8">
-      <w:tmpl w:val="3E38351A"/>
+      <w:tmpl w:val="525B9039"/>
       <w:start w:val="1"/>
       <w:numFmt w:val="lowerRoman"/>
       <w:lvlText w:val="%9."/>
@@ -3999,7 +4252,7 @@
   <w:abstractNum w:abstractNumId="18">
     <w:multiLevelType w:val="hybridMultilevel"/>
     <w:lvl w:ilvl="0">
-      <w:tmpl w:val="24C67C6F"/>
+      <w:tmpl w:val="8CC72796"/>
       <w:numFmt w:val="bullet"/>
       <w:lvlText w:val=""/>
       <w:rPr>
@@ -4011,7 +4264,7 @@
       </w:pPr>
     </w:lvl>
     <w:lvl w:ilvl="1">
-      <w:tmpl w:val="64938A1B"/>
+      <w:tmpl w:val="89D555BD"/>
       <w:numFmt w:val="bullet"/>
       <w:lvlText w:val="o"/>
       <w:rPr>
@@ -4023,7 +4276,7 @@
       </w:pPr>
     </w:lvl>
     <w:lvl w:ilvl="2">
-      <w:tmpl w:val="E8A12B69"/>
+      <w:tmpl w:val="7DDB6E21"/>
       <w:numFmt w:val="bullet"/>
       <w:lvlText w:val=""/>
       <w:rPr>
@@ -4035,7 +4288,7 @@
       </w:pPr>
     </w:lvl>
     <w:lvl w:ilvl="3">
-      <w:tmpl w:val="6CEB0D67"/>
+      <w:tmpl w:val="D906A7D2"/>
       <w:numFmt w:val="bullet"/>
       <w:lvlText w:val=""/>
       <w:rPr>
@@ -4047,7 +4300,7 @@
       </w:pPr>
     </w:lvl>
     <w:lvl w:ilvl="4">
-      <w:tmpl w:val="BDCC9E3E"/>
+      <w:tmpl w:val="D50228AF"/>
       <w:numFmt w:val="bullet"/>
       <w:lvlText w:val="o"/>
       <w:rPr>
@@ -4059,7 +4312,7 @@
       </w:pPr>
     </w:lvl>
     <w:lvl w:ilvl="5">
-      <w:tmpl w:val="4B0B3CC0"/>
+      <w:tmpl w:val="02238883"/>
       <w:numFmt w:val="bullet"/>
       <w:lvlText w:val=""/>
       <w:rPr>
@@ -4071,7 +4324,7 @@
       </w:pPr>
     </w:lvl>
     <w:lvl w:ilvl="6">
-      <w:tmpl w:val="5D1D0256"/>
+      <w:tmpl w:val="38CB6DCD"/>
       <w:numFmt w:val="bullet"/>
       <w:lvlText w:val=""/>
       <w:rPr>
@@ -4083,7 +4336,7 @@
       </w:pPr>
     </w:lvl>
     <w:lvl w:ilvl="7">
-      <w:tmpl w:val="0BC089B5"/>
+      <w:tmpl w:val="1EA7331B"/>
       <w:numFmt w:val="bullet"/>
       <w:lvlText w:val="o"/>
       <w:rPr>
@@ -4095,7 +4348,7 @@
       </w:pPr>
     </w:lvl>
     <w:lvl w:ilvl="8">
-      <w:tmpl w:val="9BD33517"/>
+      <w:tmpl w:val="0448F8CF"/>
       <w:numFmt w:val="bullet"/>
       <w:lvlText w:val=""/>
       <w:rPr>
@@ -5751,7 +6004,7 @@
   <Source>
     <Tag>fielding2000</Tag>
     <SourceType>Book</SourceType>
-    <Guid>{af588a9b-a827-4b4c-acfa-5d617665ec3c}</Guid>
+    <Guid>{38a23ffa-9dfc-4e3c-a230-5fef89b23d09}</Guid>
     <LCID>0</LCID>
     <Title>Architectural Styles and the Design of Network-based Software Architectures</Title>
     <Year>2000</Year>
@@ -5771,7 +6024,7 @@
   <Source>
     <Tag>humble2010</Tag>
     <SourceType>Book</SourceType>
-    <Guid>{0d6d2498-f1c2-4981-9dbc-bf078fa76dc7}</Guid>
+    <Guid>{3f4cdb92-b163-434a-b1da-f218a6816f34}</Guid>
     <LCID>0</LCID>
     <Title>Continuous Delivery</Title>
     <Year>2010</Year>
@@ -5796,7 +6049,7 @@
   <Source>
     <Tag>fowler2018</Tag>
     <SourceType>BookSection</SourceType>
-    <Guid>{1e09481e-d48b-4039-9524-1c35bbf9ff86}</Guid>
+    <Guid>{6d48b1fb-1ebc-4d73-8882-837055db95ff}</Guid>
     <LCID>0</LCID>
     <Title>Configuration Patterns</Title>
     <BookTitle>Refactoring -- Improving the Design of Existing Code</BookTitle>
@@ -5826,7 +6079,7 @@
   <Source>
     <Tag>markdig2024</Tag>
     <SourceType>InternetSite</SourceType>
-    <Guid>{41ec2755-be24-45ea-ae25-f1cdbbf916f4}</Guid>
+    <Guid>{bfbbc36a-a9bd-49fd-8ef9-f47ef715365c}</Guid>
     <LCID>0</LCID>
     <InternetSiteTitle>Markdig -- A Fast, Powerful, CommonMark Compliant Markdown Processor</InternetSiteTitle>
     <YearAccessed>2026</YearAccessed>
@@ -5847,7 +6100,7 @@
   <Source>
     <Tag>sixlabors2023</Tag>
     <SourceType>InternetSite</SourceType>
-    <Guid>{55bd87b5-dd30-47f6-a115-66e299f1759b}</Guid>
+    <Guid>{825d6911-f54f-4bdc-a36c-c2d6c9c84960}</Guid>
     <LCID>0</LCID>
     <InternetSiteTitle>ImageSharp -- A Modern, Cross-Platform, 2D Graphics Library</InternetSiteTitle>
     <YearAccessed>2026</YearAccessed>
@@ -5858,7 +6111,7 @@
   <Source>
     <Tag>microsoftOpenXml</Tag>
     <SourceType>DocumentFromInternetSite</SourceType>
-    <Guid>{587a2b52-3fd5-4817-9224-2d14e7ec7f70}</Guid>
+    <Guid>{e677b38a-232d-4742-a1a6-28af9a963da5}</Guid>
     <LCID>0</LCID>
     <InternetSiteTitle>Open XML SDK Documentation</InternetSiteTitle>
     <Year>2023</Year>
@@ -5881,7 +6134,7 @@
   <Source>
     <Tag>openxmlWebSite2024</Tag>
     <SourceType>InternetSite</SourceType>
-    <Guid>{2f9d0030-23f7-4b49-8295-29d28085491e}</Guid>
+    <Guid>{9341915e-caa7-4534-9a7a-45c1fd9a8baa}</Guid>
     <LCID>0</LCID>
     <InternetSiteTitle>ECMA-376 Office Open XML File Formats</InternetSiteTitle>
     <YearAccessed>2026</YearAccessed>
@@ -5892,7 +6145,7 @@
   <Source>
     <Tag>techWritingCase2019</Tag>
     <SourceType>JournalArticle</SourceType>
-    <Guid>{38e3fbf5-200e-43ee-93bf-be05bcbfd769}</Guid>
+    <Guid>{0295154a-f952-4b8c-ba1c-2270ea980e7b}</Guid>
     <LCID>0</LCID>
     <Title>Technological Developments in Document and Information Design</Title>
     <JournalName>Journal of Technical Writing and Communication</JournalName>

</xml_diff>

<commit_message>
Implement appendix relocation in Markdown processing
</commit_message>
<xml_diff>
--- a/sample/output.docx
+++ b/sample/output.docx
@@ -1048,7 +1048,7 @@
           <wp:inline distT="0" distB="0" distL="0" distR="0">
             <wp:extent cx="2857500" cy="2857500"/>
             <wp:effectExtent l="6350" t="6350" r="6350" b="6350"/>
-            <wp:docPr id="1894536106" name="Picture 1894536106"/>
+            <wp:docPr id="493226496" name="Picture 493226496"/>
             <wp:cNvGraphicFramePr>
               <a:graphicFrameLocks xmlns:a="http://schemas.openxmlformats.org/drawingml/2006/main" noChangeAspect="1"/>
             </wp:cNvGraphicFramePr>
@@ -1056,11 +1056,11 @@
               <a:graphicData uri="http://schemas.openxmlformats.org/drawingml/2006/picture">
                 <pic:pic xmlns:pic="http://schemas.openxmlformats.org/drawingml/2006/picture">
                   <pic:nvPicPr>
-                    <pic:cNvPr id="1894536183" name="placeholder-500.png"/>
+                    <pic:cNvPr id="493226532" name="placeholder-500.png"/>
                     <pic:cNvPicPr/>
                   </pic:nvPicPr>
                   <pic:blipFill>
-                    <a:blip r:embed="R023f55e63b56447a"/>
+                    <a:blip r:embed="R0658f59358a74ffa"/>
                     <a:stretch>
                       <a:fillRect/>
                     </a:stretch>
@@ -1127,7 +1127,7 @@
           <wp:inline distT="0" distB="0" distL="0" distR="0">
             <wp:extent cx="3810000" cy="2857500"/>
             <wp:effectExtent l="6350" t="6350" r="6350" b="6350"/>
-            <wp:docPr id="1895269132" name="Picture 1895269132"/>
+            <wp:docPr id="493750900" name="Picture 493750900"/>
             <wp:cNvGraphicFramePr>
               <a:graphicFrameLocks xmlns:a="http://schemas.openxmlformats.org/drawingml/2006/main" noChangeAspect="1"/>
             </wp:cNvGraphicFramePr>
@@ -1135,11 +1135,11 @@
               <a:graphicData uri="http://schemas.openxmlformats.org/drawingml/2006/picture">
                 <pic:pic xmlns:pic="http://schemas.openxmlformats.org/drawingml/2006/picture">
                   <pic:nvPicPr>
-                    <pic:cNvPr id="1895269142" name="placeholder-400-300.png"/>
+                    <pic:cNvPr id="493750907" name="placeholder-400-300.png"/>
                     <pic:cNvPicPr/>
                   </pic:nvPicPr>
                   <pic:blipFill>
-                    <a:blip r:embed="R2d6b3988c4234623"/>
+                    <a:blip r:embed="Rc5cc08ff828f4ecd"/>
                     <a:stretch>
                       <a:fillRect/>
                     </a:stretch>
@@ -1614,7 +1614,7 @@
           <wp:inline distT="0" distB="0" distL="0" distR="0">
             <wp:extent cx="3810000" cy="3810000"/>
             <wp:effectExtent l="6350" t="6350" r="6350" b="6350"/>
-            <wp:docPr id="1895289427" name="Picture 1895289427"/>
+            <wp:docPr id="493764410" name="Picture 493764410"/>
             <wp:cNvGraphicFramePr>
               <a:graphicFrameLocks xmlns:a="http://schemas.openxmlformats.org/drawingml/2006/main" noChangeAspect="1"/>
             </wp:cNvGraphicFramePr>
@@ -1622,11 +1622,11 @@
               <a:graphicData uri="http://schemas.openxmlformats.org/drawingml/2006/picture">
                 <pic:pic xmlns:pic="http://schemas.openxmlformats.org/drawingml/2006/picture">
                   <pic:nvPicPr>
-                    <pic:cNvPr id="1895289448" name="placeholder-500.png"/>
+                    <pic:cNvPr id="493764420" name="placeholder-500.png"/>
                     <pic:cNvPicPr/>
                   </pic:nvPicPr>
                   <pic:blipFill>
-                    <a:blip r:embed="R2dc4da1addcf41f5"/>
+                    <a:blip r:embed="Rc5bbb05a77024d82"/>
                     <a:stretch>
                       <a:fillRect/>
                     </a:stretch>
@@ -1688,9 +1688,234 @@
       <w:pPr>
         <w:pStyle w:val="Heading1"/>
       </w:pPr>
-      <w:bookmarkStart w:name="appendix" w:id="26"/>
+      <w:bookmarkStart w:name="references" w:id="26"/>
       <w:bookmarkEnd w:id="26"/>
       <w:r>
+        <w:t xml:space="preserve">References</w:t>
+      </w:r>
+    </w:p>
+    <w:p>
+      <w:pPr>
+        <w:pStyle w:val="Heading2"/>
+      </w:pPr>
+      <w:bookmarkStart w:name="inline-citations" w:id="27"/>
+      <w:bookmarkEnd w:id="27"/>
+      <w:r>
+        <w:t xml:space="preserve">Inline Citations</w:t>
+      </w:r>
+    </w:p>
+    <w:p>
+      <w:pPr>
+        <w:pStyle w:val="Body2"/>
+      </w:pPr>
+      <w:r>
+        <w:t xml:space="preserve">This section demonstrates inline citation syntax. The REST API design principles used here follow established guidelines</w:t>
+      </w:r>
+      <w:r>
+        <w:fldChar w:fldCharType="begin"/>
+      </w:r>
+      <w:r>
+        <w:instrText xml:space="preserve"> CITATION fielding2000 \l 1033 </w:instrText>
+      </w:r>
+      <w:r>
+        <w:fldChar w:fldCharType="separate"/>
+      </w:r>
+      <w:r>
+        <w:rPr>
+          <w:noProof/>
+        </w:rPr>
+        <w:t xml:space="preserve">[fielding2000]</w:t>
+      </w:r>
+      <w:r>
+        <w:fldChar w:fldCharType="end"/>
+      </w:r>
+      <w:r>
+        <w:t xml:space="preserve">. Configuration management best practices are documented in several sources</w:t>
+      </w:r>
+      <w:r>
+        <w:fldChar w:fldCharType="begin"/>
+      </w:r>
+      <w:r>
+        <w:instrText xml:space="preserve"> CITATION humble2010 \l 1033 </w:instrText>
+      </w:r>
+      <w:r>
+        <w:fldChar w:fldCharType="separate"/>
+      </w:r>
+      <w:r>
+        <w:rPr>
+          <w:noProof/>
+        </w:rPr>
+        <w:t xml:space="preserve">[humble2010]</w:t>
+      </w:r>
+      <w:r>
+        <w:fldChar w:fldCharType="end"/>
+      </w:r>
+      <w:r>
+        <w:fldChar w:fldCharType="begin"/>
+      </w:r>
+      <w:r>
+        <w:instrText xml:space="preserve"> CITATION fowler2018 \l 1033  \m humble2010</w:instrText>
+      </w:r>
+      <w:r>
+        <w:fldChar w:fldCharType="separate"/>
+      </w:r>
+      <w:r>
+        <w:rPr>
+          <w:noProof/>
+        </w:rPr>
+        <w:t xml:space="preserve">[fowler2018]</w:t>
+      </w:r>
+      <w:r>
+        <w:fldChar w:fldCharType="end"/>
+      </w:r>
+      <w:r>
+        <w:t xml:space="preserve">.</w:t>
+      </w:r>
+    </w:p>
+    <w:p>
+      <w:pPr>
+        <w:pStyle w:val="Body2"/>
+      </w:pPr>
+      <w:r>
+        <w:t xml:space="preserve">The markdown processing pipeline is built on the Markdig library</w:t>
+      </w:r>
+      <w:r>
+        <w:fldChar w:fldCharType="begin"/>
+      </w:r>
+      <w:r>
+        <w:instrText xml:space="preserve"> CITATION markdig2024 \l 1033 </w:instrText>
+      </w:r>
+      <w:r>
+        <w:fldChar w:fldCharType="separate"/>
+      </w:r>
+      <w:r>
+        <w:rPr>
+          <w:noProof/>
+        </w:rPr>
+        <w:t xml:space="preserve">[markdig2024]</w:t>
+      </w:r>
+      <w:r>
+        <w:fldChar w:fldCharType="end"/>
+      </w:r>
+      <w:r>
+        <w:t xml:space="preserve">, which supports CommonMark and a range of extensions. Image handling relies on the ImageSharp library for cross-platform dimension retrieval</w:t>
+      </w:r>
+      <w:r>
+        <w:fldChar w:fldCharType="begin"/>
+      </w:r>
+      <w:r>
+        <w:instrText xml:space="preserve"> CITATION sixlabors2023 \l 1033 </w:instrText>
+      </w:r>
+      <w:r>
+        <w:fldChar w:fldCharType="separate"/>
+      </w:r>
+      <w:r>
+        <w:rPr>
+          <w:noProof/>
+        </w:rPr>
+        <w:t xml:space="preserve">[sixlabors2023]</w:t>
+      </w:r>
+      <w:r>
+        <w:fldChar w:fldCharType="end"/>
+      </w:r>
+      <w:r>
+        <w:t xml:space="preserve">.</w:t>
+      </w:r>
+    </w:p>
+    <w:p>
+      <w:pPr>
+        <w:pStyle w:val="Body2"/>
+      </w:pPr>
+      <w:r>
+        <w:t xml:space="preserve">For further background on document generation workflows, see the official OpenXML specification</w:t>
+      </w:r>
+      <w:r>
+        <w:fldChar w:fldCharType="begin"/>
+      </w:r>
+      <w:r>
+        <w:instrText xml:space="preserve"> CITATION microsoftOpenXml \l 1033 </w:instrText>
+      </w:r>
+      <w:r>
+        <w:fldChar w:fldCharType="separate"/>
+      </w:r>
+      <w:r>
+        <w:rPr>
+          <w:noProof/>
+        </w:rPr>
+        <w:t xml:space="preserve">[microsoftOpenXml]</w:t>
+      </w:r>
+      <w:r>
+        <w:fldChar w:fldCharType="end"/>
+      </w:r>
+      <w:r>
+        <w:t xml:space="preserve"> and the related web resource</w:t>
+      </w:r>
+      <w:r>
+        <w:fldChar w:fldCharType="begin"/>
+      </w:r>
+      <w:r>
+        <w:instrText xml:space="preserve"> CITATION openxmlWebSite2024 \l 1033 </w:instrText>
+      </w:r>
+      <w:r>
+        <w:fldChar w:fldCharType="separate"/>
+      </w:r>
+      <w:r>
+        <w:rPr>
+          <w:noProof/>
+        </w:rPr>
+        <w:t xml:space="preserve">[openxmlWebSite2024]</w:t>
+      </w:r>
+      <w:r>
+        <w:fldChar w:fldCharType="end"/>
+      </w:r>
+      <w:r>
+        <w:t xml:space="preserve">.</w:t>
+      </w:r>
+    </w:p>
+    <w:p>
+      <w:pPr>
+        <w:pStyle w:val="Body2"/>
+      </w:pPr>
+      <w:r>
+        <w:t xml:space="preserve">A case study on tooling for technical writing is also referenced here</w:t>
+      </w:r>
+      <w:r>
+        <w:fldChar w:fldCharType="begin"/>
+      </w:r>
+      <w:r>
+        <w:instrText xml:space="preserve"> CITATION techWritingCase2019 \l 1033 </w:instrText>
+      </w:r>
+      <w:r>
+        <w:fldChar w:fldCharType="separate"/>
+      </w:r>
+      <w:r>
+        <w:rPr>
+          <w:noProof/>
+        </w:rPr>
+        <w:t xml:space="preserve">[techWritingCase2019]</w:t>
+      </w:r>
+      <w:r>
+        <w:fldChar w:fldCharType="end"/>
+      </w:r>
+      <w:r>
+        <w:t xml:space="preserve">.</w:t>
+      </w:r>
+    </w:p>
+    <w:p>
+      <w:pPr>
+        <w:pStyle w:val="Body2"/>
+      </w:pPr>
+      <w:r>
+        <w:br w:type="page"/>
+      </w:r>
+    </w:p>
+    <w:p>
+      <w:pPr>
+        <w:pStyle w:val="Heading1"/>
+      </w:pPr>
+      <w:bookmarkStart w:name="appendix" w:id="29"/>
+      <w:bookmarkEnd w:id="29"/>
+      <w:r>
         <w:t xml:space="preserve">Appendix</w:t>
       </w:r>
     </w:p>
@@ -1706,8 +1931,8 @@
       <w:pPr>
         <w:pStyle w:val="Heading2"/>
       </w:pPr>
-      <w:bookmarkStart w:name="formatting-examples" w:id="27"/>
-      <w:bookmarkEnd w:id="27"/>
+      <w:bookmarkStart w:name="formatting-examples" w:id="30"/>
+      <w:bookmarkEnd w:id="30"/>
       <w:r>
         <w:t xml:space="preserve">Formatting Examples</w:t>
       </w:r>
@@ -1777,8 +2002,8 @@
       <w:pPr>
         <w:pStyle w:val="Heading3"/>
       </w:pPr>
-      <w:bookmarkStart w:name="small-table" w:id="28"/>
-      <w:bookmarkEnd w:id="28"/>
+      <w:bookmarkStart w:name="small-table" w:id="31"/>
+      <w:bookmarkEnd w:id="31"/>
       <w:r>
         <w:t xml:space="preserve">Small Table</w:t>
       </w:r>
@@ -1788,8 +2013,8 @@
         <w:pStyle w:val="Caption"/>
         <w:jc w:val="center"/>
       </w:pPr>
-      <w:bookmarkStart w:name="tbl-small-example" w:id="29"/>
-      <w:bookmarkEnd w:id="29"/>
+      <w:bookmarkStart w:name="tbl-small-example" w:id="32"/>
+      <w:bookmarkEnd w:id="32"/>
       <w:r>
         <w:t xml:space="preserve">Table </w:t>
       </w:r>
@@ -1953,8 +2178,8 @@
       <w:pPr>
         <w:pStyle w:val="Heading4"/>
       </w:pPr>
-      <w:bookmarkStart w:name="final-codeblock" w:id="30"/>
-      <w:bookmarkEnd w:id="30"/>
+      <w:bookmarkStart w:name="final-codeblock" w:id="33"/>
+      <w:bookmarkEnd w:id="33"/>
       <w:r>
         <w:t xml:space="preserve">Final Codeblock</w:t>
       </w:r>
@@ -1995,8 +2220,8 @@
       <w:pPr>
         <w:pStyle w:val="Heading4"/>
       </w:pPr>
-      <w:bookmarkStart w:name="codeblock-with-formatting" w:id="31"/>
-      <w:bookmarkEnd w:id="31"/>
+      <w:bookmarkStart w:name="codeblock-with-formatting" w:id="34"/>
+      <w:bookmarkEnd w:id="34"/>
       <w:r>
         <w:t xml:space="preserve">Codeblock With Formatting</w:t>
       </w:r>
@@ -2060,223 +2285,6 @@
       </w:pPr>
       <w:r>
         <w:t xml:space="preserve">End of example content.</w:t>
-      </w:r>
-    </w:p>
-    <w:p>
-      <w:pPr>
-        <w:pStyle w:val="Heading1"/>
-      </w:pPr>
-      <w:bookmarkStart w:name="references" w:id="32"/>
-      <w:bookmarkEnd w:id="32"/>
-      <w:r>
-        <w:t xml:space="preserve">References</w:t>
-      </w:r>
-    </w:p>
-    <w:p>
-      <w:pPr>
-        <w:pStyle w:val="Heading2"/>
-      </w:pPr>
-      <w:bookmarkStart w:name="inline-citations" w:id="33"/>
-      <w:bookmarkEnd w:id="33"/>
-      <w:r>
-        <w:t xml:space="preserve">Inline Citations</w:t>
-      </w:r>
-    </w:p>
-    <w:p>
-      <w:pPr>
-        <w:pStyle w:val="Body2"/>
-      </w:pPr>
-      <w:r>
-        <w:t xml:space="preserve">This section demonstrates inline citation syntax. The REST API design principles used here follow established guidelines</w:t>
-      </w:r>
-      <w:r>
-        <w:fldChar w:fldCharType="begin"/>
-      </w:r>
-      <w:r>
-        <w:instrText xml:space="preserve"> CITATION fielding2000 \l 1033 </w:instrText>
-      </w:r>
-      <w:r>
-        <w:fldChar w:fldCharType="separate"/>
-      </w:r>
-      <w:r>
-        <w:rPr>
-          <w:noProof/>
-        </w:rPr>
-        <w:t xml:space="preserve">[fielding2000]</w:t>
-      </w:r>
-      <w:r>
-        <w:fldChar w:fldCharType="end"/>
-      </w:r>
-      <w:r>
-        <w:t xml:space="preserve">. Configuration management best practices are documented in several sources</w:t>
-      </w:r>
-      <w:r>
-        <w:fldChar w:fldCharType="begin"/>
-      </w:r>
-      <w:r>
-        <w:instrText xml:space="preserve"> CITATION humble2010 \l 1033 </w:instrText>
-      </w:r>
-      <w:r>
-        <w:fldChar w:fldCharType="separate"/>
-      </w:r>
-      <w:r>
-        <w:rPr>
-          <w:noProof/>
-        </w:rPr>
-        <w:t xml:space="preserve">[humble2010]</w:t>
-      </w:r>
-      <w:r>
-        <w:fldChar w:fldCharType="end"/>
-      </w:r>
-      <w:r>
-        <w:fldChar w:fldCharType="begin"/>
-      </w:r>
-      <w:r>
-        <w:instrText xml:space="preserve"> CITATION fowler2018 \l 1033  \m humble2010</w:instrText>
-      </w:r>
-      <w:r>
-        <w:fldChar w:fldCharType="separate"/>
-      </w:r>
-      <w:r>
-        <w:rPr>
-          <w:noProof/>
-        </w:rPr>
-        <w:t xml:space="preserve">[fowler2018]</w:t>
-      </w:r>
-      <w:r>
-        <w:fldChar w:fldCharType="end"/>
-      </w:r>
-      <w:r>
-        <w:t xml:space="preserve">.</w:t>
-      </w:r>
-    </w:p>
-    <w:p>
-      <w:pPr>
-        <w:pStyle w:val="Body2"/>
-      </w:pPr>
-      <w:r>
-        <w:t xml:space="preserve">The markdown processing pipeline is built on the Markdig library</w:t>
-      </w:r>
-      <w:r>
-        <w:fldChar w:fldCharType="begin"/>
-      </w:r>
-      <w:r>
-        <w:instrText xml:space="preserve"> CITATION markdig2024 \l 1033 </w:instrText>
-      </w:r>
-      <w:r>
-        <w:fldChar w:fldCharType="separate"/>
-      </w:r>
-      <w:r>
-        <w:rPr>
-          <w:noProof/>
-        </w:rPr>
-        <w:t xml:space="preserve">[markdig2024]</w:t>
-      </w:r>
-      <w:r>
-        <w:fldChar w:fldCharType="end"/>
-      </w:r>
-      <w:r>
-        <w:t xml:space="preserve">, which supports CommonMark and a range of extensions. Image handling relies on the ImageSharp library for cross-platform dimension retrieval</w:t>
-      </w:r>
-      <w:r>
-        <w:fldChar w:fldCharType="begin"/>
-      </w:r>
-      <w:r>
-        <w:instrText xml:space="preserve"> CITATION sixlabors2023 \l 1033 </w:instrText>
-      </w:r>
-      <w:r>
-        <w:fldChar w:fldCharType="separate"/>
-      </w:r>
-      <w:r>
-        <w:rPr>
-          <w:noProof/>
-        </w:rPr>
-        <w:t xml:space="preserve">[sixlabors2023]</w:t>
-      </w:r>
-      <w:r>
-        <w:fldChar w:fldCharType="end"/>
-      </w:r>
-      <w:r>
-        <w:t xml:space="preserve">.</w:t>
-      </w:r>
-    </w:p>
-    <w:p>
-      <w:pPr>
-        <w:pStyle w:val="Body2"/>
-      </w:pPr>
-      <w:r>
-        <w:t xml:space="preserve">For further background on document generation workflows, see the official OpenXML specification</w:t>
-      </w:r>
-      <w:r>
-        <w:fldChar w:fldCharType="begin"/>
-      </w:r>
-      <w:r>
-        <w:instrText xml:space="preserve"> CITATION microsoftOpenXml \l 1033 </w:instrText>
-      </w:r>
-      <w:r>
-        <w:fldChar w:fldCharType="separate"/>
-      </w:r>
-      <w:r>
-        <w:rPr>
-          <w:noProof/>
-        </w:rPr>
-        <w:t xml:space="preserve">[microsoftOpenXml]</w:t>
-      </w:r>
-      <w:r>
-        <w:fldChar w:fldCharType="end"/>
-      </w:r>
-      <w:r>
-        <w:t xml:space="preserve"> and the related web resource</w:t>
-      </w:r>
-      <w:r>
-        <w:fldChar w:fldCharType="begin"/>
-      </w:r>
-      <w:r>
-        <w:instrText xml:space="preserve"> CITATION openxmlWebSite2024 \l 1033 </w:instrText>
-      </w:r>
-      <w:r>
-        <w:fldChar w:fldCharType="separate"/>
-      </w:r>
-      <w:r>
-        <w:rPr>
-          <w:noProof/>
-        </w:rPr>
-        <w:t xml:space="preserve">[openxmlWebSite2024]</w:t>
-      </w:r>
-      <w:r>
-        <w:fldChar w:fldCharType="end"/>
-      </w:r>
-      <w:r>
-        <w:t xml:space="preserve">.</w:t>
-      </w:r>
-    </w:p>
-    <w:p>
-      <w:pPr>
-        <w:pStyle w:val="Body2"/>
-      </w:pPr>
-      <w:r>
-        <w:t xml:space="preserve">A case study on tooling for technical writing is also referenced here</w:t>
-      </w:r>
-      <w:r>
-        <w:fldChar w:fldCharType="begin"/>
-      </w:r>
-      <w:r>
-        <w:instrText xml:space="preserve"> CITATION techWritingCase2019 \l 1033 </w:instrText>
-      </w:r>
-      <w:r>
-        <w:fldChar w:fldCharType="separate"/>
-      </w:r>
-      <w:r>
-        <w:rPr>
-          <w:noProof/>
-        </w:rPr>
-        <w:t xml:space="preserve">[techWritingCase2019]</w:t>
-      </w:r>
-      <w:r>
-        <w:fldChar w:fldCharType="end"/>
-      </w:r>
-      <w:r>
-        <w:t xml:space="preserve">.</w:t>
       </w:r>
     </w:p>
     <w:sdt>
@@ -2917,7 +2925,7 @@
   <w:abstractNum w:abstractNumId="5">
     <w:multiLevelType w:val="hybridMultilevel"/>
     <w:lvl w:ilvl="0">
-      <w:tmpl w:val="D1EE1365"/>
+      <w:tmpl w:val="C8A5C565"/>
       <w:numFmt w:val="bullet"/>
       <w:lvlText w:val=""/>
       <w:rPr>
@@ -2929,7 +2937,7 @@
       </w:pPr>
     </w:lvl>
     <w:lvl w:ilvl="1">
-      <w:tmpl w:val="F5CF72A3"/>
+      <w:tmpl w:val="A61B897F"/>
       <w:numFmt w:val="bullet"/>
       <w:lvlText w:val="o"/>
       <w:rPr>
@@ -2941,7 +2949,7 @@
       </w:pPr>
     </w:lvl>
     <w:lvl w:ilvl="2">
-      <w:tmpl w:val="A27224A2"/>
+      <w:tmpl w:val="F7879D10"/>
       <w:numFmt w:val="bullet"/>
       <w:lvlText w:val=""/>
       <w:rPr>
@@ -2953,7 +2961,7 @@
       </w:pPr>
     </w:lvl>
     <w:lvl w:ilvl="3">
-      <w:tmpl w:val="82B1F095"/>
+      <w:tmpl w:val="897A1F99"/>
       <w:numFmt w:val="bullet"/>
       <w:lvlText w:val=""/>
       <w:rPr>
@@ -2965,7 +2973,7 @@
       </w:pPr>
     </w:lvl>
     <w:lvl w:ilvl="4">
-      <w:tmpl w:val="F9A44758"/>
+      <w:tmpl w:val="7AC828DB"/>
       <w:numFmt w:val="bullet"/>
       <w:lvlText w:val="o"/>
       <w:rPr>
@@ -2977,7 +2985,7 @@
       </w:pPr>
     </w:lvl>
     <w:lvl w:ilvl="5">
-      <w:tmpl w:val="F44B49BE"/>
+      <w:tmpl w:val="73489E40"/>
       <w:numFmt w:val="bullet"/>
       <w:lvlText w:val=""/>
       <w:rPr>
@@ -2989,7 +2997,7 @@
       </w:pPr>
     </w:lvl>
     <w:lvl w:ilvl="6">
-      <w:tmpl w:val="3C27A899"/>
+      <w:tmpl w:val="33BDD60B"/>
       <w:numFmt w:val="bullet"/>
       <w:lvlText w:val=""/>
       <w:rPr>
@@ -3001,7 +3009,7 @@
       </w:pPr>
     </w:lvl>
     <w:lvl w:ilvl="7">
-      <w:tmpl w:val="988017CB"/>
+      <w:tmpl w:val="443F688F"/>
       <w:numFmt w:val="bullet"/>
       <w:lvlText w:val="o"/>
       <w:rPr>
@@ -3013,7 +3021,7 @@
       </w:pPr>
     </w:lvl>
     <w:lvl w:ilvl="8">
-      <w:tmpl w:val="D8E3E9E9"/>
+      <w:tmpl w:val="C51BB22B"/>
       <w:numFmt w:val="bullet"/>
       <w:lvlText w:val=""/>
       <w:rPr>
@@ -3028,7 +3036,7 @@
   <w:abstractNum w:abstractNumId="6">
     <w:multiLevelType w:val="hybridMultilevel"/>
     <w:lvl w:ilvl="0">
-      <w:tmpl w:val="B2CB7770"/>
+      <w:tmpl w:val="E775CE42"/>
       <w:start w:val="1"/>
       <w:numFmt w:val="decimal"/>
       <w:lvlText w:val="%1."/>
@@ -3038,7 +3046,7 @@
       </w:pPr>
     </w:lvl>
     <w:lvl w:ilvl="1">
-      <w:tmpl w:val="37278744"/>
+      <w:tmpl w:val="E8FD0FEC"/>
       <w:start w:val="1"/>
       <w:numFmt w:val="lowerLetter"/>
       <w:lvlText w:val="%2."/>
@@ -3048,7 +3056,7 @@
       </w:pPr>
     </w:lvl>
     <w:lvl w:ilvl="2">
-      <w:tmpl w:val="6CC61415"/>
+      <w:tmpl w:val="9DD90B59"/>
       <w:start w:val="1"/>
       <w:numFmt w:val="lowerRoman"/>
       <w:lvlText w:val="%3."/>
@@ -3058,7 +3066,7 @@
       </w:pPr>
     </w:lvl>
     <w:lvl w:ilvl="3">
-      <w:tmpl w:val="28897B57"/>
+      <w:tmpl w:val="256FACA1"/>
       <w:start w:val="1"/>
       <w:numFmt w:val="decimal"/>
       <w:lvlText w:val="%4."/>
@@ -3068,7 +3076,7 @@
       </w:pPr>
     </w:lvl>
     <w:lvl w:ilvl="4">
-      <w:tmpl w:val="E4900C45"/>
+      <w:tmpl w:val="80B75D41"/>
       <w:start w:val="1"/>
       <w:numFmt w:val="lowerLetter"/>
       <w:lvlText w:val="%5."/>
@@ -3078,7 +3086,7 @@
       </w:pPr>
     </w:lvl>
     <w:lvl w:ilvl="5">
-      <w:tmpl w:val="87C70B4C"/>
+      <w:tmpl w:val="649B3BF2"/>
       <w:start w:val="1"/>
       <w:numFmt w:val="lowerRoman"/>
       <w:lvlText w:val="%6."/>
@@ -3088,7 +3096,7 @@
       </w:pPr>
     </w:lvl>
     <w:lvl w:ilvl="6">
-      <w:tmpl w:val="3A8509D9"/>
+      <w:tmpl w:val="73A94908"/>
       <w:start w:val="1"/>
       <w:numFmt w:val="decimal"/>
       <w:lvlText w:val="%7."/>
@@ -3098,7 +3106,7 @@
       </w:pPr>
     </w:lvl>
     <w:lvl w:ilvl="7">
-      <w:tmpl w:val="1A181238"/>
+      <w:tmpl w:val="7B38E4A6"/>
       <w:start w:val="1"/>
       <w:numFmt w:val="lowerLetter"/>
       <w:lvlText w:val="%8."/>
@@ -3108,7 +3116,7 @@
       </w:pPr>
     </w:lvl>
     <w:lvl w:ilvl="8">
-      <w:tmpl w:val="39E7E33B"/>
+      <w:tmpl w:val="647042F5"/>
       <w:start w:val="1"/>
       <w:numFmt w:val="lowerRoman"/>
       <w:lvlText w:val="%9."/>
@@ -3121,7 +3129,7 @@
   <w:abstractNum w:abstractNumId="7">
     <w:multiLevelType w:val="hybridMultilevel"/>
     <w:lvl w:ilvl="0">
-      <w:tmpl w:val="2CF76AA0"/>
+      <w:tmpl w:val="905DC75D"/>
       <w:numFmt w:val="bullet"/>
       <w:lvlText w:val=""/>
       <w:rPr>
@@ -3133,7 +3141,7 @@
       </w:pPr>
     </w:lvl>
     <w:lvl w:ilvl="1">
-      <w:tmpl w:val="AA77F96D"/>
+      <w:tmpl w:val="4368FBED"/>
       <w:numFmt w:val="bullet"/>
       <w:lvlText w:val="o"/>
       <w:rPr>
@@ -3145,7 +3153,7 @@
       </w:pPr>
     </w:lvl>
     <w:lvl w:ilvl="2">
-      <w:tmpl w:val="D6FF60BF"/>
+      <w:tmpl w:val="45E4F897"/>
       <w:numFmt w:val="bullet"/>
       <w:lvlText w:val=""/>
       <w:rPr>
@@ -3157,7 +3165,7 @@
       </w:pPr>
     </w:lvl>
     <w:lvl w:ilvl="3">
-      <w:tmpl w:val="81E0EE26"/>
+      <w:tmpl w:val="079FAD4E"/>
       <w:numFmt w:val="bullet"/>
       <w:lvlText w:val=""/>
       <w:rPr>
@@ -3169,7 +3177,7 @@
       </w:pPr>
     </w:lvl>
     <w:lvl w:ilvl="4">
-      <w:tmpl w:val="856743FE"/>
+      <w:tmpl w:val="CCDAE275"/>
       <w:numFmt w:val="bullet"/>
       <w:lvlText w:val="o"/>
       <w:rPr>
@@ -3181,7 +3189,7 @@
       </w:pPr>
     </w:lvl>
     <w:lvl w:ilvl="5">
-      <w:tmpl w:val="ED335843"/>
+      <w:tmpl w:val="620CD401"/>
       <w:numFmt w:val="bullet"/>
       <w:lvlText w:val=""/>
       <w:rPr>
@@ -3193,7 +3201,7 @@
       </w:pPr>
     </w:lvl>
     <w:lvl w:ilvl="6">
-      <w:tmpl w:val="11663778"/>
+      <w:tmpl w:val="B156182E"/>
       <w:numFmt w:val="bullet"/>
       <w:lvlText w:val=""/>
       <w:rPr>
@@ -3205,7 +3213,7 @@
       </w:pPr>
     </w:lvl>
     <w:lvl w:ilvl="7">
-      <w:tmpl w:val="624CCDC2"/>
+      <w:tmpl w:val="10F0E542"/>
       <w:numFmt w:val="bullet"/>
       <w:lvlText w:val="o"/>
       <w:rPr>
@@ -3217,7 +3225,7 @@
       </w:pPr>
     </w:lvl>
     <w:lvl w:ilvl="8">
-      <w:tmpl w:val="FEDC4FDD"/>
+      <w:tmpl w:val="2EB6348C"/>
       <w:numFmt w:val="bullet"/>
       <w:lvlText w:val=""/>
       <w:rPr>
@@ -3232,7 +3240,7 @@
   <w:abstractNum w:abstractNumId="8">
     <w:multiLevelType w:val="hybridMultilevel"/>
     <w:lvl w:ilvl="0">
-      <w:tmpl w:val="16F496E7"/>
+      <w:tmpl w:val="8391A3E0"/>
       <w:start w:val="1"/>
       <w:numFmt w:val="decimal"/>
       <w:lvlText w:val="%1."/>
@@ -3242,7 +3250,7 @@
       </w:pPr>
     </w:lvl>
     <w:lvl w:ilvl="1">
-      <w:tmpl w:val="7E787B40"/>
+      <w:tmpl w:val="7E361B18"/>
       <w:start w:val="1"/>
       <w:numFmt w:val="lowerLetter"/>
       <w:lvlText w:val="%2."/>
@@ -3252,7 +3260,7 @@
       </w:pPr>
     </w:lvl>
     <w:lvl w:ilvl="2">
-      <w:tmpl w:val="936E3BAC"/>
+      <w:tmpl w:val="63BFEC93"/>
       <w:start w:val="1"/>
       <w:numFmt w:val="lowerRoman"/>
       <w:lvlText w:val="%3."/>
@@ -3262,7 +3270,7 @@
       </w:pPr>
     </w:lvl>
     <w:lvl w:ilvl="3">
-      <w:tmpl w:val="50F5F4D7"/>
+      <w:tmpl w:val="CD70B1BC"/>
       <w:start w:val="1"/>
       <w:numFmt w:val="decimal"/>
       <w:lvlText w:val="%4."/>
@@ -3272,7 +3280,7 @@
       </w:pPr>
     </w:lvl>
     <w:lvl w:ilvl="4">
-      <w:tmpl w:val="E0FA6A5E"/>
+      <w:tmpl w:val="A0ABB69B"/>
       <w:start w:val="1"/>
       <w:numFmt w:val="lowerLetter"/>
       <w:lvlText w:val="%5."/>
@@ -3282,7 +3290,7 @@
       </w:pPr>
     </w:lvl>
     <w:lvl w:ilvl="5">
-      <w:tmpl w:val="A20D6A0E"/>
+      <w:tmpl w:val="BDE54474"/>
       <w:start w:val="1"/>
       <w:numFmt w:val="lowerRoman"/>
       <w:lvlText w:val="%6."/>
@@ -3292,7 +3300,7 @@
       </w:pPr>
     </w:lvl>
     <w:lvl w:ilvl="6">
-      <w:tmpl w:val="47053C4B"/>
+      <w:tmpl w:val="16C860A4"/>
       <w:start w:val="1"/>
       <w:numFmt w:val="decimal"/>
       <w:lvlText w:val="%7."/>
@@ -3302,7 +3310,7 @@
       </w:pPr>
     </w:lvl>
     <w:lvl w:ilvl="7">
-      <w:tmpl w:val="B910B3CF"/>
+      <w:tmpl w:val="D33D17C3"/>
       <w:start w:val="1"/>
       <w:numFmt w:val="lowerLetter"/>
       <w:lvlText w:val="%8."/>
@@ -3312,7 +3320,7 @@
       </w:pPr>
     </w:lvl>
     <w:lvl w:ilvl="8">
-      <w:tmpl w:val="E8D6DAD9"/>
+      <w:tmpl w:val="1E3242AD"/>
       <w:start w:val="1"/>
       <w:numFmt w:val="lowerRoman"/>
       <w:lvlText w:val="%9."/>
@@ -3325,7 +3333,7 @@
   <w:abstractNum w:abstractNumId="9">
     <w:multiLevelType w:val="hybridMultilevel"/>
     <w:lvl w:ilvl="0">
-      <w:tmpl w:val="C841527E"/>
+      <w:tmpl w:val="535462AB"/>
       <w:numFmt w:val="bullet"/>
       <w:lvlText w:val=""/>
       <w:rPr>
@@ -3337,7 +3345,7 @@
       </w:pPr>
     </w:lvl>
     <w:lvl w:ilvl="1">
-      <w:tmpl w:val="AF7ABB0C"/>
+      <w:tmpl w:val="2D920874"/>
       <w:numFmt w:val="bullet"/>
       <w:lvlText w:val="o"/>
       <w:rPr>
@@ -3349,7 +3357,7 @@
       </w:pPr>
     </w:lvl>
     <w:lvl w:ilvl="2">
-      <w:tmpl w:val="076F9F57"/>
+      <w:tmpl w:val="320BE254"/>
       <w:numFmt w:val="bullet"/>
       <w:lvlText w:val=""/>
       <w:rPr>
@@ -3361,7 +3369,7 @@
       </w:pPr>
     </w:lvl>
     <w:lvl w:ilvl="3">
-      <w:tmpl w:val="A476C7C1"/>
+      <w:tmpl w:val="2D145CF5"/>
       <w:numFmt w:val="bullet"/>
       <w:lvlText w:val=""/>
       <w:rPr>
@@ -3373,7 +3381,7 @@
       </w:pPr>
     </w:lvl>
     <w:lvl w:ilvl="4">
-      <w:tmpl w:val="983A9A86"/>
+      <w:tmpl w:val="D9A212D5"/>
       <w:numFmt w:val="bullet"/>
       <w:lvlText w:val="o"/>
       <w:rPr>
@@ -3385,7 +3393,7 @@
       </w:pPr>
     </w:lvl>
     <w:lvl w:ilvl="5">
-      <w:tmpl w:val="1B9ADA2A"/>
+      <w:tmpl w:val="011B75A0"/>
       <w:numFmt w:val="bullet"/>
       <w:lvlText w:val=""/>
       <w:rPr>
@@ -3397,7 +3405,7 @@
       </w:pPr>
     </w:lvl>
     <w:lvl w:ilvl="6">
-      <w:tmpl w:val="3F6B9526"/>
+      <w:tmpl w:val="B851A476"/>
       <w:numFmt w:val="bullet"/>
       <w:lvlText w:val=""/>
       <w:rPr>
@@ -3409,7 +3417,7 @@
       </w:pPr>
     </w:lvl>
     <w:lvl w:ilvl="7">
-      <w:tmpl w:val="4584E28E"/>
+      <w:tmpl w:val="5AD8F6F1"/>
       <w:numFmt w:val="bullet"/>
       <w:lvlText w:val="o"/>
       <w:rPr>
@@ -3421,7 +3429,7 @@
       </w:pPr>
     </w:lvl>
     <w:lvl w:ilvl="8">
-      <w:tmpl w:val="039A32CC"/>
+      <w:tmpl w:val="98CF03D3"/>
       <w:numFmt w:val="bullet"/>
       <w:lvlText w:val=""/>
       <w:rPr>
@@ -3436,7 +3444,7 @@
   <w:abstractNum w:abstractNumId="10">
     <w:multiLevelType w:val="hybridMultilevel"/>
     <w:lvl w:ilvl="0">
-      <w:tmpl w:val="534859B2"/>
+      <w:tmpl w:val="BABA0A04"/>
       <w:start w:val="1"/>
       <w:numFmt w:val="decimal"/>
       <w:lvlText w:val="%1."/>
@@ -3446,7 +3454,7 @@
       </w:pPr>
     </w:lvl>
     <w:lvl w:ilvl="1">
-      <w:tmpl w:val="89E49722"/>
+      <w:tmpl w:val="D06AC879"/>
       <w:start w:val="1"/>
       <w:numFmt w:val="lowerLetter"/>
       <w:lvlText w:val="%2."/>
@@ -3456,7 +3464,7 @@
       </w:pPr>
     </w:lvl>
     <w:lvl w:ilvl="2">
-      <w:tmpl w:val="39583504"/>
+      <w:tmpl w:val="FF514AE6"/>
       <w:start w:val="1"/>
       <w:numFmt w:val="lowerRoman"/>
       <w:lvlText w:val="%3."/>
@@ -3466,7 +3474,7 @@
       </w:pPr>
     </w:lvl>
     <w:lvl w:ilvl="3">
-      <w:tmpl w:val="EA64FD29"/>
+      <w:tmpl w:val="C7EF95EC"/>
       <w:start w:val="1"/>
       <w:numFmt w:val="decimal"/>
       <w:lvlText w:val="%4."/>
@@ -3476,7 +3484,7 @@
       </w:pPr>
     </w:lvl>
     <w:lvl w:ilvl="4">
-      <w:tmpl w:val="A4946861"/>
+      <w:tmpl w:val="4388F4F3"/>
       <w:start w:val="1"/>
       <w:numFmt w:val="lowerLetter"/>
       <w:lvlText w:val="%5."/>
@@ -3486,7 +3494,7 @@
       </w:pPr>
     </w:lvl>
     <w:lvl w:ilvl="5">
-      <w:tmpl w:val="2E21F10A"/>
+      <w:tmpl w:val="299747FA"/>
       <w:start w:val="1"/>
       <w:numFmt w:val="lowerRoman"/>
       <w:lvlText w:val="%6."/>
@@ -3496,7 +3504,7 @@
       </w:pPr>
     </w:lvl>
     <w:lvl w:ilvl="6">
-      <w:tmpl w:val="2E7B3222"/>
+      <w:tmpl w:val="77C8A5A4"/>
       <w:start w:val="1"/>
       <w:numFmt w:val="decimal"/>
       <w:lvlText w:val="%7."/>
@@ -3506,7 +3514,7 @@
       </w:pPr>
     </w:lvl>
     <w:lvl w:ilvl="7">
-      <w:tmpl w:val="8FF5AC31"/>
+      <w:tmpl w:val="856EA815"/>
       <w:start w:val="1"/>
       <w:numFmt w:val="lowerLetter"/>
       <w:lvlText w:val="%8."/>
@@ -3516,7 +3524,7 @@
       </w:pPr>
     </w:lvl>
     <w:lvl w:ilvl="8">
-      <w:tmpl w:val="1D900E5C"/>
+      <w:tmpl w:val="4C55A69A"/>
       <w:start w:val="1"/>
       <w:numFmt w:val="lowerRoman"/>
       <w:lvlText w:val="%9."/>
@@ -3529,7 +3537,7 @@
   <w:abstractNum w:abstractNumId="11">
     <w:multiLevelType w:val="hybridMultilevel"/>
     <w:lvl w:ilvl="0">
-      <w:tmpl w:val="AA76862F"/>
+      <w:tmpl w:val="6F9ABBB9"/>
       <w:numFmt w:val="bullet"/>
       <w:lvlText w:val=""/>
       <w:rPr>
@@ -3541,7 +3549,7 @@
       </w:pPr>
     </w:lvl>
     <w:lvl w:ilvl="1">
-      <w:tmpl w:val="7E948431"/>
+      <w:tmpl w:val="332C5763"/>
       <w:numFmt w:val="bullet"/>
       <w:lvlText w:val="o"/>
       <w:rPr>
@@ -3553,7 +3561,7 @@
       </w:pPr>
     </w:lvl>
     <w:lvl w:ilvl="2">
-      <w:tmpl w:val="39A255E7"/>
+      <w:tmpl w:val="17C52E89"/>
       <w:numFmt w:val="bullet"/>
       <w:lvlText w:val=""/>
       <w:rPr>
@@ -3565,7 +3573,7 @@
       </w:pPr>
     </w:lvl>
     <w:lvl w:ilvl="3">
-      <w:tmpl w:val="90EC560F"/>
+      <w:tmpl w:val="A9C80A23"/>
       <w:numFmt w:val="bullet"/>
       <w:lvlText w:val=""/>
       <w:rPr>
@@ -3577,7 +3585,7 @@
       </w:pPr>
     </w:lvl>
     <w:lvl w:ilvl="4">
-      <w:tmpl w:val="F9C3F253"/>
+      <w:tmpl w:val="2E279B40"/>
       <w:numFmt w:val="bullet"/>
       <w:lvlText w:val="o"/>
       <w:rPr>
@@ -3589,7 +3597,7 @@
       </w:pPr>
     </w:lvl>
     <w:lvl w:ilvl="5">
-      <w:tmpl w:val="F35351B8"/>
+      <w:tmpl w:val="85C3C8D7"/>
       <w:numFmt w:val="bullet"/>
       <w:lvlText w:val=""/>
       <w:rPr>
@@ -3601,7 +3609,7 @@
       </w:pPr>
     </w:lvl>
     <w:lvl w:ilvl="6">
-      <w:tmpl w:val="06D2C132"/>
+      <w:tmpl w:val="C7FE26DF"/>
       <w:numFmt w:val="bullet"/>
       <w:lvlText w:val=""/>
       <w:rPr>
@@ -3613,7 +3621,7 @@
       </w:pPr>
     </w:lvl>
     <w:lvl w:ilvl="7">
-      <w:tmpl w:val="584A2E88"/>
+      <w:tmpl w:val="423D7401"/>
       <w:numFmt w:val="bullet"/>
       <w:lvlText w:val="o"/>
       <w:rPr>
@@ -3625,7 +3633,7 @@
       </w:pPr>
     </w:lvl>
     <w:lvl w:ilvl="8">
-      <w:tmpl w:val="5FA8BBD8"/>
+      <w:tmpl w:val="45F1B2C2"/>
       <w:numFmt w:val="bullet"/>
       <w:lvlText w:val=""/>
       <w:rPr>
@@ -3640,7 +3648,7 @@
   <w:abstractNum w:abstractNumId="12">
     <w:multiLevelType w:val="hybridMultilevel"/>
     <w:lvl w:ilvl="0">
-      <w:tmpl w:val="D6385060"/>
+      <w:tmpl w:val="E89EF9C1"/>
       <w:start w:val="1"/>
       <w:numFmt w:val="decimal"/>
       <w:lvlText w:val="%1."/>
@@ -3650,7 +3658,7 @@
       </w:pPr>
     </w:lvl>
     <w:lvl w:ilvl="1">
-      <w:tmpl w:val="2F23BE95"/>
+      <w:tmpl w:val="49E437FB"/>
       <w:start w:val="1"/>
       <w:numFmt w:val="lowerLetter"/>
       <w:lvlText w:val="%2."/>
@@ -3660,7 +3668,7 @@
       </w:pPr>
     </w:lvl>
     <w:lvl w:ilvl="2">
-      <w:tmpl w:val="3BAB9884"/>
+      <w:tmpl w:val="A4CE0F29"/>
       <w:start w:val="1"/>
       <w:numFmt w:val="lowerRoman"/>
       <w:lvlText w:val="%3."/>
@@ -3670,7 +3678,7 @@
       </w:pPr>
     </w:lvl>
     <w:lvl w:ilvl="3">
-      <w:tmpl w:val="502988BB"/>
+      <w:tmpl w:val="EAC19C7B"/>
       <w:start w:val="1"/>
       <w:numFmt w:val="decimal"/>
       <w:lvlText w:val="%4."/>
@@ -3680,7 +3688,7 @@
       </w:pPr>
     </w:lvl>
     <w:lvl w:ilvl="4">
-      <w:tmpl w:val="3829433B"/>
+      <w:tmpl w:val="5A1A5CFB"/>
       <w:start w:val="1"/>
       <w:numFmt w:val="lowerLetter"/>
       <w:lvlText w:val="%5."/>
@@ -3690,7 +3698,7 @@
       </w:pPr>
     </w:lvl>
     <w:lvl w:ilvl="5">
-      <w:tmpl w:val="D218360C"/>
+      <w:tmpl w:val="6025C0CF"/>
       <w:start w:val="1"/>
       <w:numFmt w:val="lowerRoman"/>
       <w:lvlText w:val="%6."/>
@@ -3700,7 +3708,7 @@
       </w:pPr>
     </w:lvl>
     <w:lvl w:ilvl="6">
-      <w:tmpl w:val="4B49D2A3"/>
+      <w:tmpl w:val="58C3CA6E"/>
       <w:start w:val="1"/>
       <w:numFmt w:val="decimal"/>
       <w:lvlText w:val="%7."/>
@@ -3710,7 +3718,7 @@
       </w:pPr>
     </w:lvl>
     <w:lvl w:ilvl="7">
-      <w:tmpl w:val="EFF17171"/>
+      <w:tmpl w:val="7F539A08"/>
       <w:start w:val="1"/>
       <w:numFmt w:val="lowerLetter"/>
       <w:lvlText w:val="%8."/>
@@ -3720,7 +3728,7 @@
       </w:pPr>
     </w:lvl>
     <w:lvl w:ilvl="8">
-      <w:tmpl w:val="B1DA10D4"/>
+      <w:tmpl w:val="80D72DA8"/>
       <w:start w:val="1"/>
       <w:numFmt w:val="lowerRoman"/>
       <w:lvlText w:val="%9."/>
@@ -3733,7 +3741,7 @@
   <w:abstractNum w:abstractNumId="13">
     <w:multiLevelType w:val="hybridMultilevel"/>
     <w:lvl w:ilvl="0">
-      <w:tmpl w:val="36015BDC"/>
+      <w:tmpl w:val="1FCC8571"/>
       <w:numFmt w:val="bullet"/>
       <w:lvlText w:val=""/>
       <w:rPr>
@@ -3745,7 +3753,7 @@
       </w:pPr>
     </w:lvl>
     <w:lvl w:ilvl="1">
-      <w:tmpl w:val="8370043F"/>
+      <w:tmpl w:val="4E4694E7"/>
       <w:numFmt w:val="bullet"/>
       <w:lvlText w:val="o"/>
       <w:rPr>
@@ -3757,7 +3765,7 @@
       </w:pPr>
     </w:lvl>
     <w:lvl w:ilvl="2">
-      <w:tmpl w:val="32823788"/>
+      <w:tmpl w:val="CE8FC94B"/>
       <w:numFmt w:val="bullet"/>
       <w:lvlText w:val=""/>
       <w:rPr>
@@ -3769,7 +3777,7 @@
       </w:pPr>
     </w:lvl>
     <w:lvl w:ilvl="3">
-      <w:tmpl w:val="80D5D3D8"/>
+      <w:tmpl w:val="A1A24AE4"/>
       <w:numFmt w:val="bullet"/>
       <w:lvlText w:val=""/>
       <w:rPr>
@@ -3781,7 +3789,7 @@
       </w:pPr>
     </w:lvl>
     <w:lvl w:ilvl="4">
-      <w:tmpl w:val="FEE4123E"/>
+      <w:tmpl w:val="01DD7A28"/>
       <w:numFmt w:val="bullet"/>
       <w:lvlText w:val="o"/>
       <w:rPr>
@@ -3793,7 +3801,7 @@
       </w:pPr>
     </w:lvl>
     <w:lvl w:ilvl="5">
-      <w:tmpl w:val="8C06D016"/>
+      <w:tmpl w:val="46010C67"/>
       <w:numFmt w:val="bullet"/>
       <w:lvlText w:val=""/>
       <w:rPr>
@@ -3805,7 +3813,7 @@
       </w:pPr>
     </w:lvl>
     <w:lvl w:ilvl="6">
-      <w:tmpl w:val="E05E0C6B"/>
+      <w:tmpl w:val="D2ADFC22"/>
       <w:numFmt w:val="bullet"/>
       <w:lvlText w:val=""/>
       <w:rPr>
@@ -3817,7 +3825,7 @@
       </w:pPr>
     </w:lvl>
     <w:lvl w:ilvl="7">
-      <w:tmpl w:val="0A8E655C"/>
+      <w:tmpl w:val="DFE529E3"/>
       <w:numFmt w:val="bullet"/>
       <w:lvlText w:val="o"/>
       <w:rPr>
@@ -3829,7 +3837,7 @@
       </w:pPr>
     </w:lvl>
     <w:lvl w:ilvl="8">
-      <w:tmpl w:val="FB345B5A"/>
+      <w:tmpl w:val="37211C51"/>
       <w:numFmt w:val="bullet"/>
       <w:lvlText w:val=""/>
       <w:rPr>
@@ -3844,7 +3852,7 @@
   <w:abstractNum w:abstractNumId="14">
     <w:multiLevelType w:val="hybridMultilevel"/>
     <w:lvl w:ilvl="0">
-      <w:tmpl w:val="6A697B30"/>
+      <w:tmpl w:val="031071F8"/>
       <w:numFmt w:val="bullet"/>
       <w:lvlText w:val=""/>
       <w:rPr>
@@ -3856,7 +3864,7 @@
       </w:pPr>
     </w:lvl>
     <w:lvl w:ilvl="1">
-      <w:tmpl w:val="8E276E49"/>
+      <w:tmpl w:val="B1A7B8B1"/>
       <w:numFmt w:val="bullet"/>
       <w:lvlText w:val="o"/>
       <w:rPr>
@@ -3868,7 +3876,7 @@
       </w:pPr>
     </w:lvl>
     <w:lvl w:ilvl="2">
-      <w:tmpl w:val="92D3033B"/>
+      <w:tmpl w:val="2BD7B62E"/>
       <w:numFmt w:val="bullet"/>
       <w:lvlText w:val=""/>
       <w:rPr>
@@ -3880,7 +3888,7 @@
       </w:pPr>
     </w:lvl>
     <w:lvl w:ilvl="3">
-      <w:tmpl w:val="918D9D59"/>
+      <w:tmpl w:val="6DF7F51D"/>
       <w:numFmt w:val="bullet"/>
       <w:lvlText w:val=""/>
       <w:rPr>
@@ -3892,7 +3900,7 @@
       </w:pPr>
     </w:lvl>
     <w:lvl w:ilvl="4">
-      <w:tmpl w:val="EAC884A6"/>
+      <w:tmpl w:val="D9E0C6D4"/>
       <w:numFmt w:val="bullet"/>
       <w:lvlText w:val="o"/>
       <w:rPr>
@@ -3904,7 +3912,7 @@
       </w:pPr>
     </w:lvl>
     <w:lvl w:ilvl="5">
-      <w:tmpl w:val="FEE10E79"/>
+      <w:tmpl w:val="4F5F7428"/>
       <w:numFmt w:val="bullet"/>
       <w:lvlText w:val=""/>
       <w:rPr>
@@ -3916,7 +3924,7 @@
       </w:pPr>
     </w:lvl>
     <w:lvl w:ilvl="6">
-      <w:tmpl w:val="2EBC1B33"/>
+      <w:tmpl w:val="921B28BC"/>
       <w:numFmt w:val="bullet"/>
       <w:lvlText w:val=""/>
       <w:rPr>
@@ -3928,7 +3936,7 @@
       </w:pPr>
     </w:lvl>
     <w:lvl w:ilvl="7">
-      <w:tmpl w:val="D6C39D23"/>
+      <w:tmpl w:val="2C5E1E6F"/>
       <w:numFmt w:val="bullet"/>
       <w:lvlText w:val="o"/>
       <w:rPr>
@@ -3940,7 +3948,7 @@
       </w:pPr>
     </w:lvl>
     <w:lvl w:ilvl="8">
-      <w:tmpl w:val="011786FA"/>
+      <w:tmpl w:val="484B9106"/>
       <w:numFmt w:val="bullet"/>
       <w:lvlText w:val=""/>
       <w:rPr>
@@ -3955,7 +3963,7 @@
   <w:abstractNum w:abstractNumId="15">
     <w:multiLevelType w:val="hybridMultilevel"/>
     <w:lvl w:ilvl="0">
-      <w:tmpl w:val="DCC7576D"/>
+      <w:tmpl w:val="96743518"/>
       <w:start w:val="1"/>
       <w:numFmt w:val="decimal"/>
       <w:lvlText w:val="%1."/>
@@ -3965,7 +3973,7 @@
       </w:pPr>
     </w:lvl>
     <w:lvl w:ilvl="1">
-      <w:tmpl w:val="C24FE743"/>
+      <w:tmpl w:val="2EAFF3E8"/>
       <w:start w:val="1"/>
       <w:numFmt w:val="lowerLetter"/>
       <w:lvlText w:val="%2."/>
@@ -3975,7 +3983,7 @@
       </w:pPr>
     </w:lvl>
     <w:lvl w:ilvl="2">
-      <w:tmpl w:val="9D709CDE"/>
+      <w:tmpl w:val="3522149E"/>
       <w:start w:val="1"/>
       <w:numFmt w:val="lowerRoman"/>
       <w:lvlText w:val="%3."/>
@@ -3985,7 +3993,7 @@
       </w:pPr>
     </w:lvl>
     <w:lvl w:ilvl="3">
-      <w:tmpl w:val="CC27D8F5"/>
+      <w:tmpl w:val="3DBE53E2"/>
       <w:start w:val="1"/>
       <w:numFmt w:val="decimal"/>
       <w:lvlText w:val="%4."/>
@@ -3995,7 +4003,7 @@
       </w:pPr>
     </w:lvl>
     <w:lvl w:ilvl="4">
-      <w:tmpl w:val="3DAB5E1E"/>
+      <w:tmpl w:val="6E4AEC2D"/>
       <w:start w:val="1"/>
       <w:numFmt w:val="lowerLetter"/>
       <w:lvlText w:val="%5."/>
@@ -4005,7 +4013,7 @@
       </w:pPr>
     </w:lvl>
     <w:lvl w:ilvl="5">
-      <w:tmpl w:val="08115B30"/>
+      <w:tmpl w:val="5816203D"/>
       <w:start w:val="1"/>
       <w:numFmt w:val="lowerRoman"/>
       <w:lvlText w:val="%6."/>
@@ -4015,7 +4023,7 @@
       </w:pPr>
     </w:lvl>
     <w:lvl w:ilvl="6">
-      <w:tmpl w:val="E6887C5C"/>
+      <w:tmpl w:val="2D256B03"/>
       <w:start w:val="1"/>
       <w:numFmt w:val="decimal"/>
       <w:lvlText w:val="%7."/>
@@ -4025,7 +4033,7 @@
       </w:pPr>
     </w:lvl>
     <w:lvl w:ilvl="7">
-      <w:tmpl w:val="B41413A9"/>
+      <w:tmpl w:val="32AC7C0B"/>
       <w:start w:val="1"/>
       <w:numFmt w:val="lowerLetter"/>
       <w:lvlText w:val="%8."/>
@@ -4035,7 +4043,7 @@
       </w:pPr>
     </w:lvl>
     <w:lvl w:ilvl="8">
-      <w:tmpl w:val="3F7CE643"/>
+      <w:tmpl w:val="10619050"/>
       <w:start w:val="1"/>
       <w:numFmt w:val="lowerRoman"/>
       <w:lvlText w:val="%9."/>
@@ -4048,7 +4056,7 @@
   <w:abstractNum w:abstractNumId="16">
     <w:multiLevelType w:val="hybridMultilevel"/>
     <w:lvl w:ilvl="0">
-      <w:tmpl w:val="1E080839"/>
+      <w:tmpl w:val="698BE2EB"/>
       <w:numFmt w:val="bullet"/>
       <w:lvlText w:val=""/>
       <w:rPr>
@@ -4060,7 +4068,7 @@
       </w:pPr>
     </w:lvl>
     <w:lvl w:ilvl="1">
-      <w:tmpl w:val="38FF161B"/>
+      <w:tmpl w:val="477C8EA4"/>
       <w:numFmt w:val="bullet"/>
       <w:lvlText w:val="o"/>
       <w:rPr>
@@ -4072,7 +4080,7 @@
       </w:pPr>
     </w:lvl>
     <w:lvl w:ilvl="2">
-      <w:tmpl w:val="EABF64EC"/>
+      <w:tmpl w:val="76617998"/>
       <w:numFmt w:val="bullet"/>
       <w:lvlText w:val=""/>
       <w:rPr>
@@ -4084,7 +4092,7 @@
       </w:pPr>
     </w:lvl>
     <w:lvl w:ilvl="3">
-      <w:tmpl w:val="A5054BBB"/>
+      <w:tmpl w:val="A129226F"/>
       <w:numFmt w:val="bullet"/>
       <w:lvlText w:val=""/>
       <w:rPr>
@@ -4096,7 +4104,7 @@
       </w:pPr>
     </w:lvl>
     <w:lvl w:ilvl="4">
-      <w:tmpl w:val="EB29F115"/>
+      <w:tmpl w:val="1D52F47B"/>
       <w:numFmt w:val="bullet"/>
       <w:lvlText w:val="o"/>
       <w:rPr>
@@ -4108,7 +4116,7 @@
       </w:pPr>
     </w:lvl>
     <w:lvl w:ilvl="5">
-      <w:tmpl w:val="5B4F5265"/>
+      <w:tmpl w:val="A907D9FC"/>
       <w:numFmt w:val="bullet"/>
       <w:lvlText w:val=""/>
       <w:rPr>
@@ -4120,7 +4128,7 @@
       </w:pPr>
     </w:lvl>
     <w:lvl w:ilvl="6">
-      <w:tmpl w:val="7483C617"/>
+      <w:tmpl w:val="244C5CC2"/>
       <w:numFmt w:val="bullet"/>
       <w:lvlText w:val=""/>
       <w:rPr>
@@ -4132,7 +4140,7 @@
       </w:pPr>
     </w:lvl>
     <w:lvl w:ilvl="7">
-      <w:tmpl w:val="103FF9E1"/>
+      <w:tmpl w:val="B8D3D20D"/>
       <w:numFmt w:val="bullet"/>
       <w:lvlText w:val="o"/>
       <w:rPr>
@@ -4144,7 +4152,7 @@
       </w:pPr>
     </w:lvl>
     <w:lvl w:ilvl="8">
-      <w:tmpl w:val="F287D122"/>
+      <w:tmpl w:val="D1123808"/>
       <w:numFmt w:val="bullet"/>
       <w:lvlText w:val=""/>
       <w:rPr>
@@ -4159,7 +4167,7 @@
   <w:abstractNum w:abstractNumId="17">
     <w:multiLevelType w:val="hybridMultilevel"/>
     <w:lvl w:ilvl="0">
-      <w:tmpl w:val="9B0C55CD"/>
+      <w:tmpl w:val="C6B88DB0"/>
       <w:start w:val="1"/>
       <w:numFmt w:val="decimal"/>
       <w:lvlText w:val="%1."/>
@@ -4169,7 +4177,7 @@
       </w:pPr>
     </w:lvl>
     <w:lvl w:ilvl="1">
-      <w:tmpl w:val="D08553AE"/>
+      <w:tmpl w:val="1D25E819"/>
       <w:start w:val="1"/>
       <w:numFmt w:val="lowerLetter"/>
       <w:lvlText w:val="%2."/>
@@ -4179,7 +4187,7 @@
       </w:pPr>
     </w:lvl>
     <w:lvl w:ilvl="2">
-      <w:tmpl w:val="C6D41AEA"/>
+      <w:tmpl w:val="58480B52"/>
       <w:start w:val="1"/>
       <w:numFmt w:val="lowerRoman"/>
       <w:lvlText w:val="%3."/>
@@ -4189,7 +4197,7 @@
       </w:pPr>
     </w:lvl>
     <w:lvl w:ilvl="3">
-      <w:tmpl w:val="1F9392CD"/>
+      <w:tmpl w:val="85FE8AE3"/>
       <w:start w:val="1"/>
       <w:numFmt w:val="decimal"/>
       <w:lvlText w:val="%4."/>
@@ -4199,7 +4207,7 @@
       </w:pPr>
     </w:lvl>
     <w:lvl w:ilvl="4">
-      <w:tmpl w:val="0D5C5232"/>
+      <w:tmpl w:val="3A7F52EB"/>
       <w:start w:val="1"/>
       <w:numFmt w:val="lowerLetter"/>
       <w:lvlText w:val="%5."/>
@@ -4209,7 +4217,7 @@
       </w:pPr>
     </w:lvl>
     <w:lvl w:ilvl="5">
-      <w:tmpl w:val="418C8ABB"/>
+      <w:tmpl w:val="5DC97295"/>
       <w:start w:val="1"/>
       <w:numFmt w:val="lowerRoman"/>
       <w:lvlText w:val="%6."/>
@@ -4219,7 +4227,7 @@
       </w:pPr>
     </w:lvl>
     <w:lvl w:ilvl="6">
-      <w:tmpl w:val="704E6A2D"/>
+      <w:tmpl w:val="AD900051"/>
       <w:start w:val="1"/>
       <w:numFmt w:val="decimal"/>
       <w:lvlText w:val="%7."/>
@@ -4229,7 +4237,7 @@
       </w:pPr>
     </w:lvl>
     <w:lvl w:ilvl="7">
-      <w:tmpl w:val="6DB90693"/>
+      <w:tmpl w:val="E56ADC1F"/>
       <w:start w:val="1"/>
       <w:numFmt w:val="lowerLetter"/>
       <w:lvlText w:val="%8."/>
@@ -4239,7 +4247,7 @@
       </w:pPr>
     </w:lvl>
     <w:lvl w:ilvl="8">
-      <w:tmpl w:val="525B9039"/>
+      <w:tmpl w:val="89B88629"/>
       <w:start w:val="1"/>
       <w:numFmt w:val="lowerRoman"/>
       <w:lvlText w:val="%9."/>
@@ -4252,7 +4260,7 @@
   <w:abstractNum w:abstractNumId="18">
     <w:multiLevelType w:val="hybridMultilevel"/>
     <w:lvl w:ilvl="0">
-      <w:tmpl w:val="8CC72796"/>
+      <w:tmpl w:val="52E70C9A"/>
       <w:numFmt w:val="bullet"/>
       <w:lvlText w:val=""/>
       <w:rPr>
@@ -4264,7 +4272,7 @@
       </w:pPr>
     </w:lvl>
     <w:lvl w:ilvl="1">
-      <w:tmpl w:val="89D555BD"/>
+      <w:tmpl w:val="86533B64"/>
       <w:numFmt w:val="bullet"/>
       <w:lvlText w:val="o"/>
       <w:rPr>
@@ -4276,7 +4284,7 @@
       </w:pPr>
     </w:lvl>
     <w:lvl w:ilvl="2">
-      <w:tmpl w:val="7DDB6E21"/>
+      <w:tmpl w:val="036D456A"/>
       <w:numFmt w:val="bullet"/>
       <w:lvlText w:val=""/>
       <w:rPr>
@@ -4288,7 +4296,7 @@
       </w:pPr>
     </w:lvl>
     <w:lvl w:ilvl="3">
-      <w:tmpl w:val="D906A7D2"/>
+      <w:tmpl w:val="9F1D2DFB"/>
       <w:numFmt w:val="bullet"/>
       <w:lvlText w:val=""/>
       <w:rPr>
@@ -4300,7 +4308,7 @@
       </w:pPr>
     </w:lvl>
     <w:lvl w:ilvl="4">
-      <w:tmpl w:val="D50228AF"/>
+      <w:tmpl w:val="B5884A6C"/>
       <w:numFmt w:val="bullet"/>
       <w:lvlText w:val="o"/>
       <w:rPr>
@@ -4312,7 +4320,7 @@
       </w:pPr>
     </w:lvl>
     <w:lvl w:ilvl="5">
-      <w:tmpl w:val="02238883"/>
+      <w:tmpl w:val="50DBBCE4"/>
       <w:numFmt w:val="bullet"/>
       <w:lvlText w:val=""/>
       <w:rPr>
@@ -4324,7 +4332,7 @@
       </w:pPr>
     </w:lvl>
     <w:lvl w:ilvl="6">
-      <w:tmpl w:val="38CB6DCD"/>
+      <w:tmpl w:val="4B0F4A45"/>
       <w:numFmt w:val="bullet"/>
       <w:lvlText w:val=""/>
       <w:rPr>
@@ -4336,7 +4344,7 @@
       </w:pPr>
     </w:lvl>
     <w:lvl w:ilvl="7">
-      <w:tmpl w:val="1EA7331B"/>
+      <w:tmpl w:val="57509816"/>
       <w:numFmt w:val="bullet"/>
       <w:lvlText w:val="o"/>
       <w:rPr>
@@ -4348,7 +4356,7 @@
       </w:pPr>
     </w:lvl>
     <w:lvl w:ilvl="8">
-      <w:tmpl w:val="0448F8CF"/>
+      <w:tmpl w:val="FE80C840"/>
       <w:numFmt w:val="bullet"/>
       <w:lvlText w:val=""/>
       <w:rPr>
@@ -6004,7 +6012,7 @@
   <Source>
     <Tag>fielding2000</Tag>
     <SourceType>Book</SourceType>
-    <Guid>{38a23ffa-9dfc-4e3c-a230-5fef89b23d09}</Guid>
+    <Guid>{72e1d9a4-0ac1-4945-b184-42d6694b250d}</Guid>
     <LCID>0</LCID>
     <Title>Architectural Styles and the Design of Network-based Software Architectures</Title>
     <Year>2000</Year>
@@ -6024,7 +6032,7 @@
   <Source>
     <Tag>humble2010</Tag>
     <SourceType>Book</SourceType>
-    <Guid>{3f4cdb92-b163-434a-b1da-f218a6816f34}</Guid>
+    <Guid>{412e5bb5-3c2f-4dd5-8a91-cdd1d209a058}</Guid>
     <LCID>0</LCID>
     <Title>Continuous Delivery</Title>
     <Year>2010</Year>
@@ -6049,7 +6057,7 @@
   <Source>
     <Tag>fowler2018</Tag>
     <SourceType>BookSection</SourceType>
-    <Guid>{6d48b1fb-1ebc-4d73-8882-837055db95ff}</Guid>
+    <Guid>{11ceb740-a891-4b90-9ef6-6c9861e22570}</Guid>
     <LCID>0</LCID>
     <Title>Configuration Patterns</Title>
     <BookTitle>Refactoring -- Improving the Design of Existing Code</BookTitle>
@@ -6079,7 +6087,7 @@
   <Source>
     <Tag>markdig2024</Tag>
     <SourceType>InternetSite</SourceType>
-    <Guid>{bfbbc36a-a9bd-49fd-8ef9-f47ef715365c}</Guid>
+    <Guid>{9e490c4f-2642-4710-86b6-e8c02cffaa2a}</Guid>
     <LCID>0</LCID>
     <InternetSiteTitle>Markdig -- A Fast, Powerful, CommonMark Compliant Markdown Processor</InternetSiteTitle>
     <YearAccessed>2026</YearAccessed>
@@ -6100,7 +6108,7 @@
   <Source>
     <Tag>sixlabors2023</Tag>
     <SourceType>InternetSite</SourceType>
-    <Guid>{825d6911-f54f-4bdc-a36c-c2d6c9c84960}</Guid>
+    <Guid>{ea3ace78-866d-45c8-a6e5-1946a086ceea}</Guid>
     <LCID>0</LCID>
     <InternetSiteTitle>ImageSharp -- A Modern, Cross-Platform, 2D Graphics Library</InternetSiteTitle>
     <YearAccessed>2026</YearAccessed>
@@ -6111,7 +6119,7 @@
   <Source>
     <Tag>microsoftOpenXml</Tag>
     <SourceType>DocumentFromInternetSite</SourceType>
-    <Guid>{e677b38a-232d-4742-a1a6-28af9a963da5}</Guid>
+    <Guid>{7a4718c7-8eb3-43db-97c9-a197be74cea9}</Guid>
     <LCID>0</LCID>
     <InternetSiteTitle>Open XML SDK Documentation</InternetSiteTitle>
     <Year>2023</Year>
@@ -6134,7 +6142,7 @@
   <Source>
     <Tag>openxmlWebSite2024</Tag>
     <SourceType>InternetSite</SourceType>
-    <Guid>{9341915e-caa7-4534-9a7a-45c1fd9a8baa}</Guid>
+    <Guid>{6592765c-be12-47be-94a3-a41da8745700}</Guid>
     <LCID>0</LCID>
     <InternetSiteTitle>ECMA-376 Office Open XML File Formats</InternetSiteTitle>
     <YearAccessed>2026</YearAccessed>
@@ -6145,7 +6153,7 @@
   <Source>
     <Tag>techWritingCase2019</Tag>
     <SourceType>JournalArticle</SourceType>
-    <Guid>{0295154a-f952-4b8c-ba1c-2270ea980e7b}</Guid>
+    <Guid>{221916a4-711d-4e8a-bc2c-fe330f2ff6c4}</Guid>
     <LCID>0</LCID>
     <Title>Technological Developments in Document and Information Design</Title>
     <JournalName>Journal of Technical Writing and Communication</JournalName>

</xml_diff>

<commit_message>
Extract appendix from Markdown document and insert into DOCX output
</commit_message>
<xml_diff>
--- a/sample/output.docx
+++ b/sample/output.docx
@@ -1048,7 +1048,7 @@
           <wp:inline distT="0" distB="0" distL="0" distR="0">
             <wp:extent cx="2857500" cy="2857500"/>
             <wp:effectExtent l="6350" t="6350" r="6350" b="6350"/>
-            <wp:docPr id="493226496" name="Picture 493226496"/>
+            <wp:docPr id="345740219" name="Picture 345740219"/>
             <wp:cNvGraphicFramePr>
               <a:graphicFrameLocks xmlns:a="http://schemas.openxmlformats.org/drawingml/2006/main" noChangeAspect="1"/>
             </wp:cNvGraphicFramePr>
@@ -1056,11 +1056,11 @@
               <a:graphicData uri="http://schemas.openxmlformats.org/drawingml/2006/picture">
                 <pic:pic xmlns:pic="http://schemas.openxmlformats.org/drawingml/2006/picture">
                   <pic:nvPicPr>
-                    <pic:cNvPr id="493226532" name="placeholder-500.png"/>
+                    <pic:cNvPr id="345740266" name="placeholder-500.png"/>
                     <pic:cNvPicPr/>
                   </pic:nvPicPr>
                   <pic:blipFill>
-                    <a:blip r:embed="R0658f59358a74ffa"/>
+                    <a:blip r:embed="R09d48c9d9a414e8d"/>
                     <a:stretch>
                       <a:fillRect/>
                     </a:stretch>
@@ -1127,7 +1127,7 @@
           <wp:inline distT="0" distB="0" distL="0" distR="0">
             <wp:extent cx="3810000" cy="2857500"/>
             <wp:effectExtent l="6350" t="6350" r="6350" b="6350"/>
-            <wp:docPr id="493750900" name="Picture 493750900"/>
+            <wp:docPr id="346222956" name="Picture 346222956"/>
             <wp:cNvGraphicFramePr>
               <a:graphicFrameLocks xmlns:a="http://schemas.openxmlformats.org/drawingml/2006/main" noChangeAspect="1"/>
             </wp:cNvGraphicFramePr>
@@ -1135,11 +1135,11 @@
               <a:graphicData uri="http://schemas.openxmlformats.org/drawingml/2006/picture">
                 <pic:pic xmlns:pic="http://schemas.openxmlformats.org/drawingml/2006/picture">
                   <pic:nvPicPr>
-                    <pic:cNvPr id="493750907" name="placeholder-400-300.png"/>
+                    <pic:cNvPr id="346222968" name="placeholder-400-300.png"/>
                     <pic:cNvPicPr/>
                   </pic:nvPicPr>
                   <pic:blipFill>
-                    <a:blip r:embed="Rc5cc08ff828f4ecd"/>
+                    <a:blip r:embed="Rb03496b51023427c"/>
                     <a:stretch>
                       <a:fillRect/>
                     </a:stretch>
@@ -1614,7 +1614,7 @@
           <wp:inline distT="0" distB="0" distL="0" distR="0">
             <wp:extent cx="3810000" cy="3810000"/>
             <wp:effectExtent l="6350" t="6350" r="6350" b="6350"/>
-            <wp:docPr id="493764410" name="Picture 493764410"/>
+            <wp:docPr id="346236028" name="Picture 346236028"/>
             <wp:cNvGraphicFramePr>
               <a:graphicFrameLocks xmlns:a="http://schemas.openxmlformats.org/drawingml/2006/main" noChangeAspect="1"/>
             </wp:cNvGraphicFramePr>
@@ -1622,11 +1622,11 @@
               <a:graphicData uri="http://schemas.openxmlformats.org/drawingml/2006/picture">
                 <pic:pic xmlns:pic="http://schemas.openxmlformats.org/drawingml/2006/picture">
                   <pic:nvPicPr>
-                    <pic:cNvPr id="493764420" name="placeholder-500.png"/>
+                    <pic:cNvPr id="346236033" name="placeholder-500.png"/>
                     <pic:cNvPicPr/>
                   </pic:nvPicPr>
                   <pic:blipFill>
-                    <a:blip r:embed="Rc5bbb05a77024d82"/>
+                    <a:blip r:embed="R97c90ddcc4d54564"/>
                     <a:stretch>
                       <a:fillRect/>
                     </a:stretch>
@@ -1901,9 +1901,75 @@
         <w:t xml:space="preserve">.</w:t>
       </w:r>
     </w:p>
-    <w:p>
-      <w:pPr>
-        <w:pStyle w:val="Body2"/>
+    <w:sdt>
+      <w:sdtPr>
+        <w:rPr>
+          <w:rFonts w:eastAsiaTheme="minorHAnsi"/>
+        </w:rPr>
+        <w:id w:val="-7300804"/>
+        <w:docPartObj>
+          <w:docPartGallery w:val="Bibliographies"/>
+          <w:docPartUnique/>
+        </w:docPartObj>
+      </w:sdtPr>
+      <w:sdtEndPr>
+        <w:rPr>
+          <w:rFonts w:ascii="Arial" w:hAnsi="Arial" w:cstheme="minorBidi"/>
+          <w:b w:val="0"/>
+          <w:sz w:val="24"/>
+          <w:szCs w:val="24"/>
+        </w:rPr>
+      </w:sdtEndPr>
+      <w:sdtContent>
+        <w:p>
+          <w:pPr>
+            <w:pStyle w:val="Heading1"/>
+          </w:pPr>
+          <w:r>
+            <w:t>References</w:t>
+          </w:r>
+        </w:p>
+        <w:sdt>
+          <w:sdtPr>
+            <w:id w:val="-573587230"/>
+            <w:bibliography/>
+          </w:sdtPr>
+          <w:sdtEndPr/>
+          <w:sdtContent>
+            <w:p>
+              <w:r>
+                <w:fldChar w:fldCharType="begin"/>
+              </w:r>
+              <w:r>
+                <w:instrText xml:space="preserve"> BIBLIOGRAPHY </w:instrText>
+              </w:r>
+              <w:r>
+                <w:fldChar w:fldCharType="separate"/>
+              </w:r>
+              <w:r>
+                <w:rPr>
+                  <w:b/>
+                  <w:bCs/>
+                  <w:noProof/>
+                </w:rPr>
+                <w:t>There are no sources in the current document.</w:t>
+              </w:r>
+              <w:r>
+                <w:rPr>
+                  <w:b/>
+                  <w:bCs/>
+                  <w:noProof/>
+                </w:rPr>
+                <w:fldChar w:fldCharType="end"/>
+              </w:r>
+            </w:p>
+          </w:sdtContent>
+        </w:sdt>
+      </w:sdtContent>
+    </w:sdt>
+    <w:p>
+      <w:pPr>
+        <w:pStyle w:val="Body1"/>
       </w:pPr>
       <w:r>
         <w:br w:type="page"/>
@@ -1913,8 +1979,8 @@
       <w:pPr>
         <w:pStyle w:val="Heading1"/>
       </w:pPr>
-      <w:bookmarkStart w:name="appendix" w:id="29"/>
-      <w:bookmarkEnd w:id="29"/>
+      <w:bookmarkStart w:name="appendix" w:id="1"/>
+      <w:bookmarkEnd w:id="1"/>
       <w:r>
         <w:t xml:space="preserve">Appendix</w:t>
       </w:r>
@@ -1931,8 +1997,8 @@
       <w:pPr>
         <w:pStyle w:val="Heading2"/>
       </w:pPr>
-      <w:bookmarkStart w:name="formatting-examples" w:id="30"/>
-      <w:bookmarkEnd w:id="30"/>
+      <w:bookmarkStart w:name="formatting-examples" w:id="2"/>
+      <w:bookmarkEnd w:id="2"/>
       <w:r>
         <w:t xml:space="preserve">Formatting Examples</w:t>
       </w:r>
@@ -2002,8 +2068,8 @@
       <w:pPr>
         <w:pStyle w:val="Heading3"/>
       </w:pPr>
-      <w:bookmarkStart w:name="small-table" w:id="31"/>
-      <w:bookmarkEnd w:id="31"/>
+      <w:bookmarkStart w:name="small-table" w:id="3"/>
+      <w:bookmarkEnd w:id="3"/>
       <w:r>
         <w:t xml:space="preserve">Small Table</w:t>
       </w:r>
@@ -2013,8 +2079,8 @@
         <w:pStyle w:val="Caption"/>
         <w:jc w:val="center"/>
       </w:pPr>
-      <w:bookmarkStart w:name="tbl-small-example" w:id="32"/>
-      <w:bookmarkEnd w:id="32"/>
+      <w:bookmarkStart w:name="tbl-small-example" w:id="4"/>
+      <w:bookmarkEnd w:id="4"/>
       <w:r>
         <w:t xml:space="preserve">Table </w:t>
       </w:r>
@@ -2028,7 +2094,7 @@
         <w:fldChar w:fldCharType="separate"/>
       </w:r>
       <w:r>
-        <w:t>2</w:t>
+        <w:t>1</w:t>
       </w:r>
       <w:r>
         <w:fldChar w:fldCharType="end"/>
@@ -2178,8 +2244,8 @@
       <w:pPr>
         <w:pStyle w:val="Heading4"/>
       </w:pPr>
-      <w:bookmarkStart w:name="final-codeblock" w:id="33"/>
-      <w:bookmarkEnd w:id="33"/>
+      <w:bookmarkStart w:name="final-codeblock" w:id="5"/>
+      <w:bookmarkEnd w:id="5"/>
       <w:r>
         <w:t xml:space="preserve">Final Codeblock</w:t>
       </w:r>
@@ -2220,8 +2286,8 @@
       <w:pPr>
         <w:pStyle w:val="Heading4"/>
       </w:pPr>
-      <w:bookmarkStart w:name="codeblock-with-formatting" w:id="34"/>
-      <w:bookmarkEnd w:id="34"/>
+      <w:bookmarkStart w:name="codeblock-with-formatting" w:id="6"/>
+      <w:bookmarkEnd w:id="6"/>
       <w:r>
         <w:t xml:space="preserve">Codeblock With Formatting</w:t>
       </w:r>
@@ -2287,72 +2353,6 @@
         <w:t xml:space="preserve">End of example content.</w:t>
       </w:r>
     </w:p>
-    <w:sdt>
-      <w:sdtPr>
-        <w:rPr>
-          <w:rFonts w:eastAsiaTheme="minorHAnsi"/>
-        </w:rPr>
-        <w:id w:val="-7300804"/>
-        <w:docPartObj>
-          <w:docPartGallery w:val="Bibliographies"/>
-          <w:docPartUnique/>
-        </w:docPartObj>
-      </w:sdtPr>
-      <w:sdtEndPr>
-        <w:rPr>
-          <w:rFonts w:ascii="Arial" w:hAnsi="Arial" w:cstheme="minorBidi"/>
-          <w:b w:val="0"/>
-          <w:sz w:val="24"/>
-          <w:szCs w:val="24"/>
-        </w:rPr>
-      </w:sdtEndPr>
-      <w:sdtContent>
-        <w:p>
-          <w:pPr>
-            <w:pStyle w:val="Heading1"/>
-          </w:pPr>
-          <w:r>
-            <w:t>References</w:t>
-          </w:r>
-        </w:p>
-        <w:sdt>
-          <w:sdtPr>
-            <w:id w:val="-573587230"/>
-            <w:bibliography/>
-          </w:sdtPr>
-          <w:sdtEndPr/>
-          <w:sdtContent>
-            <w:p>
-              <w:r>
-                <w:fldChar w:fldCharType="begin"/>
-              </w:r>
-              <w:r>
-                <w:instrText xml:space="preserve"> BIBLIOGRAPHY </w:instrText>
-              </w:r>
-              <w:r>
-                <w:fldChar w:fldCharType="separate"/>
-              </w:r>
-              <w:r>
-                <w:rPr>
-                  <w:b/>
-                  <w:bCs/>
-                  <w:noProof/>
-                </w:rPr>
-                <w:t>There are no sources in the current document.</w:t>
-              </w:r>
-              <w:r>
-                <w:rPr>
-                  <w:b/>
-                  <w:bCs/>
-                  <w:noProof/>
-                </w:rPr>
-                <w:fldChar w:fldCharType="end"/>
-              </w:r>
-            </w:p>
-          </w:sdtContent>
-        </w:sdt>
-      </w:sdtContent>
-    </w:sdt>
     <w:p>
       <w:pPr>
         <w:pStyle w:val="Body4"/>
@@ -2925,7 +2925,7 @@
   <w:abstractNum w:abstractNumId="5">
     <w:multiLevelType w:val="hybridMultilevel"/>
     <w:lvl w:ilvl="0">
-      <w:tmpl w:val="C8A5C565"/>
+      <w:tmpl w:val="2E6B6702"/>
       <w:numFmt w:val="bullet"/>
       <w:lvlText w:val=""/>
       <w:rPr>
@@ -2937,7 +2937,7 @@
       </w:pPr>
     </w:lvl>
     <w:lvl w:ilvl="1">
-      <w:tmpl w:val="A61B897F"/>
+      <w:tmpl w:val="8FF424BB"/>
       <w:numFmt w:val="bullet"/>
       <w:lvlText w:val="o"/>
       <w:rPr>
@@ -2949,7 +2949,7 @@
       </w:pPr>
     </w:lvl>
     <w:lvl w:ilvl="2">
-      <w:tmpl w:val="F7879D10"/>
+      <w:tmpl w:val="32173B37"/>
       <w:numFmt w:val="bullet"/>
       <w:lvlText w:val=""/>
       <w:rPr>
@@ -2961,7 +2961,7 @@
       </w:pPr>
     </w:lvl>
     <w:lvl w:ilvl="3">
-      <w:tmpl w:val="897A1F99"/>
+      <w:tmpl w:val="F6881F61"/>
       <w:numFmt w:val="bullet"/>
       <w:lvlText w:val=""/>
       <w:rPr>
@@ -2973,7 +2973,7 @@
       </w:pPr>
     </w:lvl>
     <w:lvl w:ilvl="4">
-      <w:tmpl w:val="7AC828DB"/>
+      <w:tmpl w:val="A04AC3D1"/>
       <w:numFmt w:val="bullet"/>
       <w:lvlText w:val="o"/>
       <w:rPr>
@@ -2985,7 +2985,7 @@
       </w:pPr>
     </w:lvl>
     <w:lvl w:ilvl="5">
-      <w:tmpl w:val="73489E40"/>
+      <w:tmpl w:val="20C5F7E0"/>
       <w:numFmt w:val="bullet"/>
       <w:lvlText w:val=""/>
       <w:rPr>
@@ -2997,7 +2997,7 @@
       </w:pPr>
     </w:lvl>
     <w:lvl w:ilvl="6">
-      <w:tmpl w:val="33BDD60B"/>
+      <w:tmpl w:val="94003191"/>
       <w:numFmt w:val="bullet"/>
       <w:lvlText w:val=""/>
       <w:rPr>
@@ -3009,7 +3009,7 @@
       </w:pPr>
     </w:lvl>
     <w:lvl w:ilvl="7">
-      <w:tmpl w:val="443F688F"/>
+      <w:tmpl w:val="01CB06BC"/>
       <w:numFmt w:val="bullet"/>
       <w:lvlText w:val="o"/>
       <w:rPr>
@@ -3021,7 +3021,7 @@
       </w:pPr>
     </w:lvl>
     <w:lvl w:ilvl="8">
-      <w:tmpl w:val="C51BB22B"/>
+      <w:tmpl w:val="2F0AAFD9"/>
       <w:numFmt w:val="bullet"/>
       <w:lvlText w:val=""/>
       <w:rPr>
@@ -3036,7 +3036,7 @@
   <w:abstractNum w:abstractNumId="6">
     <w:multiLevelType w:val="hybridMultilevel"/>
     <w:lvl w:ilvl="0">
-      <w:tmpl w:val="E775CE42"/>
+      <w:tmpl w:val="46C8D8E7"/>
       <w:start w:val="1"/>
       <w:numFmt w:val="decimal"/>
       <w:lvlText w:val="%1."/>
@@ -3046,7 +3046,7 @@
       </w:pPr>
     </w:lvl>
     <w:lvl w:ilvl="1">
-      <w:tmpl w:val="E8FD0FEC"/>
+      <w:tmpl w:val="F3DE5AAF"/>
       <w:start w:val="1"/>
       <w:numFmt w:val="lowerLetter"/>
       <w:lvlText w:val="%2."/>
@@ -3056,7 +3056,7 @@
       </w:pPr>
     </w:lvl>
     <w:lvl w:ilvl="2">
-      <w:tmpl w:val="9DD90B59"/>
+      <w:tmpl w:val="EC0991ED"/>
       <w:start w:val="1"/>
       <w:numFmt w:val="lowerRoman"/>
       <w:lvlText w:val="%3."/>
@@ -3066,7 +3066,7 @@
       </w:pPr>
     </w:lvl>
     <w:lvl w:ilvl="3">
-      <w:tmpl w:val="256FACA1"/>
+      <w:tmpl w:val="5A709505"/>
       <w:start w:val="1"/>
       <w:numFmt w:val="decimal"/>
       <w:lvlText w:val="%4."/>
@@ -3076,7 +3076,7 @@
       </w:pPr>
     </w:lvl>
     <w:lvl w:ilvl="4">
-      <w:tmpl w:val="80B75D41"/>
+      <w:tmpl w:val="998DD697"/>
       <w:start w:val="1"/>
       <w:numFmt w:val="lowerLetter"/>
       <w:lvlText w:val="%5."/>
@@ -3086,7 +3086,7 @@
       </w:pPr>
     </w:lvl>
     <w:lvl w:ilvl="5">
-      <w:tmpl w:val="649B3BF2"/>
+      <w:tmpl w:val="4A7561AE"/>
       <w:start w:val="1"/>
       <w:numFmt w:val="lowerRoman"/>
       <w:lvlText w:val="%6."/>
@@ -3096,7 +3096,7 @@
       </w:pPr>
     </w:lvl>
     <w:lvl w:ilvl="6">
-      <w:tmpl w:val="73A94908"/>
+      <w:tmpl w:val="963E39EF"/>
       <w:start w:val="1"/>
       <w:numFmt w:val="decimal"/>
       <w:lvlText w:val="%7."/>
@@ -3106,7 +3106,7 @@
       </w:pPr>
     </w:lvl>
     <w:lvl w:ilvl="7">
-      <w:tmpl w:val="7B38E4A6"/>
+      <w:tmpl w:val="06AC854D"/>
       <w:start w:val="1"/>
       <w:numFmt w:val="lowerLetter"/>
       <w:lvlText w:val="%8."/>
@@ -3116,7 +3116,7 @@
       </w:pPr>
     </w:lvl>
     <w:lvl w:ilvl="8">
-      <w:tmpl w:val="647042F5"/>
+      <w:tmpl w:val="1E03FF43"/>
       <w:start w:val="1"/>
       <w:numFmt w:val="lowerRoman"/>
       <w:lvlText w:val="%9."/>
@@ -3129,7 +3129,7 @@
   <w:abstractNum w:abstractNumId="7">
     <w:multiLevelType w:val="hybridMultilevel"/>
     <w:lvl w:ilvl="0">
-      <w:tmpl w:val="905DC75D"/>
+      <w:tmpl w:val="9295422E"/>
       <w:numFmt w:val="bullet"/>
       <w:lvlText w:val=""/>
       <w:rPr>
@@ -3141,7 +3141,7 @@
       </w:pPr>
     </w:lvl>
     <w:lvl w:ilvl="1">
-      <w:tmpl w:val="4368FBED"/>
+      <w:tmpl w:val="8B934057"/>
       <w:numFmt w:val="bullet"/>
       <w:lvlText w:val="o"/>
       <w:rPr>
@@ -3153,7 +3153,7 @@
       </w:pPr>
     </w:lvl>
     <w:lvl w:ilvl="2">
-      <w:tmpl w:val="45E4F897"/>
+      <w:tmpl w:val="5ADBF39D"/>
       <w:numFmt w:val="bullet"/>
       <w:lvlText w:val=""/>
       <w:rPr>
@@ -3165,7 +3165,7 @@
       </w:pPr>
     </w:lvl>
     <w:lvl w:ilvl="3">
-      <w:tmpl w:val="079FAD4E"/>
+      <w:tmpl w:val="C9BD01CE"/>
       <w:numFmt w:val="bullet"/>
       <w:lvlText w:val=""/>
       <w:rPr>
@@ -3177,7 +3177,7 @@
       </w:pPr>
     </w:lvl>
     <w:lvl w:ilvl="4">
-      <w:tmpl w:val="CCDAE275"/>
+      <w:tmpl w:val="F5CD5FB6"/>
       <w:numFmt w:val="bullet"/>
       <w:lvlText w:val="o"/>
       <w:rPr>
@@ -3189,7 +3189,7 @@
       </w:pPr>
     </w:lvl>
     <w:lvl w:ilvl="5">
-      <w:tmpl w:val="620CD401"/>
+      <w:tmpl w:val="A1D052AA"/>
       <w:numFmt w:val="bullet"/>
       <w:lvlText w:val=""/>
       <w:rPr>
@@ -3201,7 +3201,7 @@
       </w:pPr>
     </w:lvl>
     <w:lvl w:ilvl="6">
-      <w:tmpl w:val="B156182E"/>
+      <w:tmpl w:val="F6520E45"/>
       <w:numFmt w:val="bullet"/>
       <w:lvlText w:val=""/>
       <w:rPr>
@@ -3213,7 +3213,7 @@
       </w:pPr>
     </w:lvl>
     <w:lvl w:ilvl="7">
-      <w:tmpl w:val="10F0E542"/>
+      <w:tmpl w:val="B2924FB5"/>
       <w:numFmt w:val="bullet"/>
       <w:lvlText w:val="o"/>
       <w:rPr>
@@ -3225,7 +3225,7 @@
       </w:pPr>
     </w:lvl>
     <w:lvl w:ilvl="8">
-      <w:tmpl w:val="2EB6348C"/>
+      <w:tmpl w:val="878A40C2"/>
       <w:numFmt w:val="bullet"/>
       <w:lvlText w:val=""/>
       <w:rPr>
@@ -3240,7 +3240,7 @@
   <w:abstractNum w:abstractNumId="8">
     <w:multiLevelType w:val="hybridMultilevel"/>
     <w:lvl w:ilvl="0">
-      <w:tmpl w:val="8391A3E0"/>
+      <w:tmpl w:val="B9C3E631"/>
       <w:start w:val="1"/>
       <w:numFmt w:val="decimal"/>
       <w:lvlText w:val="%1."/>
@@ -3250,7 +3250,7 @@
       </w:pPr>
     </w:lvl>
     <w:lvl w:ilvl="1">
-      <w:tmpl w:val="7E361B18"/>
+      <w:tmpl w:val="F1B1B6FA"/>
       <w:start w:val="1"/>
       <w:numFmt w:val="lowerLetter"/>
       <w:lvlText w:val="%2."/>
@@ -3260,7 +3260,7 @@
       </w:pPr>
     </w:lvl>
     <w:lvl w:ilvl="2">
-      <w:tmpl w:val="63BFEC93"/>
+      <w:tmpl w:val="1988C6BB"/>
       <w:start w:val="1"/>
       <w:numFmt w:val="lowerRoman"/>
       <w:lvlText w:val="%3."/>
@@ -3270,7 +3270,7 @@
       </w:pPr>
     </w:lvl>
     <w:lvl w:ilvl="3">
-      <w:tmpl w:val="CD70B1BC"/>
+      <w:tmpl w:val="89F724B9"/>
       <w:start w:val="1"/>
       <w:numFmt w:val="decimal"/>
       <w:lvlText w:val="%4."/>
@@ -3280,7 +3280,7 @@
       </w:pPr>
     </w:lvl>
     <w:lvl w:ilvl="4">
-      <w:tmpl w:val="A0ABB69B"/>
+      <w:tmpl w:val="A6E63977"/>
       <w:start w:val="1"/>
       <w:numFmt w:val="lowerLetter"/>
       <w:lvlText w:val="%5."/>
@@ -3290,7 +3290,7 @@
       </w:pPr>
     </w:lvl>
     <w:lvl w:ilvl="5">
-      <w:tmpl w:val="BDE54474"/>
+      <w:tmpl w:val="29C8BF65"/>
       <w:start w:val="1"/>
       <w:numFmt w:val="lowerRoman"/>
       <w:lvlText w:val="%6."/>
@@ -3300,7 +3300,7 @@
       </w:pPr>
     </w:lvl>
     <w:lvl w:ilvl="6">
-      <w:tmpl w:val="16C860A4"/>
+      <w:tmpl w:val="A9F6894B"/>
       <w:start w:val="1"/>
       <w:numFmt w:val="decimal"/>
       <w:lvlText w:val="%7."/>
@@ -3310,7 +3310,7 @@
       </w:pPr>
     </w:lvl>
     <w:lvl w:ilvl="7">
-      <w:tmpl w:val="D33D17C3"/>
+      <w:tmpl w:val="444F3134"/>
       <w:start w:val="1"/>
       <w:numFmt w:val="lowerLetter"/>
       <w:lvlText w:val="%8."/>
@@ -3320,7 +3320,7 @@
       </w:pPr>
     </w:lvl>
     <w:lvl w:ilvl="8">
-      <w:tmpl w:val="1E3242AD"/>
+      <w:tmpl w:val="A728C6F9"/>
       <w:start w:val="1"/>
       <w:numFmt w:val="lowerRoman"/>
       <w:lvlText w:val="%9."/>
@@ -3333,7 +3333,7 @@
   <w:abstractNum w:abstractNumId="9">
     <w:multiLevelType w:val="hybridMultilevel"/>
     <w:lvl w:ilvl="0">
-      <w:tmpl w:val="535462AB"/>
+      <w:tmpl w:val="2BA334D8"/>
       <w:numFmt w:val="bullet"/>
       <w:lvlText w:val=""/>
       <w:rPr>
@@ -3345,7 +3345,7 @@
       </w:pPr>
     </w:lvl>
     <w:lvl w:ilvl="1">
-      <w:tmpl w:val="2D920874"/>
+      <w:tmpl w:val="3CEE54EE"/>
       <w:numFmt w:val="bullet"/>
       <w:lvlText w:val="o"/>
       <w:rPr>
@@ -3357,7 +3357,7 @@
       </w:pPr>
     </w:lvl>
     <w:lvl w:ilvl="2">
-      <w:tmpl w:val="320BE254"/>
+      <w:tmpl w:val="782E6366"/>
       <w:numFmt w:val="bullet"/>
       <w:lvlText w:val=""/>
       <w:rPr>
@@ -3369,7 +3369,7 @@
       </w:pPr>
     </w:lvl>
     <w:lvl w:ilvl="3">
-      <w:tmpl w:val="2D145CF5"/>
+      <w:tmpl w:val="E794CA2B"/>
       <w:numFmt w:val="bullet"/>
       <w:lvlText w:val=""/>
       <w:rPr>
@@ -3381,7 +3381,7 @@
       </w:pPr>
     </w:lvl>
     <w:lvl w:ilvl="4">
-      <w:tmpl w:val="D9A212D5"/>
+      <w:tmpl w:val="0B0011B0"/>
       <w:numFmt w:val="bullet"/>
       <w:lvlText w:val="o"/>
       <w:rPr>
@@ -3393,7 +3393,7 @@
       </w:pPr>
     </w:lvl>
     <w:lvl w:ilvl="5">
-      <w:tmpl w:val="011B75A0"/>
+      <w:tmpl w:val="3D952F8B"/>
       <w:numFmt w:val="bullet"/>
       <w:lvlText w:val=""/>
       <w:rPr>
@@ -3405,7 +3405,7 @@
       </w:pPr>
     </w:lvl>
     <w:lvl w:ilvl="6">
-      <w:tmpl w:val="B851A476"/>
+      <w:tmpl w:val="68A57536"/>
       <w:numFmt w:val="bullet"/>
       <w:lvlText w:val=""/>
       <w:rPr>
@@ -3417,7 +3417,7 @@
       </w:pPr>
     </w:lvl>
     <w:lvl w:ilvl="7">
-      <w:tmpl w:val="5AD8F6F1"/>
+      <w:tmpl w:val="EBEC3D98"/>
       <w:numFmt w:val="bullet"/>
       <w:lvlText w:val="o"/>
       <w:rPr>
@@ -3429,7 +3429,7 @@
       </w:pPr>
     </w:lvl>
     <w:lvl w:ilvl="8">
-      <w:tmpl w:val="98CF03D3"/>
+      <w:tmpl w:val="4CB036C0"/>
       <w:numFmt w:val="bullet"/>
       <w:lvlText w:val=""/>
       <w:rPr>
@@ -3444,7 +3444,7 @@
   <w:abstractNum w:abstractNumId="10">
     <w:multiLevelType w:val="hybridMultilevel"/>
     <w:lvl w:ilvl="0">
-      <w:tmpl w:val="BABA0A04"/>
+      <w:tmpl w:val="3026C682"/>
       <w:start w:val="1"/>
       <w:numFmt w:val="decimal"/>
       <w:lvlText w:val="%1."/>
@@ -3454,7 +3454,7 @@
       </w:pPr>
     </w:lvl>
     <w:lvl w:ilvl="1">
-      <w:tmpl w:val="D06AC879"/>
+      <w:tmpl w:val="7AFA6339"/>
       <w:start w:val="1"/>
       <w:numFmt w:val="lowerLetter"/>
       <w:lvlText w:val="%2."/>
@@ -3464,7 +3464,7 @@
       </w:pPr>
     </w:lvl>
     <w:lvl w:ilvl="2">
-      <w:tmpl w:val="FF514AE6"/>
+      <w:tmpl w:val="F74D4211"/>
       <w:start w:val="1"/>
       <w:numFmt w:val="lowerRoman"/>
       <w:lvlText w:val="%3."/>
@@ -3474,7 +3474,7 @@
       </w:pPr>
     </w:lvl>
     <w:lvl w:ilvl="3">
-      <w:tmpl w:val="C7EF95EC"/>
+      <w:tmpl w:val="F188DC3D"/>
       <w:start w:val="1"/>
       <w:numFmt w:val="decimal"/>
       <w:lvlText w:val="%4."/>
@@ -3484,7 +3484,7 @@
       </w:pPr>
     </w:lvl>
     <w:lvl w:ilvl="4">
-      <w:tmpl w:val="4388F4F3"/>
+      <w:tmpl w:val="7A1FA26A"/>
       <w:start w:val="1"/>
       <w:numFmt w:val="lowerLetter"/>
       <w:lvlText w:val="%5."/>
@@ -3494,7 +3494,7 @@
       </w:pPr>
     </w:lvl>
     <w:lvl w:ilvl="5">
-      <w:tmpl w:val="299747FA"/>
+      <w:tmpl w:val="70F0BA4F"/>
       <w:start w:val="1"/>
       <w:numFmt w:val="lowerRoman"/>
       <w:lvlText w:val="%6."/>
@@ -3504,7 +3504,7 @@
       </w:pPr>
     </w:lvl>
     <w:lvl w:ilvl="6">
-      <w:tmpl w:val="77C8A5A4"/>
+      <w:tmpl w:val="14E41787"/>
       <w:start w:val="1"/>
       <w:numFmt w:val="decimal"/>
       <w:lvlText w:val="%7."/>
@@ -3514,7 +3514,7 @@
       </w:pPr>
     </w:lvl>
     <w:lvl w:ilvl="7">
-      <w:tmpl w:val="856EA815"/>
+      <w:tmpl w:val="C4AACA94"/>
       <w:start w:val="1"/>
       <w:numFmt w:val="lowerLetter"/>
       <w:lvlText w:val="%8."/>
@@ -3524,7 +3524,7 @@
       </w:pPr>
     </w:lvl>
     <w:lvl w:ilvl="8">
-      <w:tmpl w:val="4C55A69A"/>
+      <w:tmpl w:val="BB7E418D"/>
       <w:start w:val="1"/>
       <w:numFmt w:val="lowerRoman"/>
       <w:lvlText w:val="%9."/>
@@ -3537,7 +3537,7 @@
   <w:abstractNum w:abstractNumId="11">
     <w:multiLevelType w:val="hybridMultilevel"/>
     <w:lvl w:ilvl="0">
-      <w:tmpl w:val="6F9ABBB9"/>
+      <w:tmpl w:val="4C884EDC"/>
       <w:numFmt w:val="bullet"/>
       <w:lvlText w:val=""/>
       <w:rPr>
@@ -3549,7 +3549,7 @@
       </w:pPr>
     </w:lvl>
     <w:lvl w:ilvl="1">
-      <w:tmpl w:val="332C5763"/>
+      <w:tmpl w:val="1FC7D30B"/>
       <w:numFmt w:val="bullet"/>
       <w:lvlText w:val="o"/>
       <w:rPr>
@@ -3561,7 +3561,7 @@
       </w:pPr>
     </w:lvl>
     <w:lvl w:ilvl="2">
-      <w:tmpl w:val="17C52E89"/>
+      <w:tmpl w:val="0CCB6A19"/>
       <w:numFmt w:val="bullet"/>
       <w:lvlText w:val=""/>
       <w:rPr>
@@ -3573,7 +3573,7 @@
       </w:pPr>
     </w:lvl>
     <w:lvl w:ilvl="3">
-      <w:tmpl w:val="A9C80A23"/>
+      <w:tmpl w:val="5889059D"/>
       <w:numFmt w:val="bullet"/>
       <w:lvlText w:val=""/>
       <w:rPr>
@@ -3585,7 +3585,7 @@
       </w:pPr>
     </w:lvl>
     <w:lvl w:ilvl="4">
-      <w:tmpl w:val="2E279B40"/>
+      <w:tmpl w:val="D571C39F"/>
       <w:numFmt w:val="bullet"/>
       <w:lvlText w:val="o"/>
       <w:rPr>
@@ -3597,7 +3597,7 @@
       </w:pPr>
     </w:lvl>
     <w:lvl w:ilvl="5">
-      <w:tmpl w:val="85C3C8D7"/>
+      <w:tmpl w:val="C17F2FE3"/>
       <w:numFmt w:val="bullet"/>
       <w:lvlText w:val=""/>
       <w:rPr>
@@ -3609,7 +3609,7 @@
       </w:pPr>
     </w:lvl>
     <w:lvl w:ilvl="6">
-      <w:tmpl w:val="C7FE26DF"/>
+      <w:tmpl w:val="BF46CD6C"/>
       <w:numFmt w:val="bullet"/>
       <w:lvlText w:val=""/>
       <w:rPr>
@@ -3621,7 +3621,7 @@
       </w:pPr>
     </w:lvl>
     <w:lvl w:ilvl="7">
-      <w:tmpl w:val="423D7401"/>
+      <w:tmpl w:val="3EFC73E6"/>
       <w:numFmt w:val="bullet"/>
       <w:lvlText w:val="o"/>
       <w:rPr>
@@ -3633,7 +3633,7 @@
       </w:pPr>
     </w:lvl>
     <w:lvl w:ilvl="8">
-      <w:tmpl w:val="45F1B2C2"/>
+      <w:tmpl w:val="E6588FA0"/>
       <w:numFmt w:val="bullet"/>
       <w:lvlText w:val=""/>
       <w:rPr>
@@ -3648,7 +3648,7 @@
   <w:abstractNum w:abstractNumId="12">
     <w:multiLevelType w:val="hybridMultilevel"/>
     <w:lvl w:ilvl="0">
-      <w:tmpl w:val="E89EF9C1"/>
+      <w:tmpl w:val="8A40CF8D"/>
       <w:start w:val="1"/>
       <w:numFmt w:val="decimal"/>
       <w:lvlText w:val="%1."/>
@@ -3658,7 +3658,7 @@
       </w:pPr>
     </w:lvl>
     <w:lvl w:ilvl="1">
-      <w:tmpl w:val="49E437FB"/>
+      <w:tmpl w:val="78B13728"/>
       <w:start w:val="1"/>
       <w:numFmt w:val="lowerLetter"/>
       <w:lvlText w:val="%2."/>
@@ -3668,7 +3668,7 @@
       </w:pPr>
     </w:lvl>
     <w:lvl w:ilvl="2">
-      <w:tmpl w:val="A4CE0F29"/>
+      <w:tmpl w:val="63939647"/>
       <w:start w:val="1"/>
       <w:numFmt w:val="lowerRoman"/>
       <w:lvlText w:val="%3."/>
@@ -3678,7 +3678,7 @@
       </w:pPr>
     </w:lvl>
     <w:lvl w:ilvl="3">
-      <w:tmpl w:val="EAC19C7B"/>
+      <w:tmpl w:val="747CFDB9"/>
       <w:start w:val="1"/>
       <w:numFmt w:val="decimal"/>
       <w:lvlText w:val="%4."/>
@@ -3688,7 +3688,7 @@
       </w:pPr>
     </w:lvl>
     <w:lvl w:ilvl="4">
-      <w:tmpl w:val="5A1A5CFB"/>
+      <w:tmpl w:val="7F9BBE79"/>
       <w:start w:val="1"/>
       <w:numFmt w:val="lowerLetter"/>
       <w:lvlText w:val="%5."/>
@@ -3698,7 +3698,7 @@
       </w:pPr>
     </w:lvl>
     <w:lvl w:ilvl="5">
-      <w:tmpl w:val="6025C0CF"/>
+      <w:tmpl w:val="5296BF8C"/>
       <w:start w:val="1"/>
       <w:numFmt w:val="lowerRoman"/>
       <w:lvlText w:val="%6."/>
@@ -3708,7 +3708,7 @@
       </w:pPr>
     </w:lvl>
     <w:lvl w:ilvl="6">
-      <w:tmpl w:val="58C3CA6E"/>
+      <w:tmpl w:val="9CF4ADD4"/>
       <w:start w:val="1"/>
       <w:numFmt w:val="decimal"/>
       <w:lvlText w:val="%7."/>
@@ -3718,7 +3718,7 @@
       </w:pPr>
     </w:lvl>
     <w:lvl w:ilvl="7">
-      <w:tmpl w:val="7F539A08"/>
+      <w:tmpl w:val="F4A0603F"/>
       <w:start w:val="1"/>
       <w:numFmt w:val="lowerLetter"/>
       <w:lvlText w:val="%8."/>
@@ -3728,7 +3728,7 @@
       </w:pPr>
     </w:lvl>
     <w:lvl w:ilvl="8">
-      <w:tmpl w:val="80D72DA8"/>
+      <w:tmpl w:val="AF099D3E"/>
       <w:start w:val="1"/>
       <w:numFmt w:val="lowerRoman"/>
       <w:lvlText w:val="%9."/>
@@ -3741,7 +3741,7 @@
   <w:abstractNum w:abstractNumId="13">
     <w:multiLevelType w:val="hybridMultilevel"/>
     <w:lvl w:ilvl="0">
-      <w:tmpl w:val="1FCC8571"/>
+      <w:tmpl w:val="7E5408B8"/>
       <w:numFmt w:val="bullet"/>
       <w:lvlText w:val=""/>
       <w:rPr>
@@ -3753,7 +3753,7 @@
       </w:pPr>
     </w:lvl>
     <w:lvl w:ilvl="1">
-      <w:tmpl w:val="4E4694E7"/>
+      <w:tmpl w:val="AEFC93CA"/>
       <w:numFmt w:val="bullet"/>
       <w:lvlText w:val="o"/>
       <w:rPr>
@@ -3765,7 +3765,7 @@
       </w:pPr>
     </w:lvl>
     <w:lvl w:ilvl="2">
-      <w:tmpl w:val="CE8FC94B"/>
+      <w:tmpl w:val="DA90DBF5"/>
       <w:numFmt w:val="bullet"/>
       <w:lvlText w:val=""/>
       <w:rPr>
@@ -3777,7 +3777,7 @@
       </w:pPr>
     </w:lvl>
     <w:lvl w:ilvl="3">
-      <w:tmpl w:val="A1A24AE4"/>
+      <w:tmpl w:val="9E30A5E7"/>
       <w:numFmt w:val="bullet"/>
       <w:lvlText w:val=""/>
       <w:rPr>
@@ -3789,7 +3789,7 @@
       </w:pPr>
     </w:lvl>
     <w:lvl w:ilvl="4">
-      <w:tmpl w:val="01DD7A28"/>
+      <w:tmpl w:val="637C5572"/>
       <w:numFmt w:val="bullet"/>
       <w:lvlText w:val="o"/>
       <w:rPr>
@@ -3801,7 +3801,7 @@
       </w:pPr>
     </w:lvl>
     <w:lvl w:ilvl="5">
-      <w:tmpl w:val="46010C67"/>
+      <w:tmpl w:val="D3407D81"/>
       <w:numFmt w:val="bullet"/>
       <w:lvlText w:val=""/>
       <w:rPr>
@@ -3813,7 +3813,7 @@
       </w:pPr>
     </w:lvl>
     <w:lvl w:ilvl="6">
-      <w:tmpl w:val="D2ADFC22"/>
+      <w:tmpl w:val="4EF766A1"/>
       <w:numFmt w:val="bullet"/>
       <w:lvlText w:val=""/>
       <w:rPr>
@@ -3825,7 +3825,7 @@
       </w:pPr>
     </w:lvl>
     <w:lvl w:ilvl="7">
-      <w:tmpl w:val="DFE529E3"/>
+      <w:tmpl w:val="BAA672D1"/>
       <w:numFmt w:val="bullet"/>
       <w:lvlText w:val="o"/>
       <w:rPr>
@@ -3837,7 +3837,7 @@
       </w:pPr>
     </w:lvl>
     <w:lvl w:ilvl="8">
-      <w:tmpl w:val="37211C51"/>
+      <w:tmpl w:val="B8BB2AEB"/>
       <w:numFmt w:val="bullet"/>
       <w:lvlText w:val=""/>
       <w:rPr>
@@ -3852,7 +3852,7 @@
   <w:abstractNum w:abstractNumId="14">
     <w:multiLevelType w:val="hybridMultilevel"/>
     <w:lvl w:ilvl="0">
-      <w:tmpl w:val="031071F8"/>
+      <w:tmpl w:val="0E639E00"/>
       <w:numFmt w:val="bullet"/>
       <w:lvlText w:val=""/>
       <w:rPr>
@@ -3864,7 +3864,7 @@
       </w:pPr>
     </w:lvl>
     <w:lvl w:ilvl="1">
-      <w:tmpl w:val="B1A7B8B1"/>
+      <w:tmpl w:val="026AA7E2"/>
       <w:numFmt w:val="bullet"/>
       <w:lvlText w:val="o"/>
       <w:rPr>
@@ -3876,7 +3876,7 @@
       </w:pPr>
     </w:lvl>
     <w:lvl w:ilvl="2">
-      <w:tmpl w:val="2BD7B62E"/>
+      <w:tmpl w:val="438A96C2"/>
       <w:numFmt w:val="bullet"/>
       <w:lvlText w:val=""/>
       <w:rPr>
@@ -3888,7 +3888,7 @@
       </w:pPr>
     </w:lvl>
     <w:lvl w:ilvl="3">
-      <w:tmpl w:val="6DF7F51D"/>
+      <w:tmpl w:val="A5D2199B"/>
       <w:numFmt w:val="bullet"/>
       <w:lvlText w:val=""/>
       <w:rPr>
@@ -3900,7 +3900,7 @@
       </w:pPr>
     </w:lvl>
     <w:lvl w:ilvl="4">
-      <w:tmpl w:val="D9E0C6D4"/>
+      <w:tmpl w:val="7447F9DF"/>
       <w:numFmt w:val="bullet"/>
       <w:lvlText w:val="o"/>
       <w:rPr>
@@ -3912,7 +3912,7 @@
       </w:pPr>
     </w:lvl>
     <w:lvl w:ilvl="5">
-      <w:tmpl w:val="4F5F7428"/>
+      <w:tmpl w:val="27CF76C1"/>
       <w:numFmt w:val="bullet"/>
       <w:lvlText w:val=""/>
       <w:rPr>
@@ -3924,7 +3924,7 @@
       </w:pPr>
     </w:lvl>
     <w:lvl w:ilvl="6">
-      <w:tmpl w:val="921B28BC"/>
+      <w:tmpl w:val="F0201F46"/>
       <w:numFmt w:val="bullet"/>
       <w:lvlText w:val=""/>
       <w:rPr>
@@ -3936,7 +3936,7 @@
       </w:pPr>
     </w:lvl>
     <w:lvl w:ilvl="7">
-      <w:tmpl w:val="2C5E1E6F"/>
+      <w:tmpl w:val="BCA6290A"/>
       <w:numFmt w:val="bullet"/>
       <w:lvlText w:val="o"/>
       <w:rPr>
@@ -3948,7 +3948,7 @@
       </w:pPr>
     </w:lvl>
     <w:lvl w:ilvl="8">
-      <w:tmpl w:val="484B9106"/>
+      <w:tmpl w:val="AEC0B933"/>
       <w:numFmt w:val="bullet"/>
       <w:lvlText w:val=""/>
       <w:rPr>
@@ -3963,7 +3963,7 @@
   <w:abstractNum w:abstractNumId="15">
     <w:multiLevelType w:val="hybridMultilevel"/>
     <w:lvl w:ilvl="0">
-      <w:tmpl w:val="96743518"/>
+      <w:tmpl w:val="C7C840AA"/>
       <w:start w:val="1"/>
       <w:numFmt w:val="decimal"/>
       <w:lvlText w:val="%1."/>
@@ -3973,7 +3973,7 @@
       </w:pPr>
     </w:lvl>
     <w:lvl w:ilvl="1">
-      <w:tmpl w:val="2EAFF3E8"/>
+      <w:tmpl w:val="BC92F449"/>
       <w:start w:val="1"/>
       <w:numFmt w:val="lowerLetter"/>
       <w:lvlText w:val="%2."/>
@@ -3983,7 +3983,7 @@
       </w:pPr>
     </w:lvl>
     <w:lvl w:ilvl="2">
-      <w:tmpl w:val="3522149E"/>
+      <w:tmpl w:val="6B7F4C27"/>
       <w:start w:val="1"/>
       <w:numFmt w:val="lowerRoman"/>
       <w:lvlText w:val="%3."/>
@@ -3993,7 +3993,7 @@
       </w:pPr>
     </w:lvl>
     <w:lvl w:ilvl="3">
-      <w:tmpl w:val="3DBE53E2"/>
+      <w:tmpl w:val="F09E90E9"/>
       <w:start w:val="1"/>
       <w:numFmt w:val="decimal"/>
       <w:lvlText w:val="%4."/>
@@ -4003,7 +4003,7 @@
       </w:pPr>
     </w:lvl>
     <w:lvl w:ilvl="4">
-      <w:tmpl w:val="6E4AEC2D"/>
+      <w:tmpl w:val="1A86B977"/>
       <w:start w:val="1"/>
       <w:numFmt w:val="lowerLetter"/>
       <w:lvlText w:val="%5."/>
@@ -4013,7 +4013,7 @@
       </w:pPr>
     </w:lvl>
     <w:lvl w:ilvl="5">
-      <w:tmpl w:val="5816203D"/>
+      <w:tmpl w:val="0C688F65"/>
       <w:start w:val="1"/>
       <w:numFmt w:val="lowerRoman"/>
       <w:lvlText w:val="%6."/>
@@ -4023,7 +4023,7 @@
       </w:pPr>
     </w:lvl>
     <w:lvl w:ilvl="6">
-      <w:tmpl w:val="2D256B03"/>
+      <w:tmpl w:val="6E096484"/>
       <w:start w:val="1"/>
       <w:numFmt w:val="decimal"/>
       <w:lvlText w:val="%7."/>
@@ -4033,7 +4033,7 @@
       </w:pPr>
     </w:lvl>
     <w:lvl w:ilvl="7">
-      <w:tmpl w:val="32AC7C0B"/>
+      <w:tmpl w:val="D9E3BB64"/>
       <w:start w:val="1"/>
       <w:numFmt w:val="lowerLetter"/>
       <w:lvlText w:val="%8."/>
@@ -4043,7 +4043,7 @@
       </w:pPr>
     </w:lvl>
     <w:lvl w:ilvl="8">
-      <w:tmpl w:val="10619050"/>
+      <w:tmpl w:val="404C4FAD"/>
       <w:start w:val="1"/>
       <w:numFmt w:val="lowerRoman"/>
       <w:lvlText w:val="%9."/>
@@ -4056,7 +4056,7 @@
   <w:abstractNum w:abstractNumId="16">
     <w:multiLevelType w:val="hybridMultilevel"/>
     <w:lvl w:ilvl="0">
-      <w:tmpl w:val="698BE2EB"/>
+      <w:tmpl w:val="1ED7B417"/>
       <w:numFmt w:val="bullet"/>
       <w:lvlText w:val=""/>
       <w:rPr>
@@ -4068,7 +4068,7 @@
       </w:pPr>
     </w:lvl>
     <w:lvl w:ilvl="1">
-      <w:tmpl w:val="477C8EA4"/>
+      <w:tmpl w:val="85F01568"/>
       <w:numFmt w:val="bullet"/>
       <w:lvlText w:val="o"/>
       <w:rPr>
@@ -4080,7 +4080,7 @@
       </w:pPr>
     </w:lvl>
     <w:lvl w:ilvl="2">
-      <w:tmpl w:val="76617998"/>
+      <w:tmpl w:val="DCD6638F"/>
       <w:numFmt w:val="bullet"/>
       <w:lvlText w:val=""/>
       <w:rPr>
@@ -4092,7 +4092,7 @@
       </w:pPr>
     </w:lvl>
     <w:lvl w:ilvl="3">
-      <w:tmpl w:val="A129226F"/>
+      <w:tmpl w:val="95306A2E"/>
       <w:numFmt w:val="bullet"/>
       <w:lvlText w:val=""/>
       <w:rPr>
@@ -4104,7 +4104,7 @@
       </w:pPr>
     </w:lvl>
     <w:lvl w:ilvl="4">
-      <w:tmpl w:val="1D52F47B"/>
+      <w:tmpl w:val="37EE9A9D"/>
       <w:numFmt w:val="bullet"/>
       <w:lvlText w:val="o"/>
       <w:rPr>
@@ -4116,7 +4116,7 @@
       </w:pPr>
     </w:lvl>
     <w:lvl w:ilvl="5">
-      <w:tmpl w:val="A907D9FC"/>
+      <w:tmpl w:val="274CFC33"/>
       <w:numFmt w:val="bullet"/>
       <w:lvlText w:val=""/>
       <w:rPr>
@@ -4128,7 +4128,7 @@
       </w:pPr>
     </w:lvl>
     <w:lvl w:ilvl="6">
-      <w:tmpl w:val="244C5CC2"/>
+      <w:tmpl w:val="D5D917C8"/>
       <w:numFmt w:val="bullet"/>
       <w:lvlText w:val=""/>
       <w:rPr>
@@ -4140,7 +4140,7 @@
       </w:pPr>
     </w:lvl>
     <w:lvl w:ilvl="7">
-      <w:tmpl w:val="B8D3D20D"/>
+      <w:tmpl w:val="BA3AEBC3"/>
       <w:numFmt w:val="bullet"/>
       <w:lvlText w:val="o"/>
       <w:rPr>
@@ -4152,7 +4152,7 @@
       </w:pPr>
     </w:lvl>
     <w:lvl w:ilvl="8">
-      <w:tmpl w:val="D1123808"/>
+      <w:tmpl w:val="645AB21A"/>
       <w:numFmt w:val="bullet"/>
       <w:lvlText w:val=""/>
       <w:rPr>
@@ -4167,7 +4167,7 @@
   <w:abstractNum w:abstractNumId="17">
     <w:multiLevelType w:val="hybridMultilevel"/>
     <w:lvl w:ilvl="0">
-      <w:tmpl w:val="C6B88DB0"/>
+      <w:tmpl w:val="DAF6ADEC"/>
       <w:start w:val="1"/>
       <w:numFmt w:val="decimal"/>
       <w:lvlText w:val="%1."/>
@@ -4177,7 +4177,7 @@
       </w:pPr>
     </w:lvl>
     <w:lvl w:ilvl="1">
-      <w:tmpl w:val="1D25E819"/>
+      <w:tmpl w:val="3565F53D"/>
       <w:start w:val="1"/>
       <w:numFmt w:val="lowerLetter"/>
       <w:lvlText w:val="%2."/>
@@ -4187,7 +4187,7 @@
       </w:pPr>
     </w:lvl>
     <w:lvl w:ilvl="2">
-      <w:tmpl w:val="58480B52"/>
+      <w:tmpl w:val="B6F409FB"/>
       <w:start w:val="1"/>
       <w:numFmt w:val="lowerRoman"/>
       <w:lvlText w:val="%3."/>
@@ -4197,7 +4197,7 @@
       </w:pPr>
     </w:lvl>
     <w:lvl w:ilvl="3">
-      <w:tmpl w:val="85FE8AE3"/>
+      <w:tmpl w:val="F3AA3D7B"/>
       <w:start w:val="1"/>
       <w:numFmt w:val="decimal"/>
       <w:lvlText w:val="%4."/>
@@ -4207,7 +4207,7 @@
       </w:pPr>
     </w:lvl>
     <w:lvl w:ilvl="4">
-      <w:tmpl w:val="3A7F52EB"/>
+      <w:tmpl w:val="4125C6F9"/>
       <w:start w:val="1"/>
       <w:numFmt w:val="lowerLetter"/>
       <w:lvlText w:val="%5."/>
@@ -4217,7 +4217,7 @@
       </w:pPr>
     </w:lvl>
     <w:lvl w:ilvl="5">
-      <w:tmpl w:val="5DC97295"/>
+      <w:tmpl w:val="D929999E"/>
       <w:start w:val="1"/>
       <w:numFmt w:val="lowerRoman"/>
       <w:lvlText w:val="%6."/>
@@ -4227,7 +4227,7 @@
       </w:pPr>
     </w:lvl>
     <w:lvl w:ilvl="6">
-      <w:tmpl w:val="AD900051"/>
+      <w:tmpl w:val="55951FA9"/>
       <w:start w:val="1"/>
       <w:numFmt w:val="decimal"/>
       <w:lvlText w:val="%7."/>
@@ -4237,7 +4237,7 @@
       </w:pPr>
     </w:lvl>
     <w:lvl w:ilvl="7">
-      <w:tmpl w:val="E56ADC1F"/>
+      <w:tmpl w:val="9A342F45"/>
       <w:start w:val="1"/>
       <w:numFmt w:val="lowerLetter"/>
       <w:lvlText w:val="%8."/>
@@ -4247,7 +4247,7 @@
       </w:pPr>
     </w:lvl>
     <w:lvl w:ilvl="8">
-      <w:tmpl w:val="89B88629"/>
+      <w:tmpl w:val="C28B1D93"/>
       <w:start w:val="1"/>
       <w:numFmt w:val="lowerRoman"/>
       <w:lvlText w:val="%9."/>
@@ -4260,7 +4260,7 @@
   <w:abstractNum w:abstractNumId="18">
     <w:multiLevelType w:val="hybridMultilevel"/>
     <w:lvl w:ilvl="0">
-      <w:tmpl w:val="52E70C9A"/>
+      <w:tmpl w:val="668CA3DA"/>
       <w:numFmt w:val="bullet"/>
       <w:lvlText w:val=""/>
       <w:rPr>
@@ -4272,7 +4272,7 @@
       </w:pPr>
     </w:lvl>
     <w:lvl w:ilvl="1">
-      <w:tmpl w:val="86533B64"/>
+      <w:tmpl w:val="93339163"/>
       <w:numFmt w:val="bullet"/>
       <w:lvlText w:val="o"/>
       <w:rPr>
@@ -4284,7 +4284,7 @@
       </w:pPr>
     </w:lvl>
     <w:lvl w:ilvl="2">
-      <w:tmpl w:val="036D456A"/>
+      <w:tmpl w:val="776C0389"/>
       <w:numFmt w:val="bullet"/>
       <w:lvlText w:val=""/>
       <w:rPr>
@@ -4296,7 +4296,7 @@
       </w:pPr>
     </w:lvl>
     <w:lvl w:ilvl="3">
-      <w:tmpl w:val="9F1D2DFB"/>
+      <w:tmpl w:val="406D7582"/>
       <w:numFmt w:val="bullet"/>
       <w:lvlText w:val=""/>
       <w:rPr>
@@ -4308,7 +4308,7 @@
       </w:pPr>
     </w:lvl>
     <w:lvl w:ilvl="4">
-      <w:tmpl w:val="B5884A6C"/>
+      <w:tmpl w:val="CA4A8365"/>
       <w:numFmt w:val="bullet"/>
       <w:lvlText w:val="o"/>
       <w:rPr>
@@ -4320,7 +4320,7 @@
       </w:pPr>
     </w:lvl>
     <w:lvl w:ilvl="5">
-      <w:tmpl w:val="50DBBCE4"/>
+      <w:tmpl w:val="0FD3D582"/>
       <w:numFmt w:val="bullet"/>
       <w:lvlText w:val=""/>
       <w:rPr>
@@ -4332,7 +4332,7 @@
       </w:pPr>
     </w:lvl>
     <w:lvl w:ilvl="6">
-      <w:tmpl w:val="4B0F4A45"/>
+      <w:tmpl w:val="50FDC9FF"/>
       <w:numFmt w:val="bullet"/>
       <w:lvlText w:val=""/>
       <w:rPr>
@@ -4344,7 +4344,7 @@
       </w:pPr>
     </w:lvl>
     <w:lvl w:ilvl="7">
-      <w:tmpl w:val="57509816"/>
+      <w:tmpl w:val="0CBF25FC"/>
       <w:numFmt w:val="bullet"/>
       <w:lvlText w:val="o"/>
       <w:rPr>
@@ -4356,7 +4356,7 @@
       </w:pPr>
     </w:lvl>
     <w:lvl w:ilvl="8">
-      <w:tmpl w:val="FE80C840"/>
+      <w:tmpl w:val="6E3F82AD"/>
       <w:numFmt w:val="bullet"/>
       <w:lvlText w:val=""/>
       <w:rPr>
@@ -6012,7 +6012,7 @@
   <Source>
     <Tag>fielding2000</Tag>
     <SourceType>Book</SourceType>
-    <Guid>{72e1d9a4-0ac1-4945-b184-42d6694b250d}</Guid>
+    <Guid>{cc655897-12c8-4626-9f0a-e972a2f6809d}</Guid>
     <LCID>0</LCID>
     <Title>Architectural Styles and the Design of Network-based Software Architectures</Title>
     <Year>2000</Year>
@@ -6032,7 +6032,7 @@
   <Source>
     <Tag>humble2010</Tag>
     <SourceType>Book</SourceType>
-    <Guid>{412e5bb5-3c2f-4dd5-8a91-cdd1d209a058}</Guid>
+    <Guid>{c2d03149-de88-44c8-80a3-59104e9d920a}</Guid>
     <LCID>0</LCID>
     <Title>Continuous Delivery</Title>
     <Year>2010</Year>
@@ -6057,7 +6057,7 @@
   <Source>
     <Tag>fowler2018</Tag>
     <SourceType>BookSection</SourceType>
-    <Guid>{11ceb740-a891-4b90-9ef6-6c9861e22570}</Guid>
+    <Guid>{f4ca9dc4-5c9f-47f2-8ab1-7d6e42778326}</Guid>
     <LCID>0</LCID>
     <Title>Configuration Patterns</Title>
     <BookTitle>Refactoring -- Improving the Design of Existing Code</BookTitle>
@@ -6087,7 +6087,7 @@
   <Source>
     <Tag>markdig2024</Tag>
     <SourceType>InternetSite</SourceType>
-    <Guid>{9e490c4f-2642-4710-86b6-e8c02cffaa2a}</Guid>
+    <Guid>{a01e6e97-b69a-4da4-8327-7b55e394ab2b}</Guid>
     <LCID>0</LCID>
     <InternetSiteTitle>Markdig -- A Fast, Powerful, CommonMark Compliant Markdown Processor</InternetSiteTitle>
     <YearAccessed>2026</YearAccessed>
@@ -6108,7 +6108,7 @@
   <Source>
     <Tag>sixlabors2023</Tag>
     <SourceType>InternetSite</SourceType>
-    <Guid>{ea3ace78-866d-45c8-a6e5-1946a086ceea}</Guid>
+    <Guid>{d30a41f4-568c-4c12-bca6-201ea03c0c5d}</Guid>
     <LCID>0</LCID>
     <InternetSiteTitle>ImageSharp -- A Modern, Cross-Platform, 2D Graphics Library</InternetSiteTitle>
     <YearAccessed>2026</YearAccessed>
@@ -6119,7 +6119,7 @@
   <Source>
     <Tag>microsoftOpenXml</Tag>
     <SourceType>DocumentFromInternetSite</SourceType>
-    <Guid>{7a4718c7-8eb3-43db-97c9-a197be74cea9}</Guid>
+    <Guid>{31cd2d69-2ccf-4f70-86a1-d8173e78ad4c}</Guid>
     <LCID>0</LCID>
     <InternetSiteTitle>Open XML SDK Documentation</InternetSiteTitle>
     <Year>2023</Year>
@@ -6142,7 +6142,7 @@
   <Source>
     <Tag>openxmlWebSite2024</Tag>
     <SourceType>InternetSite</SourceType>
-    <Guid>{6592765c-be12-47be-94a3-a41da8745700}</Guid>
+    <Guid>{359ebc98-3f94-417b-b85f-4d39ef8f578e}</Guid>
     <LCID>0</LCID>
     <InternetSiteTitle>ECMA-376 Office Open XML File Formats</InternetSiteTitle>
     <YearAccessed>2026</YearAccessed>
@@ -6153,7 +6153,7 @@
   <Source>
     <Tag>techWritingCase2019</Tag>
     <SourceType>JournalArticle</SourceType>
-    <Guid>{221916a4-711d-4e8a-bc2c-fe330f2ff6c4}</Guid>
+    <Guid>{de5800f5-c1c6-44d5-8dea-202711ebca24}</Guid>
     <LCID>0</LCID>
     <Title>Technological Developments in Document and Information Design</Title>
     <JournalName>Journal of Technical Writing and Communication</JournalName>

</xml_diff>